<commit_message>
add answer instructions update and fix one thing on no children complaint instructions
</commit_message>
<xml_diff>
--- a/docassemble/MLHDivorceAndCustody/data/templates/instructions_divorce_answer.docx
+++ b/docassemble/MLHDivorceAndCustody/data/templates/instructions_divorce_answer.docx
@@ -1,6 +1,6 @@
 
 <file path=word/document.xml><?xml version="1.0" encoding="utf-8"?>
-<w:document xmlns:wpc="http://schemas.microsoft.com/office/word/2010/wordprocessingCanvas" xmlns:cx="http://schemas.microsoft.com/office/drawing/2014/chartex" xmlns:cx1="http://schemas.microsoft.com/office/drawing/2015/9/8/chartex" xmlns:cx2="http://schemas.microsoft.com/office/drawing/2015/10/21/chartex" xmlns:cx3="http://schemas.microsoft.com/office/drawing/2016/5/9/chartex" xmlns:cx4="http://schemas.microsoft.com/office/drawing/2016/5/10/chartex" xmlns:cx5="http://schemas.microsoft.com/office/drawing/2016/5/11/chartex" xmlns:cx6="http://schemas.microsoft.com/office/drawing/2016/5/12/chartex" xmlns:cx7="http://schemas.microsoft.com/office/drawing/2016/5/13/chartex" xmlns:cx8="http://schemas.microsoft.com/office/drawing/2016/5/14/chartex" xmlns:mc="http://schemas.openxmlformats.org/markup-compatibility/2006" xmlns:m="http://schemas.openxmlformats.org/officeDocument/2006/math" xmlns:aink="http://schemas.microsoft.com/office/drawing/2016/ink" xmlns:am3d="http://schemas.microsoft.com/office/drawing/2017/model3d" xmlns:oel="http://schemas.microsoft.com/office/2019/extlst" xmlns:r="http://schemas.openxmlformats.org/officeDocument/2006/relationships" xmlns:wp14="http://schemas.microsoft.com/office/word/2010/wordprocessingDrawing" xmlns:wp="http://schemas.openxmlformats.org/drawingml/2006/wordprocessingDrawing" xmlns:wpg="http://schemas.microsoft.com/office/word/2010/wordprocessingGroup" xmlns:wpi="http://schemas.microsoft.com/office/word/2010/wordprocessingInk" xmlns:wps="http://schemas.microsoft.com/office/word/2010/wordprocessingShape" xmlns:o="urn:schemas-microsoft-com:office:office" xmlns:v="urn:schemas-microsoft-com:vml" xmlns:w10="urn:schemas-microsoft-com:office:word" xmlns:w="http://schemas.openxmlformats.org/wordprocessingml/2006/main" xmlns:w14="http://schemas.microsoft.com/office/word/2010/wordml" xmlns:w15="http://schemas.microsoft.com/office/word/2012/wordml" xmlns:w16cei="http://schemas.microsoft.com/office/word/2026/wordml/cei" xmlns:w16cex="http://schemas.microsoft.com/office/word/2018/wordml/cex" xmlns:w16cid="http://schemas.microsoft.com/office/word/2016/wordml/cid" xmlns:w16="http://schemas.microsoft.com/office/word/2018/wordml" xmlns:w16sdtdh="http://schemas.microsoft.com/office/word/2020/wordml/sdtdatahash" xmlns:w16sdtfl="http://schemas.microsoft.com/office/word/2024/wordml/sdtformatlock" xmlns:w16se="http://schemas.microsoft.com/office/word/2015/wordml/symex" xmlns:w16du="http://schemas.microsoft.com/office/word/2023/wordml/word16du" xmlns:wne="http://schemas.microsoft.com/office/word/2006/wordml" mc:Ignorable="w14 w15 w16se w16cid w16 w16cex w16sdtdh w16sdtfl w16du wp14">
+<w:document xmlns:wpc="http://schemas.microsoft.com/office/word/2010/wordprocessingCanvas" xmlns:cx="http://schemas.microsoft.com/office/drawing/2014/chartex" xmlns:cx1="http://schemas.microsoft.com/office/drawing/2015/9/8/chartex" xmlns:cx2="http://schemas.microsoft.com/office/drawing/2015/10/21/chartex" xmlns:cx3="http://schemas.microsoft.com/office/drawing/2016/5/9/chartex" xmlns:cx4="http://schemas.microsoft.com/office/drawing/2016/5/10/chartex" xmlns:cx5="http://schemas.microsoft.com/office/drawing/2016/5/11/chartex" xmlns:cx6="http://schemas.microsoft.com/office/drawing/2016/5/12/chartex" xmlns:cx7="http://schemas.microsoft.com/office/drawing/2016/5/13/chartex" xmlns:cx8="http://schemas.microsoft.com/office/drawing/2016/5/14/chartex" xmlns:mc="http://schemas.openxmlformats.org/markup-compatibility/2006" xmlns:aink="http://schemas.microsoft.com/office/drawing/2016/ink" xmlns:am3d="http://schemas.microsoft.com/office/drawing/2017/model3d" xmlns:o="urn:schemas-microsoft-com:office:office" xmlns:oel="http://schemas.microsoft.com/office/2019/extlst" xmlns:r="http://schemas.openxmlformats.org/officeDocument/2006/relationships" xmlns:m="http://schemas.openxmlformats.org/officeDocument/2006/math" xmlns:v="urn:schemas-microsoft-com:vml" xmlns:wp14="http://schemas.microsoft.com/office/word/2010/wordprocessingDrawing" xmlns:wp="http://schemas.openxmlformats.org/drawingml/2006/wordprocessingDrawing" xmlns:w10="urn:schemas-microsoft-com:office:word" xmlns:w="http://schemas.openxmlformats.org/wordprocessingml/2006/main" xmlns:w14="http://schemas.microsoft.com/office/word/2010/wordml" xmlns:w15="http://schemas.microsoft.com/office/word/2012/wordml" xmlns:w16cex="http://schemas.microsoft.com/office/word/2018/wordml/cex" xmlns:w16cid="http://schemas.microsoft.com/office/word/2016/wordml/cid" xmlns:w16="http://schemas.microsoft.com/office/word/2018/wordml" xmlns:w16du="http://schemas.microsoft.com/office/word/2023/wordml/word16du" xmlns:w16sdtdh="http://schemas.microsoft.com/office/word/2020/wordml/sdtdatahash" xmlns:w16sdtfl="http://schemas.microsoft.com/office/word/2024/wordml/sdtformatlock" xmlns:w16se="http://schemas.microsoft.com/office/word/2015/wordml/symex" xmlns:wpg="http://schemas.microsoft.com/office/word/2010/wordprocessingGroup" xmlns:wpi="http://schemas.microsoft.com/office/word/2010/wordprocessingInk" xmlns:wne="http://schemas.microsoft.com/office/word/2006/wordml" xmlns:wps="http://schemas.microsoft.com/office/word/2010/wordprocessingShape" mc:Ignorable="w14 w15 w16se w16cid w16 w16cex w16sdtdh w16sdtfl w16du wp14">
   <w:body>
     <w:p>
       <w:pPr>
@@ -13,96 +13,16 @@
         <w:t xml:space="preserve"> Answer and Counterclaim to a Complaint for Divorce </w:t>
       </w:r>
       <w:r>
-        <w:t xml:space="preserve">{% if (not </w:t>
-      </w:r>
-      <w:proofErr w:type="spellStart"/>
-      <w:r>
-        <w:t>create_counterclaim</w:t>
-      </w:r>
-      <w:proofErr w:type="spellEnd"/>
-      <w:r>
-        <w:t xml:space="preserve"> and </w:t>
-      </w:r>
-      <w:proofErr w:type="spellStart"/>
-      <w:r>
-        <w:t>there_are_marital_children</w:t>
-      </w:r>
-      <w:proofErr w:type="spellEnd"/>
-      <w:r>
-        <w:t>) or (</w:t>
-      </w:r>
-      <w:proofErr w:type="spellStart"/>
-      <w:r>
-        <w:t>create_counterclaim</w:t>
-      </w:r>
-      <w:proofErr w:type="spellEnd"/>
-      <w:r>
-        <w:t xml:space="preserve"> and </w:t>
-      </w:r>
-      <w:proofErr w:type="spellStart"/>
-      <w:r>
-        <w:t>counterclaim_type</w:t>
-      </w:r>
-      <w:proofErr w:type="spellEnd"/>
-      <w:r>
-        <w:t xml:space="preserve"> == “</w:t>
-      </w:r>
-      <w:proofErr w:type="spellStart"/>
-      <w:r>
-        <w:t>with_children</w:t>
-      </w:r>
-      <w:proofErr w:type="spellEnd"/>
-      <w:r>
-        <w:t xml:space="preserve">”) </w:t>
-      </w:r>
-      <w:proofErr w:type="gramStart"/>
-      <w:r>
-        <w:t>%}</w:t>
-      </w:r>
-      <w:r>
-        <w:t>with</w:t>
-      </w:r>
-      <w:proofErr w:type="gramEnd"/>
-      <w:r>
-        <w:t xml:space="preserve">{% else </w:t>
-      </w:r>
-      <w:proofErr w:type="gramStart"/>
-      <w:r>
-        <w:t>%}without</w:t>
-      </w:r>
-      <w:proofErr w:type="gramEnd"/>
-      <w:r>
-        <w:t xml:space="preserve">{% endif %} </w:t>
+        <w:t>{% if (not create_counterclaim and there_are_marital_children) or (create_counterclaim and counterclaim_type == “with_children”) %}</w:t>
+      </w:r>
+      <w:r>
+        <w:t xml:space="preserve">with{% else %}without{% endif %} </w:t>
       </w:r>
       <w:r>
         <w:t>Children</w:t>
       </w:r>
       <w:r>
-        <w:t xml:space="preserve"> {% if </w:t>
-      </w:r>
-      <w:proofErr w:type="spellStart"/>
-      <w:r>
-        <w:t>county_choice</w:t>
-      </w:r>
-      <w:proofErr w:type="spellEnd"/>
-      <w:r>
-        <w:t xml:space="preserve"> == “Oakland” </w:t>
-      </w:r>
-      <w:proofErr w:type="gramStart"/>
-      <w:r>
-        <w:t>%}(</w:t>
-      </w:r>
-      <w:proofErr w:type="gramEnd"/>
-      <w:r>
-        <w:t xml:space="preserve">Oakland </w:t>
-      </w:r>
-      <w:proofErr w:type="gramStart"/>
-      <w:r>
-        <w:t>County){</w:t>
-      </w:r>
-      <w:proofErr w:type="gramEnd"/>
-      <w:r>
-        <w:t>% endif %}</w:t>
+        <w:t xml:space="preserve"> {% if county_choice == “Oakland” %}(Oakland County){% endif %}</w:t>
       </w:r>
     </w:p>
     <w:p>
@@ -140,97 +60,7 @@
           <w:bCs/>
           <w:color w:val="222222"/>
         </w:rPr>
-        <w:t xml:space="preserve">if (not </w:t>
-      </w:r>
-      <w:proofErr w:type="spellStart"/>
-      <w:r>
-        <w:rPr>
-          <w:b/>
-          <w:bCs/>
-          <w:color w:val="222222"/>
-        </w:rPr>
-        <w:t>create_counterclaim</w:t>
-      </w:r>
-      <w:proofErr w:type="spellEnd"/>
-      <w:r>
-        <w:rPr>
-          <w:b/>
-          <w:bCs/>
-          <w:color w:val="222222"/>
-        </w:rPr>
-        <w:t xml:space="preserve"> and </w:t>
-      </w:r>
-      <w:proofErr w:type="spellStart"/>
-      <w:r>
-        <w:rPr>
-          <w:b/>
-          <w:bCs/>
-          <w:color w:val="222222"/>
-        </w:rPr>
-        <w:t>there_are_marital_children</w:t>
-      </w:r>
-      <w:proofErr w:type="spellEnd"/>
-      <w:r>
-        <w:rPr>
-          <w:b/>
-          <w:bCs/>
-          <w:color w:val="222222"/>
-        </w:rPr>
-        <w:t>) or (</w:t>
-      </w:r>
-      <w:proofErr w:type="spellStart"/>
-      <w:r>
-        <w:rPr>
-          <w:b/>
-          <w:bCs/>
-          <w:color w:val="222222"/>
-        </w:rPr>
-        <w:t>create_counterclaim</w:t>
-      </w:r>
-      <w:proofErr w:type="spellEnd"/>
-      <w:r>
-        <w:rPr>
-          <w:b/>
-          <w:bCs/>
-          <w:color w:val="222222"/>
-        </w:rPr>
-        <w:t xml:space="preserve"> and </w:t>
-      </w:r>
-      <w:proofErr w:type="spellStart"/>
-      <w:r>
-        <w:rPr>
-          <w:b/>
-          <w:bCs/>
-          <w:color w:val="222222"/>
-        </w:rPr>
-        <w:t>counterclaim_type</w:t>
-      </w:r>
-      <w:proofErr w:type="spellEnd"/>
-      <w:r>
-        <w:rPr>
-          <w:b/>
-          <w:bCs/>
-          <w:color w:val="222222"/>
-        </w:rPr>
-        <w:t xml:space="preserve"> == “</w:t>
-      </w:r>
-      <w:proofErr w:type="spellStart"/>
-      <w:r>
-        <w:rPr>
-          <w:b/>
-          <w:bCs/>
-          <w:color w:val="222222"/>
-        </w:rPr>
-        <w:t>with_children</w:t>
-      </w:r>
-      <w:proofErr w:type="spellEnd"/>
-      <w:r>
-        <w:rPr>
-          <w:b/>
-          <w:bCs/>
-          <w:color w:val="222222"/>
-        </w:rPr>
-        <w:t>”)</w:t>
+        <w:t>if (not create_counterclaim and there_are_marital_children) or (create_counterclaim and counterclaim_type == “with_children”)</w:t>
       </w:r>
       <w:r>
         <w:rPr>
@@ -399,28 +229,7 @@
         <w:rPr>
           <w:color w:val="222222"/>
         </w:rPr>
-        <w:t xml:space="preserve">if </w:t>
-      </w:r>
-      <w:proofErr w:type="spellStart"/>
-      <w:r>
-        <w:rPr>
-          <w:color w:val="222222"/>
-        </w:rPr>
-        <w:t>county_</w:t>
-      </w:r>
-      <w:proofErr w:type="gramStart"/>
-      <w:r>
-        <w:rPr>
-          <w:color w:val="222222"/>
-        </w:rPr>
-        <w:t>choice</w:t>
-      </w:r>
-      <w:proofErr w:type="spellEnd"/>
-      <w:r>
-        <w:rPr>
-          <w:color w:val="222222"/>
-        </w:rPr>
-        <w:t xml:space="preserve"> </w:t>
+        <w:t xml:space="preserve">if county_choice </w:t>
       </w:r>
       <w:r>
         <w:rPr>
@@ -428,7 +237,6 @@
         </w:rPr>
         <w:t>!</w:t>
       </w:r>
-      <w:proofErr w:type="gramEnd"/>
       <w:r>
         <w:rPr>
           <w:color w:val="222222"/>
@@ -534,60 +342,77 @@
         <w:rPr>
           <w:color w:val="222222"/>
         </w:rPr>
-        <w:t xml:space="preserve">You will not file </w:t>
-      </w:r>
-      <w:proofErr w:type="gramStart"/>
-      <w:r>
-        <w:rPr>
-          <w:color w:val="222222"/>
-        </w:rPr>
-        <w:t>all of</w:t>
-      </w:r>
-      <w:proofErr w:type="gramEnd"/>
-      <w:r>
-        <w:rPr>
-          <w:color w:val="222222"/>
-        </w:rPr>
-        <w:t xml:space="preserve"> these forms at the beginning of your case; some you will use </w:t>
-      </w:r>
-      <w:proofErr w:type="gramStart"/>
-      <w:r>
-        <w:rPr>
-          <w:color w:val="222222"/>
-        </w:rPr>
-        <w:t>later.</w:t>
-      </w:r>
-      <w:r>
-        <w:rPr>
-          <w:color w:val="222222"/>
-        </w:rPr>
-        <w:t>{</w:t>
-      </w:r>
-      <w:proofErr w:type="gramEnd"/>
-      <w:r>
-        <w:rPr>
-          <w:color w:val="222222"/>
-        </w:rPr>
-        <w:t xml:space="preserve">% if </w:t>
-      </w:r>
-      <w:proofErr w:type="spellStart"/>
-      <w:r>
-        <w:rPr>
-          <w:color w:val="222222"/>
-        </w:rPr>
-        <w:t>county_choice</w:t>
-      </w:r>
-      <w:proofErr w:type="spellEnd"/>
-      <w:r>
-        <w:rPr>
-          <w:color w:val="222222"/>
-        </w:rPr>
+        <w:t>You will not file all of these forms at the beginning of your case; some you will use later.</w:t>
+      </w:r>
+      <w:r>
+        <w:rPr>
+          <w:color w:val="222222"/>
+        </w:rPr>
+        <w:t xml:space="preserve">{% if county_choice </w:t>
+      </w:r>
+      <w:r>
+        <w:rPr>
+          <w:color w:val="222222"/>
+        </w:rPr>
+        <w:t>=</w:t>
+      </w:r>
+      <w:r>
+        <w:rPr>
+          <w:color w:val="222222"/>
+        </w:rPr>
+        <w:t>= “Oakland” %}</w:t>
+      </w:r>
+      <w:r>
         <w:t xml:space="preserve"> </w:t>
       </w:r>
       <w:r>
         <w:rPr>
           <w:color w:val="222222"/>
         </w:rPr>
+        <w:t>The instructions below explain which forms you need for each step.</w:t>
+      </w:r>
+      <w:r>
+        <w:rPr>
+          <w:color w:val="222222"/>
+        </w:rPr>
+        <w:t xml:space="preserve"> {% else %} </w:t>
+      </w:r>
+      <w:r>
+        <w:rPr>
+          <w:color w:val="222222"/>
+        </w:rPr>
+        <w:t>You will need to make copies of some of the forms. The instructions below explain which forms you need for each step and how many copies to make.</w:t>
+      </w:r>
+      <w:r>
+        <w:rPr>
+          <w:color w:val="222222"/>
+        </w:rPr>
+        <w:t>{% endif %}</w:t>
+      </w:r>
+    </w:p>
+    <w:p>
+      <w:pPr>
+        <w:spacing w:after="0"/>
+        <w:rPr>
+          <w:color w:val="222222"/>
+        </w:rPr>
+      </w:pPr>
+      <w:r>
+        <w:rPr>
+          <w:color w:val="222222"/>
+        </w:rPr>
+        <w:t xml:space="preserve">{%p if </w:t>
+      </w:r>
+      <w:r>
+        <w:rPr>
+          <w:color w:val="222222"/>
+        </w:rPr>
+        <w:t xml:space="preserve">county_choice </w:t>
+      </w:r>
+      <w:r>
+        <w:rPr>
+          <w:color w:val="222222"/>
+        </w:rPr>
         <w:t>=</w:t>
       </w:r>
       <w:r>
@@ -596,47 +421,6 @@
         </w:rPr>
         <w:t>= “Oakland” %}</w:t>
       </w:r>
-      <w:r>
-        <w:t xml:space="preserve"> </w:t>
-      </w:r>
-      <w:r>
-        <w:rPr>
-          <w:color w:val="222222"/>
-        </w:rPr>
-        <w:t>The instructions below explain which forms you need for each step.</w:t>
-      </w:r>
-      <w:r>
-        <w:rPr>
-          <w:color w:val="222222"/>
-        </w:rPr>
-        <w:t xml:space="preserve"> {% else %} </w:t>
-      </w:r>
-      <w:r>
-        <w:rPr>
-          <w:color w:val="222222"/>
-        </w:rPr>
-        <w:t xml:space="preserve">You will need to make copies of some of the forms. The instructions below explain which forms you need for each step and how many copies to </w:t>
-      </w:r>
-      <w:proofErr w:type="gramStart"/>
-      <w:r>
-        <w:rPr>
-          <w:color w:val="222222"/>
-        </w:rPr>
-        <w:t>make.</w:t>
-      </w:r>
-      <w:r>
-        <w:rPr>
-          <w:color w:val="222222"/>
-        </w:rPr>
-        <w:t>{</w:t>
-      </w:r>
-      <w:proofErr w:type="gramEnd"/>
-      <w:r>
-        <w:rPr>
-          <w:color w:val="222222"/>
-        </w:rPr>
-        <w:t>% endif %}</w:t>
-      </w:r>
     </w:p>
     <w:p>
       <w:pPr>
@@ -649,62 +433,14 @@
         <w:rPr>
           <w:color w:val="222222"/>
         </w:rPr>
-        <w:t xml:space="preserve">{%p if </w:t>
-      </w:r>
-      <w:proofErr w:type="spellStart"/>
-      <w:r>
-        <w:rPr>
-          <w:color w:val="222222"/>
-        </w:rPr>
-        <w:t>county_choice</w:t>
-      </w:r>
-      <w:proofErr w:type="spellEnd"/>
-      <w:r>
-        <w:rPr>
-          <w:color w:val="222222"/>
-        </w:rPr>
-        <w:t xml:space="preserve"> </w:t>
-      </w:r>
-      <w:r>
-        <w:rPr>
-          <w:color w:val="222222"/>
-        </w:rPr>
-        <w:t>=</w:t>
-      </w:r>
-      <w:r>
-        <w:rPr>
-          <w:color w:val="222222"/>
-        </w:rPr>
-        <w:t>= “Oakland” %}</w:t>
-      </w:r>
-    </w:p>
-    <w:p>
-      <w:pPr>
-        <w:spacing w:after="0"/>
-        <w:rPr>
-          <w:color w:val="222222"/>
-        </w:rPr>
-      </w:pPr>
-      <w:r>
-        <w:rPr>
-          <w:color w:val="222222"/>
-        </w:rPr>
         <w:t xml:space="preserve">In Oakland County, you will e-file your forms on the </w:t>
       </w:r>
       <w:hyperlink r:id="rId8" w:history="1">
-        <w:proofErr w:type="spellStart"/>
         <w:r>
           <w:rPr>
             <w:rStyle w:val="Hyperlink"/>
           </w:rPr>
-          <w:t>MiFILE</w:t>
-        </w:r>
-        <w:proofErr w:type="spellEnd"/>
-        <w:r>
-          <w:rPr>
-            <w:rStyle w:val="Hyperlink"/>
-          </w:rPr>
-          <w:t xml:space="preserve"> website</w:t>
+          <w:t>MiFILE website</w:t>
         </w:r>
       </w:hyperlink>
       <w:r>
@@ -798,17 +534,8 @@
           <w:color w:val="222222"/>
           <w:highlight w:val="white"/>
         </w:rPr>
-        <w:t xml:space="preserve">E-filing using </w:t>
-      </w:r>
-      <w:proofErr w:type="spellStart"/>
-      <w:r>
-        <w:rPr>
-          <w:color w:val="222222"/>
-          <w:highlight w:val="white"/>
-        </w:rPr>
-        <w:t>MiFILE</w:t>
-      </w:r>
-      <w:proofErr w:type="spellEnd"/>
+        <w:t>E-filing using MiFILE</w:t>
+      </w:r>
     </w:p>
     <w:p>
       <w:pPr>
@@ -870,7 +597,6 @@
         </w:rPr>
       </w:pPr>
       <w:hyperlink r:id="rId10">
-        <w:proofErr w:type="spellStart"/>
         <w:r>
           <w:rPr>
             <w:color w:val="1155CC"/>
@@ -879,7 +605,6 @@
           </w:rPr>
           <w:t>MiFILE</w:t>
         </w:r>
-        <w:proofErr w:type="spellEnd"/>
       </w:hyperlink>
       <w:r>
         <w:rPr>
@@ -1144,21 +869,73 @@
         <w:rPr>
           <w:color w:val="222222"/>
         </w:rPr>
-        <w:t xml:space="preserve">Sign and date your Answer to Complaint for Divorce. If you chose to sign electronically, this is already done. The electronic signature will look like this: </w:t>
-      </w:r>
-      <w:r>
-        <w:rPr>
-          <w:i/>
-          <w:iCs/>
-          <w:color w:val="222222"/>
-        </w:rPr>
-        <w:t>/s/ Your Name</w:t>
-      </w:r>
-      <w:r>
-        <w:rPr>
-          <w:color w:val="222222"/>
-        </w:rPr>
-        <w:t>. If you are also filing a Counterclaim for Divorce, sign and date it.</w:t>
+        <w:t>{%</w:t>
+      </w:r>
+      <w:r>
+        <w:rPr>
+          <w:color w:val="222222"/>
+        </w:rPr>
+        <w:t>p</w:t>
+      </w:r>
+      <w:r>
+        <w:rPr>
+          <w:color w:val="222222"/>
+        </w:rPr>
+        <w:t xml:space="preserve"> </w:t>
+      </w:r>
+      <w:r>
+        <w:rPr>
+          <w:color w:val="222222"/>
+        </w:rPr>
+        <w:t xml:space="preserve">if </w:t>
+      </w:r>
+      <w:r>
+        <w:rPr>
+          <w:color w:val="222222"/>
+        </w:rPr>
+        <w:t>(</w:t>
+      </w:r>
+      <w:r>
+        <w:rPr>
+          <w:color w:val="222222"/>
+        </w:rPr>
+        <w:t xml:space="preserve">not create_counterclaim </w:t>
+      </w:r>
+      <w:r>
+        <w:rPr>
+          <w:color w:val="222222"/>
+        </w:rPr>
+        <w:t>and</w:t>
+      </w:r>
+      <w:r>
+        <w:rPr>
+          <w:color w:val="222222"/>
+        </w:rPr>
+        <w:t xml:space="preserve"> there_are_marital_children</w:t>
+      </w:r>
+      <w:r>
+        <w:rPr>
+          <w:color w:val="222222"/>
+        </w:rPr>
+        <w:t xml:space="preserve">) or (create_counterclaim and </w:t>
+      </w:r>
+      <w:r>
+        <w:rPr>
+          <w:color w:val="222222"/>
+        </w:rPr>
+        <w:t>counterclaim_type == “with_children”</w:t>
+      </w:r>
+      <w:r>
+        <w:rPr>
+          <w:color w:val="222222"/>
+        </w:rPr>
+        <w:t>)</w:t>
+      </w:r>
+      <w:r>
+        <w:rPr>
+          <w:color w:val="222222"/>
+        </w:rPr>
+        <w:t xml:space="preserve"> %}</w:t>
       </w:r>
     </w:p>
     <w:p>
@@ -1172,13 +949,19 @@
         <w:rPr>
           <w:color w:val="222222"/>
         </w:rPr>
-        <w:t>{%</w:t>
-      </w:r>
-      <w:r>
-        <w:rPr>
-          <w:color w:val="222222"/>
-        </w:rPr>
-        <w:t>p</w:t>
+        <w:t>Sign and date your Answer to Complaint for Divorce</w:t>
+      </w:r>
+      <w:r>
+        <w:rPr>
+          <w:color w:val="222222"/>
+        </w:rPr>
+        <w:t>.</w:t>
+      </w:r>
+      <w:r>
+        <w:rPr>
+          <w:color w:val="222222"/>
+        </w:rPr>
+        <w:t xml:space="preserve"> If you are also filing a Counterclaim for Divorce, sign and date it.</w:t>
       </w:r>
       <w:r>
         <w:rPr>
@@ -1190,131 +973,33 @@
         <w:rPr>
           <w:color w:val="222222"/>
         </w:rPr>
-        <w:t xml:space="preserve">if </w:t>
-      </w:r>
-      <w:r>
-        <w:rPr>
-          <w:color w:val="222222"/>
-        </w:rPr>
-        <w:t>(</w:t>
-      </w:r>
-      <w:r>
-        <w:rPr>
-          <w:color w:val="222222"/>
-        </w:rPr>
-        <w:t xml:space="preserve">not </w:t>
-      </w:r>
-      <w:proofErr w:type="spellStart"/>
-      <w:r>
-        <w:rPr>
-          <w:color w:val="222222"/>
-        </w:rPr>
-        <w:t>create_counterclaim</w:t>
-      </w:r>
-      <w:proofErr w:type="spellEnd"/>
-      <w:r>
-        <w:rPr>
-          <w:color w:val="222222"/>
-        </w:rPr>
-        <w:t xml:space="preserve"> </w:t>
-      </w:r>
-      <w:r>
-        <w:rPr>
-          <w:color w:val="222222"/>
-        </w:rPr>
-        <w:t>and</w:t>
-      </w:r>
-      <w:r>
-        <w:rPr>
-          <w:color w:val="222222"/>
-        </w:rPr>
-        <w:t xml:space="preserve"> </w:t>
-      </w:r>
-      <w:proofErr w:type="spellStart"/>
-      <w:r>
-        <w:rPr>
-          <w:color w:val="222222"/>
-        </w:rPr>
-        <w:t>there_are_marital_children</w:t>
-      </w:r>
-      <w:proofErr w:type="spellEnd"/>
-      <w:r>
-        <w:rPr>
-          <w:color w:val="222222"/>
-        </w:rPr>
-        <w:t>) or (</w:t>
-      </w:r>
-      <w:proofErr w:type="spellStart"/>
-      <w:r>
-        <w:rPr>
-          <w:color w:val="222222"/>
-        </w:rPr>
-        <w:t>create_counterclaim</w:t>
-      </w:r>
-      <w:proofErr w:type="spellEnd"/>
-      <w:r>
-        <w:rPr>
-          <w:color w:val="222222"/>
-        </w:rPr>
-        <w:t xml:space="preserve"> and </w:t>
-      </w:r>
-      <w:proofErr w:type="spellStart"/>
-      <w:r>
-        <w:rPr>
-          <w:color w:val="222222"/>
-        </w:rPr>
-        <w:t>counterclaim_type</w:t>
-      </w:r>
-      <w:proofErr w:type="spellEnd"/>
-      <w:r>
-        <w:rPr>
-          <w:color w:val="222222"/>
-        </w:rPr>
-        <w:t xml:space="preserve"> == “</w:t>
-      </w:r>
-      <w:proofErr w:type="spellStart"/>
-      <w:r>
-        <w:rPr>
-          <w:color w:val="222222"/>
-        </w:rPr>
-        <w:t>with_children</w:t>
-      </w:r>
-      <w:proofErr w:type="spellEnd"/>
-      <w:r>
-        <w:rPr>
-          <w:color w:val="222222"/>
-        </w:rPr>
-        <w:t>”</w:t>
-      </w:r>
-      <w:r>
-        <w:rPr>
-          <w:color w:val="222222"/>
-        </w:rPr>
-        <w:t>)</w:t>
-      </w:r>
-      <w:r>
-        <w:rPr>
-          <w:color w:val="222222"/>
-        </w:rPr>
-        <w:t xml:space="preserve"> %}</w:t>
-      </w:r>
-      <w:r>
-        <w:rPr>
-          <w:color w:val="222222"/>
-        </w:rPr>
-        <w:t xml:space="preserve"> </w:t>
-      </w:r>
-      <w:r>
-        <w:rPr>
-          <w:color w:val="222222"/>
-        </w:rPr>
-        <w:br/>
-      </w:r>
-      <w:r>
-        <w:rPr>
-          <w:color w:val="222222"/>
-        </w:rPr>
-        <w:t>If you’re filing a Counterclaim, there are three other forms that the form tool created that you may need to use. They are:</w:t>
+        <w:t>(If your electronic signature was already added, you don’t need to sign again.)</w:t>
+      </w:r>
+    </w:p>
+    <w:p>
+      <w:pPr>
+        <w:spacing w:before="180" w:after="180"/>
+        <w:rPr>
+          <w:color w:val="222222"/>
+        </w:rPr>
+      </w:pPr>
+      <w:r>
+        <w:rPr>
+          <w:color w:val="222222"/>
+        </w:rPr>
+        <w:t xml:space="preserve">If you’re filing a Counterclaim, there are three other forms that the form tool created that you may need to </w:t>
+      </w:r>
+      <w:r>
+        <w:rPr>
+          <w:color w:val="222222"/>
+        </w:rPr>
+        <w:t>sign and date</w:t>
+      </w:r>
+      <w:r>
+        <w:rPr>
+          <w:color w:val="222222"/>
+        </w:rPr>
+        <w:t>. They are:</w:t>
       </w:r>
     </w:p>
     <w:p>
@@ -1376,6 +1061,13 @@
         </w:rPr>
         <w:t>Uniform Child Custody Jurisdiction Enforcement Act Affidavit</w:t>
       </w:r>
+      <w:r>
+        <w:rPr>
+          <w:color w:val="222222"/>
+          <w:highlight w:val="white"/>
+        </w:rPr>
+        <w:t xml:space="preserve"> (sign in front of a notary)</w:t>
+      </w:r>
     </w:p>
     <w:p>
       <w:pPr>
@@ -1390,46 +1082,62 @@
           <w:bCs/>
           <w:color w:val="222222"/>
         </w:rPr>
-        <w:t>You only need these three forms if the plaintiff did not file them.</w:t>
-      </w:r>
-      <w:r>
-        <w:rPr>
-          <w:color w:val="222222"/>
-        </w:rPr>
-        <w:t xml:space="preserve"> If the plaintiff served you with copies of these forms, that likely means they have filed them. You can also check with the court clerk’s office to see if the forms were </w:t>
-      </w:r>
-      <w:proofErr w:type="gramStart"/>
-      <w:r>
-        <w:rPr>
-          <w:color w:val="222222"/>
-        </w:rPr>
-        <w:t>filed, or</w:t>
-      </w:r>
-      <w:proofErr w:type="gramEnd"/>
-      <w:r>
-        <w:rPr>
-          <w:color w:val="222222"/>
-        </w:rPr>
-        <w:t xml:space="preserve"> check </w:t>
-      </w:r>
-      <w:proofErr w:type="spellStart"/>
-      <w:r>
-        <w:rPr>
-          <w:color w:val="222222"/>
-        </w:rPr>
-        <w:t>MiFILE</w:t>
-      </w:r>
-      <w:proofErr w:type="spellEnd"/>
-      <w:r>
-        <w:rPr>
-          <w:color w:val="222222"/>
-        </w:rPr>
-        <w:t xml:space="preserve"> if your case was e-filed.</w:t>
-      </w:r>
-    </w:p>
-    <w:p>
-      <w:pPr>
-        <w:spacing w:before="180" w:after="0"/>
+        <w:t xml:space="preserve">You only need these three forms if </w:t>
+      </w:r>
+      <w:r>
+        <w:rPr>
+          <w:b/>
+          <w:bCs/>
+          <w:color w:val="222222"/>
+        </w:rPr>
+        <w:t>your spouse</w:t>
+      </w:r>
+      <w:r>
+        <w:rPr>
+          <w:b/>
+          <w:bCs/>
+          <w:color w:val="222222"/>
+        </w:rPr>
+        <w:t xml:space="preserve"> did not file them</w:t>
+      </w:r>
+      <w:r>
+        <w:rPr>
+          <w:b/>
+          <w:bCs/>
+          <w:color w:val="222222"/>
+        </w:rPr>
+        <w:t>, or if the ones from your spouse are incorrect or incomplete</w:t>
+      </w:r>
+      <w:r>
+        <w:rPr>
+          <w:b/>
+          <w:bCs/>
+          <w:color w:val="222222"/>
+        </w:rPr>
+        <w:t>.</w:t>
+      </w:r>
+      <w:r>
+        <w:rPr>
+          <w:color w:val="222222"/>
+        </w:rPr>
+        <w:t xml:space="preserve"> If </w:t>
+      </w:r>
+      <w:r>
+        <w:rPr>
+          <w:color w:val="222222"/>
+        </w:rPr>
+        <w:t>your spouse</w:t>
+      </w:r>
+      <w:r>
+        <w:rPr>
+          <w:color w:val="222222"/>
+        </w:rPr>
+        <w:t xml:space="preserve"> served you with copies of these forms, that likely means they have filed them. You can also check with the court to see if the forms were filed.</w:t>
+      </w:r>
+    </w:p>
+    <w:p>
+      <w:pPr>
+        <w:spacing w:after="0"/>
         <w:rPr>
           <w:color w:val="222222"/>
         </w:rPr>
@@ -1439,21 +1147,98 @@
           <w:color w:val="222222"/>
         </w:rPr>
         <w:lastRenderedPageBreak/>
-        <w:t xml:space="preserve">If you find that the plaintiff did not file these forms, sign the Application for IV-D Child Support Services and the Verified Statement created by the form tool. The Uniform Child Custody Jurisdiction Enforcement Act Affidavit </w:t>
-      </w:r>
-      <w:proofErr w:type="gramStart"/>
-      <w:r>
-        <w:rPr>
-          <w:color w:val="222222"/>
-        </w:rPr>
-        <w:t>has to</w:t>
-      </w:r>
-      <w:proofErr w:type="gramEnd"/>
-      <w:r>
-        <w:rPr>
-          <w:color w:val="222222"/>
-        </w:rPr>
-        <w:t xml:space="preserve"> be signed in front of a notary. There may be a fee for notarization. You may be able to get your document notarized at a bank or at the court clerk's office. Some copy and print shops also offer notary services for a fee. Contact the bank or other location to make sure that a notary will be available at the time you plan on going. </w:t>
+        <w:t xml:space="preserve">If you </w:t>
+      </w:r>
+      <w:r>
+        <w:rPr>
+          <w:color w:val="222222"/>
+        </w:rPr>
+        <w:t>need to</w:t>
+      </w:r>
+      <w:r>
+        <w:rPr>
+          <w:color w:val="222222"/>
+        </w:rPr>
+        <w:t xml:space="preserve"> file</w:t>
+      </w:r>
+      <w:r>
+        <w:rPr>
+          <w:color w:val="222222"/>
+        </w:rPr>
+        <w:t xml:space="preserve"> a</w:t>
+      </w:r>
+      <w:r>
+        <w:rPr>
+          <w:color w:val="222222"/>
+        </w:rPr>
+        <w:t xml:space="preserve"> </w:t>
+      </w:r>
+      <w:r>
+        <w:rPr>
+          <w:b/>
+          <w:bCs/>
+          <w:color w:val="222222"/>
+        </w:rPr>
+        <w:t>Uniform Child Custody Jurisdiction Enforcement Act Affidavit</w:t>
+      </w:r>
+      <w:r>
+        <w:rPr>
+          <w:color w:val="222222"/>
+        </w:rPr>
+        <w:t xml:space="preserve">, make sure to </w:t>
+      </w:r>
+      <w:r>
+        <w:rPr>
+          <w:b/>
+          <w:bCs/>
+          <w:color w:val="222222"/>
+        </w:rPr>
+        <w:t xml:space="preserve">sign it in </w:t>
+      </w:r>
+      <w:r>
+        <w:rPr>
+          <w:b/>
+          <w:bCs/>
+          <w:color w:val="222222"/>
+        </w:rPr>
+        <w:t>front of a notary</w:t>
+      </w:r>
+      <w:r>
+        <w:rPr>
+          <w:color w:val="222222"/>
+        </w:rPr>
+        <w:t xml:space="preserve"> first</w:t>
+      </w:r>
+      <w:r>
+        <w:rPr>
+          <w:color w:val="222222"/>
+        </w:rPr>
+        <w:t xml:space="preserve">. There may be a fee for notarization. You may be able to get your document notarized at a bank or at the court clerk's office. Some copy and print shops also offer notary services for a fee. Contact the bank or other location to make sure that a notary will be available at the time you plan on going. </w:t>
+      </w:r>
+    </w:p>
+    <w:p>
+      <w:pPr>
+        <w:rPr>
+          <w:color w:val="222222"/>
+        </w:rPr>
+      </w:pPr>
+      <w:r>
+        <w:rPr>
+          <w:color w:val="222222"/>
+        </w:rPr>
+        <w:t xml:space="preserve">{%p </w:t>
+      </w:r>
+      <w:r>
+        <w:rPr>
+          <w:color w:val="222222"/>
+        </w:rPr>
+        <w:t>else</w:t>
+      </w:r>
+      <w:r>
+        <w:rPr>
+          <w:color w:val="222222"/>
+        </w:rPr>
+        <w:t xml:space="preserve"> %}</w:t>
       </w:r>
     </w:p>
     <w:p>
@@ -1467,6 +1252,113 @@
       <w:r>
         <w:rPr>
           <w:color w:val="222222"/>
+          <w:highlight w:val="white"/>
+        </w:rPr>
+        <w:t>Sign and date the following forms, unless your electronic signature was already added:</w:t>
+      </w:r>
+    </w:p>
+    <w:p>
+      <w:pPr>
+        <w:numPr>
+          <w:ilvl w:val="0"/>
+          <w:numId w:val="24"/>
+        </w:numPr>
+        <w:spacing w:after="0"/>
+        <w:rPr>
+          <w:color w:val="222222"/>
+          <w:highlight w:val="white"/>
+        </w:rPr>
+      </w:pPr>
+      <w:r>
+        <w:rPr>
+          <w:color w:val="222222"/>
+          <w:highlight w:val="white"/>
+        </w:rPr>
+        <w:t>Answer to Complaint for Divorce</w:t>
+      </w:r>
+    </w:p>
+    <w:p>
+      <w:pPr>
+        <w:numPr>
+          <w:ilvl w:val="0"/>
+          <w:numId w:val="24"/>
+        </w:numPr>
+        <w:spacing w:after="0"/>
+        <w:rPr>
+          <w:color w:val="222222"/>
+          <w:highlight w:val="white"/>
+        </w:rPr>
+      </w:pPr>
+      <w:r>
+        <w:rPr>
+          <w:color w:val="222222"/>
+          <w:highlight w:val="white"/>
+        </w:rPr>
+        <w:t>Counterclaim for Divorce (if you are filing one.)</w:t>
+      </w:r>
+    </w:p>
+    <w:p>
+      <w:pPr>
+        <w:numPr>
+          <w:ilvl w:val="0"/>
+          <w:numId w:val="24"/>
+        </w:numPr>
+        <w:rPr>
+          <w:color w:val="222222"/>
+          <w:highlight w:val="white"/>
+        </w:rPr>
+      </w:pPr>
+      <w:r>
+        <w:rPr>
+          <w:color w:val="222222"/>
+          <w:highlight w:val="white"/>
+        </w:rPr>
+        <w:t>Verified Statement (if needed. Learn more below.)</w:t>
+      </w:r>
+    </w:p>
+    <w:p>
+      <w:pPr>
+        <w:spacing w:after="180"/>
+        <w:rPr>
+          <w:color w:val="222222"/>
+          <w:highlight w:val="white"/>
+        </w:rPr>
+      </w:pPr>
+      <w:r>
+        <w:rPr>
+          <w:color w:val="222222"/>
+          <w:highlight w:val="white"/>
+        </w:rPr>
+        <w:t xml:space="preserve">If you are requesting spousal support in your Counterclaim, the form tool created a </w:t>
+      </w:r>
+      <w:r>
+        <w:rPr>
+          <w:b/>
+          <w:bCs/>
+          <w:color w:val="222222"/>
+          <w:highlight w:val="white"/>
+        </w:rPr>
+        <w:t>Verified Statement</w:t>
+      </w:r>
+      <w:r>
+        <w:rPr>
+          <w:color w:val="222222"/>
+          <w:highlight w:val="white"/>
+        </w:rPr>
+        <w:t xml:space="preserve"> form. If your spouse did not already file a Verified Statement, or if the one your spouse filed was incorrect or incomplete, you will need to submit the Verified Statement to the Friend of the Court.</w:t>
+      </w:r>
+    </w:p>
+    <w:p>
+      <w:pPr>
+        <w:spacing w:after="180"/>
+        <w:rPr>
+          <w:color w:val="222222"/>
+          <w:highlight w:val="white"/>
+        </w:rPr>
+      </w:pPr>
+      <w:r>
+        <w:rPr>
+          <w:color w:val="222222"/>
         </w:rPr>
         <w:t>{%</w:t>
       </w:r>
@@ -1510,19 +1402,11 @@
         </w:rPr>
         <w:t xml:space="preserve">{%p if </w:t>
       </w:r>
-      <w:proofErr w:type="spellStart"/>
-      <w:r>
-        <w:rPr>
-          <w:color w:val="222222"/>
-        </w:rPr>
-        <w:t>county_choice</w:t>
-      </w:r>
-      <w:proofErr w:type="spellEnd"/>
-      <w:r>
-        <w:rPr>
-          <w:color w:val="222222"/>
-        </w:rPr>
-        <w:t xml:space="preserve"> </w:t>
+      <w:r>
+        <w:rPr>
+          <w:color w:val="222222"/>
+        </w:rPr>
+        <w:t xml:space="preserve">county_choice </w:t>
       </w:r>
       <w:r>
         <w:rPr>
@@ -1583,25 +1467,7 @@
           <w:bCs/>
           <w:color w:val="222222"/>
         </w:rPr>
-        <w:t xml:space="preserve">{% if (not </w:t>
-      </w:r>
-      <w:proofErr w:type="spellStart"/>
-      <w:r>
-        <w:rPr>
-          <w:b/>
-          <w:bCs/>
-          <w:color w:val="222222"/>
-        </w:rPr>
-        <w:t>create_counterclaim</w:t>
-      </w:r>
-      <w:proofErr w:type="spellEnd"/>
-      <w:r>
-        <w:rPr>
-          <w:b/>
-          <w:bCs/>
-          <w:color w:val="222222"/>
-        </w:rPr>
-        <w:t xml:space="preserve"> and </w:t>
+        <w:t xml:space="preserve">{% if (not create_counterclaim and </w:t>
       </w:r>
       <w:r>
         <w:rPr>
@@ -1611,61 +1477,14 @@
         </w:rPr>
         <w:t xml:space="preserve">not </w:t>
       </w:r>
-      <w:proofErr w:type="spellStart"/>
-      <w:r>
-        <w:rPr>
-          <w:b/>
-          <w:bCs/>
-          <w:color w:val="222222"/>
-        </w:rPr>
-        <w:t>there_are_marital_children</w:t>
-      </w:r>
-      <w:proofErr w:type="spellEnd"/>
-      <w:r>
-        <w:rPr>
-          <w:b/>
-          <w:bCs/>
-          <w:color w:val="222222"/>
-        </w:rPr>
-        <w:t>) or (</w:t>
-      </w:r>
-      <w:proofErr w:type="spellStart"/>
-      <w:r>
-        <w:rPr>
-          <w:b/>
-          <w:bCs/>
-          <w:color w:val="222222"/>
-        </w:rPr>
-        <w:t>create_counterclaim</w:t>
-      </w:r>
-      <w:proofErr w:type="spellEnd"/>
-      <w:r>
-        <w:rPr>
-          <w:b/>
-          <w:bCs/>
-          <w:color w:val="222222"/>
-        </w:rPr>
-        <w:t xml:space="preserve"> and </w:t>
-      </w:r>
-      <w:proofErr w:type="spellStart"/>
-      <w:r>
-        <w:rPr>
-          <w:b/>
-          <w:bCs/>
-          <w:color w:val="222222"/>
-        </w:rPr>
-        <w:t>counterclaim_type</w:t>
-      </w:r>
-      <w:proofErr w:type="spellEnd"/>
-      <w:r>
-        <w:rPr>
-          <w:b/>
-          <w:bCs/>
-          <w:color w:val="222222"/>
-        </w:rPr>
-        <w:t xml:space="preserve"> == “</w:t>
-      </w:r>
-      <w:proofErr w:type="spellStart"/>
+      <w:r>
+        <w:rPr>
+          <w:b/>
+          <w:bCs/>
+          <w:color w:val="222222"/>
+        </w:rPr>
+        <w:t>there_are_marital_children) or (create_counterclaim and counterclaim_type == “</w:t>
+      </w:r>
       <w:r>
         <w:rPr>
           <w:b/>
@@ -1680,16 +1499,7 @@
           <w:bCs/>
           <w:color w:val="222222"/>
         </w:rPr>
-        <w:t>_children</w:t>
-      </w:r>
-      <w:proofErr w:type="spellEnd"/>
-      <w:r>
-        <w:rPr>
-          <w:b/>
-          <w:bCs/>
-          <w:color w:val="222222"/>
-        </w:rPr>
-        <w:t>”) %}</w:t>
+        <w:t>_children”) %}</w:t>
       </w:r>
       <w:r>
         <w:rPr>
@@ -1715,23 +1525,13 @@
         </w:rPr>
         <w:t xml:space="preserve"> else %}F{% endif %}</w:t>
       </w:r>
-      <w:proofErr w:type="spellStart"/>
-      <w:r>
-        <w:rPr>
-          <w:b/>
-          <w:bCs/>
-          <w:color w:val="222222"/>
-        </w:rPr>
-        <w:t>ind</w:t>
-      </w:r>
-      <w:proofErr w:type="spellEnd"/>
-      <w:r>
-        <w:rPr>
-          <w:b/>
-          <w:bCs/>
-          <w:color w:val="222222"/>
-        </w:rPr>
-        <w:t xml:space="preserve"> out if you need Friend of the Court copies.</w:t>
+      <w:r>
+        <w:rPr>
+          <w:b/>
+          <w:bCs/>
+          <w:color w:val="222222"/>
+        </w:rPr>
+        <w:t>ind out if you need Friend of the Court copies.</w:t>
       </w:r>
       <w:r>
         <w:rPr>
@@ -1809,77 +1609,7 @@
         <w:rPr>
           <w:color w:val="222222"/>
         </w:rPr>
-        <w:t xml:space="preserve">(not </w:t>
-      </w:r>
-      <w:proofErr w:type="spellStart"/>
-      <w:r>
-        <w:rPr>
-          <w:color w:val="222222"/>
-        </w:rPr>
-        <w:t>create_counterclaim</w:t>
-      </w:r>
-      <w:proofErr w:type="spellEnd"/>
-      <w:r>
-        <w:rPr>
-          <w:color w:val="222222"/>
-        </w:rPr>
-        <w:t xml:space="preserve"> and not </w:t>
-      </w:r>
-      <w:proofErr w:type="spellStart"/>
-      <w:r>
-        <w:rPr>
-          <w:color w:val="222222"/>
-        </w:rPr>
-        <w:t>there_are_marital_children</w:t>
-      </w:r>
-      <w:proofErr w:type="spellEnd"/>
-      <w:r>
-        <w:rPr>
-          <w:color w:val="222222"/>
-        </w:rPr>
-        <w:t>) or (</w:t>
-      </w:r>
-      <w:proofErr w:type="spellStart"/>
-      <w:r>
-        <w:rPr>
-          <w:color w:val="222222"/>
-        </w:rPr>
-        <w:t>create_counterclaim</w:t>
-      </w:r>
-      <w:proofErr w:type="spellEnd"/>
-      <w:r>
-        <w:rPr>
-          <w:color w:val="222222"/>
-        </w:rPr>
-        <w:t xml:space="preserve"> and </w:t>
-      </w:r>
-      <w:proofErr w:type="spellStart"/>
-      <w:r>
-        <w:rPr>
-          <w:color w:val="222222"/>
-        </w:rPr>
-        <w:t>counterclaim_type</w:t>
-      </w:r>
-      <w:proofErr w:type="spellEnd"/>
-      <w:r>
-        <w:rPr>
-          <w:color w:val="222222"/>
-        </w:rPr>
-        <w:t xml:space="preserve"> == “</w:t>
-      </w:r>
-      <w:proofErr w:type="spellStart"/>
-      <w:r>
-        <w:rPr>
-          <w:color w:val="222222"/>
-        </w:rPr>
-        <w:t>no_children</w:t>
-      </w:r>
-      <w:proofErr w:type="spellEnd"/>
-      <w:r>
-        <w:rPr>
-          <w:color w:val="222222"/>
-        </w:rPr>
-        <w:t>”) %}</w:t>
+        <w:t>(not create_counterclaim and not there_are_marital_children) or (create_counterclaim and counterclaim_type == “no_children”) %}</w:t>
       </w:r>
     </w:p>
     <w:p>
@@ -1907,6 +1637,61 @@
         </w:rPr>
         <w:t>2 copies</w:t>
       </w:r>
+    </w:p>
+    <w:p>
+      <w:pPr>
+        <w:pStyle w:val="ListParagraph"/>
+        <w:numPr>
+          <w:ilvl w:val="1"/>
+          <w:numId w:val="18"/>
+        </w:numPr>
+        <w:rPr>
+          <w:color w:val="222222"/>
+        </w:rPr>
+      </w:pPr>
+      <w:r>
+        <w:rPr>
+          <w:color w:val="222222"/>
+        </w:rPr>
+        <w:t xml:space="preserve">Verified Statement (if you are filing one. Learn more below.) – </w:t>
+      </w:r>
+      <w:r>
+        <w:rPr>
+          <w:b/>
+          <w:bCs/>
+          <w:color w:val="222222"/>
+        </w:rPr>
+        <w:t>2 copies</w:t>
+      </w:r>
+    </w:p>
+    <w:p>
+      <w:pPr>
+        <w:rPr>
+          <w:rFonts w:asciiTheme="majorHAnsi" w:hAnsiTheme="majorHAnsi" w:cstheme="majorHAnsi"/>
+          <w:color w:val="222222"/>
+        </w:rPr>
+      </w:pPr>
+      <w:r>
+        <w:rPr>
+          <w:b/>
+          <w:bCs/>
+          <w:color w:val="222222"/>
+        </w:rPr>
+        <w:t>You only need the Verified Statement if you requested spousal support in your Counterclaim. </w:t>
+      </w:r>
+      <w:r>
+        <w:rPr>
+          <w:color w:val="222222"/>
+        </w:rPr>
+        <w:t>But if your spouse already filed a Verified Statement, you do not need to file one unless your spouse's Verified Statement was incomplete or incorrect.</w:t>
+      </w:r>
+    </w:p>
+    <w:p>
+      <w:pPr>
+        <w:rPr>
+          <w:color w:val="222222"/>
+        </w:rPr>
+      </w:pPr>
     </w:p>
     <w:p>
       <w:pPr>
@@ -2022,7 +1807,7 @@
         <w:rPr>
           <w:color w:val="222222"/>
         </w:rPr>
-        <w:t xml:space="preserve"> (you only need to make copies if your spouse did not file this form)</w:t>
+        <w:t>*</w:t>
       </w:r>
     </w:p>
     <w:p>
@@ -2055,7 +1840,7 @@
         <w:rPr>
           <w:color w:val="222222"/>
         </w:rPr>
-        <w:t xml:space="preserve"> (you only need to make copies if your spouse did not file this form)</w:t>
+        <w:t>*</w:t>
       </w:r>
     </w:p>
     <w:p>
@@ -2088,7 +1873,38 @@
         <w:rPr>
           <w:color w:val="222222"/>
         </w:rPr>
-        <w:t xml:space="preserve"> (you only need to make copies if your spouse did not file this form)</w:t>
+        <w:t>*</w:t>
+      </w:r>
+    </w:p>
+    <w:p>
+      <w:pPr>
+        <w:rPr>
+          <w:color w:val="222222"/>
+        </w:rPr>
+      </w:pPr>
+      <w:r>
+        <w:rPr>
+          <w:b/>
+          <w:bCs/>
+          <w:color w:val="222222"/>
+        </w:rPr>
+        <w:t>*</w:t>
+      </w:r>
+      <w:r>
+        <w:rPr>
+          <w:b/>
+          <w:bCs/>
+          <w:color w:val="222222"/>
+        </w:rPr>
+        <w:t xml:space="preserve"> </w:t>
+      </w:r>
+      <w:r>
+        <w:rPr>
+          <w:b/>
+          <w:bCs/>
+          <w:color w:val="222222"/>
+        </w:rPr>
+        <w:t>Remember that you only need the Verified Statement, Application for IV-D Child Support Services, and UCCJEA Affidavit if your spouse did not file them, or if the ones your spouse filed are incorrect or incomplete.</w:t>
       </w:r>
     </w:p>
     <w:p>
@@ -2145,7 +1961,6 @@
           <w:bCs/>
           <w:color w:val="222222"/>
         </w:rPr>
-        <w:lastRenderedPageBreak/>
         <w:t>If you will be filing and serving papers electronically, you will not need copies.</w:t>
       </w:r>
     </w:p>
@@ -2188,21 +2003,7 @@
         <w:rPr>
           <w:color w:val="222222"/>
         </w:rPr>
-        <w:t xml:space="preserve">{%p if </w:t>
-      </w:r>
-      <w:proofErr w:type="spellStart"/>
-      <w:r>
-        <w:rPr>
-          <w:color w:val="222222"/>
-        </w:rPr>
-        <w:t>county_choice</w:t>
-      </w:r>
-      <w:proofErr w:type="spellEnd"/>
-      <w:r>
-        <w:rPr>
-          <w:color w:val="222222"/>
-        </w:rPr>
-        <w:t xml:space="preserve"> == “Oakland” %}</w:t>
+        <w:t>{%p if county_choice == “Oakland” %}</w:t>
       </w:r>
     </w:p>
     <w:p>
@@ -2257,7 +2058,6 @@
         <w:t xml:space="preserve">Upload your documents in </w:t>
       </w:r>
       <w:hyperlink r:id="rId14">
-        <w:proofErr w:type="spellStart"/>
         <w:r>
           <w:rPr>
             <w:b/>
@@ -2267,7 +2067,6 @@
           </w:rPr>
           <w:t>MiFILE</w:t>
         </w:r>
-        <w:proofErr w:type="spellEnd"/>
       </w:hyperlink>
       <w:r>
         <w:rPr>
@@ -2275,43 +2074,7 @@
           <w:color w:val="222222"/>
           <w:highlight w:val="white"/>
         </w:rPr>
-        <w:t xml:space="preserve">. Within </w:t>
-      </w:r>
-      <w:proofErr w:type="spellStart"/>
-      <w:r>
-        <w:rPr>
-          <w:b/>
-          <w:color w:val="222222"/>
-          <w:highlight w:val="white"/>
-        </w:rPr>
-        <w:t>MiFILE</w:t>
-      </w:r>
-      <w:proofErr w:type="spellEnd"/>
-      <w:r>
-        <w:rPr>
-          <w:b/>
-          <w:color w:val="222222"/>
-          <w:highlight w:val="white"/>
-        </w:rPr>
-        <w:t xml:space="preserve">, you will need to choose a </w:t>
-      </w:r>
-      <w:proofErr w:type="gramStart"/>
-      <w:r>
-        <w:rPr>
-          <w:b/>
-          <w:color w:val="222222"/>
-          <w:highlight w:val="white"/>
-        </w:rPr>
-        <w:t>drop down</w:t>
-      </w:r>
-      <w:proofErr w:type="gramEnd"/>
-      <w:r>
-        <w:rPr>
-          <w:b/>
-          <w:color w:val="222222"/>
-          <w:highlight w:val="white"/>
-        </w:rPr>
-        <w:t xml:space="preserve"> label for each individual document you upload. </w:t>
+        <w:t xml:space="preserve">. Within MiFILE, you will need to choose a drop down label for each individual document you upload. </w:t>
       </w:r>
     </w:p>
     <w:p>
@@ -2361,77 +2124,7 @@
         <w:rPr>
           <w:color w:val="1B1B1B"/>
         </w:rPr>
-        <w:t xml:space="preserve">{%p if (not </w:t>
-      </w:r>
-      <w:proofErr w:type="spellStart"/>
-      <w:r>
-        <w:rPr>
-          <w:color w:val="1B1B1B"/>
-        </w:rPr>
-        <w:t>create_counterclaim</w:t>
-      </w:r>
-      <w:proofErr w:type="spellEnd"/>
-      <w:r>
-        <w:rPr>
-          <w:color w:val="1B1B1B"/>
-        </w:rPr>
-        <w:t xml:space="preserve"> and not </w:t>
-      </w:r>
-      <w:proofErr w:type="spellStart"/>
-      <w:r>
-        <w:rPr>
-          <w:color w:val="1B1B1B"/>
-        </w:rPr>
-        <w:t>there_are_marital_children</w:t>
-      </w:r>
-      <w:proofErr w:type="spellEnd"/>
-      <w:r>
-        <w:rPr>
-          <w:color w:val="1B1B1B"/>
-        </w:rPr>
-        <w:t>) or (</w:t>
-      </w:r>
-      <w:proofErr w:type="spellStart"/>
-      <w:r>
-        <w:rPr>
-          <w:color w:val="1B1B1B"/>
-        </w:rPr>
-        <w:t>create_counterclaim</w:t>
-      </w:r>
-      <w:proofErr w:type="spellEnd"/>
-      <w:r>
-        <w:rPr>
-          <w:color w:val="1B1B1B"/>
-        </w:rPr>
-        <w:t xml:space="preserve"> and </w:t>
-      </w:r>
-      <w:proofErr w:type="spellStart"/>
-      <w:r>
-        <w:rPr>
-          <w:color w:val="1B1B1B"/>
-        </w:rPr>
-        <w:t>counterclaim_type</w:t>
-      </w:r>
-      <w:proofErr w:type="spellEnd"/>
-      <w:r>
-        <w:rPr>
-          <w:color w:val="1B1B1B"/>
-        </w:rPr>
-        <w:t xml:space="preserve"> == “</w:t>
-      </w:r>
-      <w:proofErr w:type="spellStart"/>
-      <w:r>
-        <w:rPr>
-          <w:color w:val="1B1B1B"/>
-        </w:rPr>
-        <w:t>no_children</w:t>
-      </w:r>
-      <w:proofErr w:type="spellEnd"/>
-      <w:r>
-        <w:rPr>
-          <w:color w:val="1B1B1B"/>
-        </w:rPr>
-        <w:t>”) %}</w:t>
+        <w:t>{%p if (not create_counterclaim and not there_are_marital_children) or (create_counterclaim and counterclaim_type == “no_children”) %}</w:t>
       </w:r>
     </w:p>
     <w:p>
@@ -2479,6 +2172,12 @@
         </w:rPr>
         <w:t xml:space="preserve"> else %}</w:t>
       </w:r>
+      <w:r>
+        <w:rPr>
+          <w:color w:val="1B1B1B"/>
+        </w:rPr>
+        <w:t xml:space="preserve"> </w:t>
+      </w:r>
     </w:p>
     <w:p>
       <w:pPr>
@@ -2556,6 +2255,7 @@
         <w:rPr>
           <w:color w:val="1B1B1B"/>
         </w:rPr>
+        <w:lastRenderedPageBreak/>
         <w:t>Verified Statement</w:t>
       </w:r>
       <w:r>
@@ -2623,7 +2323,6 @@
         <w:spacing w:before="180" w:after="180"/>
         <w:rPr>
           <w:color w:val="222222"/>
-          <w:highlight w:val="white"/>
         </w:rPr>
       </w:pPr>
       <w:r>
@@ -2663,6 +2362,48 @@
     </w:p>
     <w:p>
       <w:pPr>
+        <w:spacing w:before="180" w:after="180"/>
+        <w:rPr>
+          <w:color w:val="222222"/>
+        </w:rPr>
+      </w:pPr>
+      <w:r>
+        <w:rPr>
+          <w:color w:val="222222"/>
+        </w:rPr>
+        <w:t xml:space="preserve">File and serve the forms within </w:t>
+      </w:r>
+      <w:r>
+        <w:rPr>
+          <w:b/>
+          <w:bCs/>
+          <w:color w:val="222222"/>
+        </w:rPr>
+        <w:t>21 days</w:t>
+      </w:r>
+      <w:r>
+        <w:rPr>
+          <w:color w:val="222222"/>
+        </w:rPr>
+        <w:t xml:space="preserve"> of the date your spouse had you served with the initial divorce papers, if the papers were given to you in person. Or if you received your initial divorce papers in the mail or outside of Michigan, file and serve your forms within </w:t>
+      </w:r>
+      <w:r>
+        <w:rPr>
+          <w:b/>
+          <w:bCs/>
+          <w:color w:val="222222"/>
+        </w:rPr>
+        <w:t>28 days</w:t>
+      </w:r>
+      <w:r>
+        <w:rPr>
+          <w:color w:val="222222"/>
+        </w:rPr>
+        <w:t xml:space="preserve"> of the date you were served.</w:t>
+      </w:r>
+    </w:p>
+    <w:p>
+      <w:pPr>
         <w:spacing w:before="240" w:after="240"/>
         <w:rPr>
           <w:color w:val="222222"/>
@@ -2673,6 +2414,42 @@
           <w:color w:val="222222"/>
         </w:rPr>
         <w:t>{%p else %}</w:t>
+      </w:r>
+      <w:r>
+        <w:rPr>
+          <w:color w:val="222222"/>
+        </w:rPr>
+        <w:t xml:space="preserve"> </w:t>
+      </w:r>
+      <w:r>
+        <w:rPr>
+          <w:color w:val="BFBFBF" w:themeColor="background1" w:themeShade="BF"/>
+        </w:rPr>
+        <w:t>//</w:t>
+      </w:r>
+      <w:r>
+        <w:rPr>
+          <w:color w:val="BFBFBF" w:themeColor="background1" w:themeShade="BF"/>
+        </w:rPr>
+        <w:t xml:space="preserve"> </w:t>
+      </w:r>
+      <w:r>
+        <w:rPr>
+          <w:color w:val="BFBFBF" w:themeColor="background1" w:themeShade="BF"/>
+        </w:rPr>
+        <w:t>i.e. not</w:t>
+      </w:r>
+      <w:r>
+        <w:rPr>
+          <w:color w:val="BFBFBF" w:themeColor="background1" w:themeShade="BF"/>
+        </w:rPr>
+        <w:t xml:space="preserve"> </w:t>
+      </w:r>
+      <w:r>
+        <w:rPr>
+          <w:color w:val="BFBFBF" w:themeColor="background1" w:themeShade="BF"/>
+        </w:rPr>
+        <w:t>Oakland</w:t>
       </w:r>
     </w:p>
     <w:p>
@@ -2735,7 +2512,7 @@
           <w:bCs/>
           <w:color w:val="222222"/>
         </w:rPr>
-        <w:t>File the following documents:</w:t>
+        <w:t>File the following:</w:t>
       </w:r>
     </w:p>
     <w:p>
@@ -2754,7 +2531,6 @@
         <w:rPr>
           <w:color w:val="1B1B1B"/>
         </w:rPr>
-        <w:lastRenderedPageBreak/>
         <w:t>Answer to Complaint for Divorce</w:t>
       </w:r>
     </w:p>
@@ -2770,77 +2546,7 @@
         <w:rPr>
           <w:color w:val="1B1B1B"/>
         </w:rPr>
-        <w:t xml:space="preserve">{%p if (not </w:t>
-      </w:r>
-      <w:proofErr w:type="spellStart"/>
-      <w:r>
-        <w:rPr>
-          <w:color w:val="1B1B1B"/>
-        </w:rPr>
-        <w:t>create_counterclaim</w:t>
-      </w:r>
-      <w:proofErr w:type="spellEnd"/>
-      <w:r>
-        <w:rPr>
-          <w:color w:val="1B1B1B"/>
-        </w:rPr>
-        <w:t xml:space="preserve"> and not </w:t>
-      </w:r>
-      <w:proofErr w:type="spellStart"/>
-      <w:r>
-        <w:rPr>
-          <w:color w:val="1B1B1B"/>
-        </w:rPr>
-        <w:t>there_are_marital_children</w:t>
-      </w:r>
-      <w:proofErr w:type="spellEnd"/>
-      <w:r>
-        <w:rPr>
-          <w:color w:val="1B1B1B"/>
-        </w:rPr>
-        <w:t>) or (</w:t>
-      </w:r>
-      <w:proofErr w:type="spellStart"/>
-      <w:r>
-        <w:rPr>
-          <w:color w:val="1B1B1B"/>
-        </w:rPr>
-        <w:t>create_counterclaim</w:t>
-      </w:r>
-      <w:proofErr w:type="spellEnd"/>
-      <w:r>
-        <w:rPr>
-          <w:color w:val="1B1B1B"/>
-        </w:rPr>
-        <w:t xml:space="preserve"> and </w:t>
-      </w:r>
-      <w:proofErr w:type="spellStart"/>
-      <w:r>
-        <w:rPr>
-          <w:color w:val="1B1B1B"/>
-        </w:rPr>
-        <w:t>counterclaim_type</w:t>
-      </w:r>
-      <w:proofErr w:type="spellEnd"/>
-      <w:r>
-        <w:rPr>
-          <w:color w:val="1B1B1B"/>
-        </w:rPr>
-        <w:t xml:space="preserve"> == “</w:t>
-      </w:r>
-      <w:proofErr w:type="spellStart"/>
-      <w:r>
-        <w:rPr>
-          <w:color w:val="1B1B1B"/>
-        </w:rPr>
-        <w:t>no_children</w:t>
-      </w:r>
-      <w:proofErr w:type="spellEnd"/>
-      <w:r>
-        <w:rPr>
-          <w:color w:val="1B1B1B"/>
-        </w:rPr>
-        <w:t>”) %}</w:t>
+        <w:t>{%p if (not create_counterclaim and not there_are_marital_children) or (create_counterclaim and counterclaim_type == “no_children”) %}</w:t>
       </w:r>
     </w:p>
     <w:p>
@@ -2865,6 +2571,44 @@
     <w:p>
       <w:pPr>
         <w:widowControl w:val="0"/>
+        <w:spacing w:after="0" w:line="276" w:lineRule="auto"/>
+        <w:rPr>
+          <w:color w:val="1B1B1B"/>
+        </w:rPr>
+      </w:pPr>
+    </w:p>
+    <w:p>
+      <w:pPr>
+        <w:widowControl w:val="0"/>
+        <w:spacing w:after="0" w:line="276" w:lineRule="auto"/>
+        <w:rPr>
+          <w:color w:val="1B1B1B"/>
+        </w:rPr>
+      </w:pPr>
+      <w:r>
+        <w:rPr>
+          <w:color w:val="1B1B1B"/>
+        </w:rPr>
+        <w:t>If you are filing a Counterclaim that requests spousal support, you will also need to submit a </w:t>
+      </w:r>
+      <w:r>
+        <w:rPr>
+          <w:b/>
+          <w:bCs/>
+          <w:color w:val="1B1B1B"/>
+        </w:rPr>
+        <w:t>Verified Statement </w:t>
+      </w:r>
+      <w:r>
+        <w:rPr>
+          <w:color w:val="1B1B1B"/>
+        </w:rPr>
+        <w:t>to the Friend of the Court. But if your spouse already filed a Verified Statement, you do not need to file one unless your spouse's Verified Statement was incomplete or incorrect. You may need to submit the Verified Statement differently from the way you file the other forms. Learn more below.*</w:t>
+      </w:r>
+    </w:p>
+    <w:p>
+      <w:pPr>
+        <w:widowControl w:val="0"/>
         <w:spacing w:after="240" w:line="276" w:lineRule="auto"/>
         <w:rPr>
           <w:color w:val="1B1B1B"/>
@@ -2887,35 +2631,6 @@
           <w:color w:val="1B1B1B"/>
         </w:rPr>
         <w:t xml:space="preserve"> else %}</w:t>
-      </w:r>
-    </w:p>
-    <w:p>
-      <w:pPr>
-        <w:widowControl w:val="0"/>
-        <w:spacing w:before="240" w:after="240"/>
-        <w:rPr>
-          <w:color w:val="1B1B1B"/>
-        </w:rPr>
-      </w:pPr>
-      <w:r>
-        <w:rPr>
-          <w:color w:val="1B1B1B"/>
-        </w:rPr>
-        <w:t xml:space="preserve">If you are also filing a </w:t>
-      </w:r>
-      <w:r>
-        <w:rPr>
-          <w:b/>
-          <w:bCs/>
-          <w:color w:val="1B1B1B"/>
-        </w:rPr>
-        <w:t>Counterclaim for Divorce with Children</w:t>
-      </w:r>
-      <w:r>
-        <w:rPr>
-          <w:color w:val="1B1B1B"/>
-        </w:rPr>
-        <w:t>, file it at the same time as your Answer along with:</w:t>
       </w:r>
     </w:p>
     <w:p>
@@ -2927,20 +2642,67 @@
         </w:numPr>
         <w:spacing w:after="0" w:line="276" w:lineRule="auto"/>
         <w:rPr>
-          <w:color w:val="222222"/>
-        </w:rPr>
-      </w:pPr>
-      <w:r>
-        <w:rPr>
-          <w:color w:val="222222"/>
-        </w:rPr>
-        <w:t>Uniform Child Custody Jurisdiction Enforcement Act Affidavit</w:t>
-      </w:r>
-      <w:r>
-        <w:rPr>
-          <w:color w:val="222222"/>
-        </w:rPr>
-        <w:t xml:space="preserve"> (only if your spouse did not file this form)</w:t>
+          <w:color w:val="1B1B1B"/>
+        </w:rPr>
+      </w:pPr>
+      <w:r>
+        <w:rPr>
+          <w:color w:val="1B1B1B"/>
+        </w:rPr>
+        <w:t>Counterclaim for Divorce with Children (if needed)</w:t>
+      </w:r>
+    </w:p>
+    <w:p>
+      <w:pPr>
+        <w:widowControl w:val="0"/>
+        <w:spacing w:before="240" w:after="240"/>
+        <w:rPr>
+          <w:color w:val="1B1B1B"/>
+        </w:rPr>
+      </w:pPr>
+      <w:r>
+        <w:rPr>
+          <w:color w:val="1B1B1B"/>
+        </w:rPr>
+        <w:t xml:space="preserve">If you are filing a </w:t>
+      </w:r>
+      <w:r>
+        <w:rPr>
+          <w:b/>
+          <w:bCs/>
+          <w:color w:val="1B1B1B"/>
+        </w:rPr>
+        <w:t>Counterclaim for Divorce with Children</w:t>
+      </w:r>
+      <w:r>
+        <w:rPr>
+          <w:color w:val="1B1B1B"/>
+        </w:rPr>
+        <w:t>,</w:t>
+      </w:r>
+      <w:r>
+        <w:rPr>
+          <w:color w:val="1B1B1B"/>
+        </w:rPr>
+        <w:t xml:space="preserve"> also</w:t>
+      </w:r>
+      <w:r>
+        <w:rPr>
+          <w:color w:val="1B1B1B"/>
+        </w:rPr>
+        <w:t xml:space="preserve"> file </w:t>
+      </w:r>
+      <w:r>
+        <w:rPr>
+          <w:color w:val="1B1B1B"/>
+        </w:rPr>
+        <w:t>the following forms if your spouse did not file them, or if the ones your spouse filed are incorrect or incomplete</w:t>
+      </w:r>
+      <w:r>
+        <w:rPr>
+          <w:color w:val="1B1B1B"/>
+        </w:rPr>
+        <w:t>:</w:t>
       </w:r>
     </w:p>
     <w:p>
@@ -2959,13 +2721,13 @@
         <w:rPr>
           <w:color w:val="222222"/>
         </w:rPr>
-        <w:t>Verified Statement</w:t>
-      </w:r>
-      <w:r>
-        <w:rPr>
-          <w:color w:val="222222"/>
-        </w:rPr>
-        <w:t xml:space="preserve"> (only if your spouse did not file this form)</w:t>
+        <w:t>Uniform Child Custody Jurisdiction Enforcement Act Affidavit</w:t>
+      </w:r>
+      <w:r>
+        <w:rPr>
+          <w:color w:val="222222"/>
+        </w:rPr>
+        <w:t xml:space="preserve"> </w:t>
       </w:r>
     </w:p>
     <w:p>
@@ -2986,11 +2748,52 @@
         </w:rPr>
         <w:t>Application for IV-D Child Support Services (form DHS-1201D)</w:t>
       </w:r>
-      <w:r>
-        <w:rPr>
-          <w:color w:val="222222"/>
-        </w:rPr>
-        <w:t xml:space="preserve"> (only if your spouse did not file this form)</w:t>
+    </w:p>
+    <w:p>
+      <w:pPr>
+        <w:widowControl w:val="0"/>
+        <w:numPr>
+          <w:ilvl w:val="0"/>
+          <w:numId w:val="16"/>
+        </w:numPr>
+        <w:spacing w:after="0" w:line="276" w:lineRule="auto"/>
+        <w:rPr>
+          <w:color w:val="222222"/>
+        </w:rPr>
+      </w:pPr>
+      <w:r>
+        <w:rPr>
+          <w:b/>
+          <w:bCs/>
+          <w:color w:val="222222"/>
+        </w:rPr>
+        <w:t>Verified Statement</w:t>
+      </w:r>
+      <w:r>
+        <w:rPr>
+          <w:b/>
+          <w:bCs/>
+          <w:color w:val="222222"/>
+        </w:rPr>
+        <w:t>*</w:t>
+      </w:r>
+      <w:r>
+        <w:rPr>
+          <w:color w:val="222222"/>
+        </w:rPr>
+        <w:t xml:space="preserve"> (</w:t>
+      </w:r>
+      <w:r>
+        <w:rPr>
+          <w:color w:val="222222"/>
+        </w:rPr>
+        <w:t>You may need to submit this form differently. Learn more below.</w:t>
+      </w:r>
+      <w:r>
+        <w:rPr>
+          <w:color w:val="222222"/>
+        </w:rPr>
+        <w:t>)</w:t>
       </w:r>
     </w:p>
     <w:p>
@@ -3031,11 +2834,88 @@
         <w:rPr>
           <w:color w:val="222222"/>
         </w:rPr>
+        <w:lastRenderedPageBreak/>
         <w:t>If you are filing in person at the court, give the clerk your forms and all copies. The clerk will return any copies the court does not need. If you are e-filing or email filing, upload PDFs of each form to the e-filing platform or to an email and submit it.</w:t>
       </w:r>
     </w:p>
     <w:p>
       <w:pPr>
+        <w:spacing w:before="180" w:after="180"/>
+        <w:rPr>
+          <w:color w:val="222222"/>
+        </w:rPr>
+      </w:pPr>
+      <w:r>
+        <w:rPr>
+          <w:color w:val="222222"/>
+        </w:rPr>
+        <w:t xml:space="preserve">File and serve the forms within </w:t>
+      </w:r>
+      <w:r>
+        <w:rPr>
+          <w:b/>
+          <w:bCs/>
+          <w:color w:val="222222"/>
+        </w:rPr>
+        <w:t>21 days</w:t>
+      </w:r>
+      <w:r>
+        <w:rPr>
+          <w:color w:val="222222"/>
+        </w:rPr>
+        <w:t xml:space="preserve"> of the date your spouse had you served with the initial divorce papers, if the papers were given to you in person. Or if you received your initial divorce papers in the mail or outside of Michigan, file and serve your forms within </w:t>
+      </w:r>
+      <w:r>
+        <w:rPr>
+          <w:b/>
+          <w:bCs/>
+          <w:color w:val="222222"/>
+        </w:rPr>
+        <w:t>28 days</w:t>
+      </w:r>
+      <w:r>
+        <w:rPr>
+          <w:color w:val="222222"/>
+        </w:rPr>
+        <w:t xml:space="preserve"> of the date you were served.</w:t>
+      </w:r>
+    </w:p>
+    <w:p>
+      <w:pPr>
+        <w:spacing w:before="180" w:after="180"/>
+        <w:rPr>
+          <w:color w:val="222222"/>
+        </w:rPr>
+      </w:pPr>
+      <w:r>
+        <w:rPr>
+          <w:b/>
+          <w:bCs/>
+          <w:color w:val="222222"/>
+        </w:rPr>
+        <w:t>*Verified Statement: </w:t>
+      </w:r>
+      <w:r>
+        <w:rPr>
+          <w:color w:val="222222"/>
+        </w:rPr>
+        <w:t>If you are submitting a Verified Statement, ask the court clerk or the Friend of the Court (FOC) if you should submit it to the FOC directly or file it with your other forms.</w:t>
+      </w:r>
+      <w:r>
+        <w:rPr>
+          <w:color w:val="222222"/>
+        </w:rPr>
+        <w:t xml:space="preserve"> </w:t>
+      </w:r>
+      <w:r>
+        <w:rPr>
+          <w:color w:val="222222"/>
+        </w:rPr>
+        <w:t>The Verified Statement belongs in the nonpublic FOC file instead of the public court file. Some courts will let you file it with the clerk's office, and the clerk will separate it from the other filings and send it to the FOC. Other courts may want you to provide the Verified Statement to the FOC instead.</w:t>
+      </w:r>
+    </w:p>
+    <w:p>
+      <w:pPr>
         <w:spacing w:before="240" w:after="240"/>
         <w:rPr>
           <w:color w:val="222222"/>
@@ -3046,49 +2926,31 @@
         <w:rPr>
           <w:color w:val="222222"/>
         </w:rPr>
-        <w:t>{%p endif %}</w:t>
-      </w:r>
-    </w:p>
-    <w:p>
-      <w:pPr>
-        <w:spacing w:before="180" w:after="180"/>
-        <w:rPr>
-          <w:color w:val="222222"/>
-        </w:rPr>
-      </w:pPr>
-      <w:r>
-        <w:rPr>
-          <w:color w:val="222222"/>
-        </w:rPr>
-        <w:t xml:space="preserve">File and serve the forms within </w:t>
-      </w:r>
-      <w:r>
-        <w:rPr>
-          <w:b/>
-          <w:bCs/>
-          <w:color w:val="222222"/>
-        </w:rPr>
-        <w:t>21 days</w:t>
-      </w:r>
-      <w:r>
-        <w:rPr>
-          <w:color w:val="222222"/>
-        </w:rPr>
-        <w:t xml:space="preserve"> of the date your spouse had you served with the initial divorce papers, if the papers were given to you in person. Or if you received your initial divorce papers in the mail or outside of Michigan, file and serve your forms within </w:t>
-      </w:r>
-      <w:r>
-        <w:rPr>
-          <w:b/>
-          <w:bCs/>
-          <w:color w:val="222222"/>
-        </w:rPr>
-        <w:t>28 days</w:t>
-      </w:r>
-      <w:r>
-        <w:rPr>
-          <w:color w:val="222222"/>
-        </w:rPr>
-        <w:t xml:space="preserve"> of the date you were served.</w:t>
+        <w:t xml:space="preserve">{%p endif %} </w:t>
+      </w:r>
+      <w:r>
+        <w:rPr>
+          <w:color w:val="BFBFBF" w:themeColor="background1" w:themeShade="BF"/>
+        </w:rPr>
+        <w:t>//</w:t>
+      </w:r>
+      <w:r>
+        <w:rPr>
+          <w:color w:val="BFBFBF" w:themeColor="background1" w:themeShade="BF"/>
+        </w:rPr>
+        <w:t xml:space="preserve"> end</w:t>
+      </w:r>
+      <w:r>
+        <w:rPr>
+          <w:color w:val="BFBFBF" w:themeColor="background1" w:themeShade="BF"/>
+        </w:rPr>
+        <w:t xml:space="preserve"> </w:t>
+      </w:r>
+      <w:r>
+        <w:rPr>
+          <w:color w:val="BFBFBF" w:themeColor="background1" w:themeShade="BF"/>
+        </w:rPr>
+        <w:t>Oakland logic split</w:t>
       </w:r>
     </w:p>
     <w:p>
@@ -3192,77 +3054,7 @@
         <w:rPr>
           <w:color w:val="1B1B1B"/>
         </w:rPr>
-        <w:t xml:space="preserve">{%p if (not </w:t>
-      </w:r>
-      <w:proofErr w:type="spellStart"/>
-      <w:r>
-        <w:rPr>
-          <w:color w:val="1B1B1B"/>
-        </w:rPr>
-        <w:t>create_counterclaim</w:t>
-      </w:r>
-      <w:proofErr w:type="spellEnd"/>
-      <w:r>
-        <w:rPr>
-          <w:color w:val="1B1B1B"/>
-        </w:rPr>
-        <w:t xml:space="preserve"> and not </w:t>
-      </w:r>
-      <w:proofErr w:type="spellStart"/>
-      <w:r>
-        <w:rPr>
-          <w:color w:val="1B1B1B"/>
-        </w:rPr>
-        <w:t>there_are_marital_children</w:t>
-      </w:r>
-      <w:proofErr w:type="spellEnd"/>
-      <w:r>
-        <w:rPr>
-          <w:color w:val="1B1B1B"/>
-        </w:rPr>
-        <w:t>) or (</w:t>
-      </w:r>
-      <w:proofErr w:type="spellStart"/>
-      <w:r>
-        <w:rPr>
-          <w:color w:val="1B1B1B"/>
-        </w:rPr>
-        <w:t>create_counterclaim</w:t>
-      </w:r>
-      <w:proofErr w:type="spellEnd"/>
-      <w:r>
-        <w:rPr>
-          <w:color w:val="1B1B1B"/>
-        </w:rPr>
-        <w:t xml:space="preserve"> and </w:t>
-      </w:r>
-      <w:proofErr w:type="spellStart"/>
-      <w:r>
-        <w:rPr>
-          <w:color w:val="1B1B1B"/>
-        </w:rPr>
-        <w:t>counterclaim_type</w:t>
-      </w:r>
-      <w:proofErr w:type="spellEnd"/>
-      <w:r>
-        <w:rPr>
-          <w:color w:val="1B1B1B"/>
-        </w:rPr>
-        <w:t xml:space="preserve"> == “</w:t>
-      </w:r>
-      <w:proofErr w:type="spellStart"/>
-      <w:r>
-        <w:rPr>
-          <w:color w:val="1B1B1B"/>
-        </w:rPr>
-        <w:t>no_children</w:t>
-      </w:r>
-      <w:proofErr w:type="spellEnd"/>
-      <w:r>
-        <w:rPr>
-          <w:color w:val="1B1B1B"/>
-        </w:rPr>
-        <w:t>”) %}</w:t>
+        <w:t>{%p if (not create_counterclaim and not there_are_marital_children) or (create_counterclaim and counterclaim_type == “no_children”) %}</w:t>
       </w:r>
     </w:p>
     <w:p>
@@ -3283,6 +3075,19 @@
     </w:p>
     <w:p>
       <w:pPr>
+        <w:widowControl w:val="0"/>
+        <w:numPr>
+          <w:ilvl w:val="0"/>
+          <w:numId w:val="16"/>
+        </w:numPr>
+        <w:spacing w:after="0" w:line="276" w:lineRule="auto"/>
+      </w:pPr>
+      <w:r>
+        <w:t>Verified Statement (if you filed one)</w:t>
+      </w:r>
+    </w:p>
+    <w:p>
+      <w:pPr>
         <w:spacing w:before="180" w:after="180"/>
         <w:rPr>
           <w:color w:val="222222"/>
@@ -3309,7 +3114,6 @@
         <w:rPr>
           <w:color w:val="222222"/>
         </w:rPr>
-        <w:lastRenderedPageBreak/>
         <w:t>Counterclaim for Divorce with Children (if you filed one), along with the Uniform Child Custody Jurisdiction Enforcement Act Affidavit, Verified Statement, and Application for IV-D Child Support Services (form DHS-1201D)</w:t>
       </w:r>
       <w:r>
@@ -3346,63 +3150,7 @@
         <w:rPr>
           <w:color w:val="222222"/>
         </w:rPr>
-        <w:t xml:space="preserve">If you used </w:t>
-      </w:r>
-      <w:proofErr w:type="spellStart"/>
-      <w:r>
-        <w:rPr>
-          <w:color w:val="222222"/>
-        </w:rPr>
-        <w:t>MiFILE</w:t>
-      </w:r>
-      <w:proofErr w:type="spellEnd"/>
-      <w:r>
-        <w:rPr>
-          <w:color w:val="222222"/>
-        </w:rPr>
-        <w:t xml:space="preserve"> to file documents electronically, </w:t>
-      </w:r>
-      <w:proofErr w:type="spellStart"/>
-      <w:r>
-        <w:rPr>
-          <w:color w:val="222222"/>
-        </w:rPr>
-        <w:t>MiFILE</w:t>
-      </w:r>
-      <w:proofErr w:type="spellEnd"/>
-      <w:r>
-        <w:rPr>
-          <w:color w:val="222222"/>
-        </w:rPr>
-        <w:t xml:space="preserve"> will also serve the documents electronically if the other party is using </w:t>
-      </w:r>
-      <w:proofErr w:type="spellStart"/>
-      <w:r>
-        <w:rPr>
-          <w:color w:val="222222"/>
-        </w:rPr>
-        <w:t>MiFILE</w:t>
-      </w:r>
-      <w:proofErr w:type="spellEnd"/>
-      <w:r>
-        <w:rPr>
-          <w:color w:val="222222"/>
-        </w:rPr>
-        <w:t xml:space="preserve">. If you are not both using </w:t>
-      </w:r>
-      <w:proofErr w:type="spellStart"/>
-      <w:r>
-        <w:rPr>
-          <w:color w:val="222222"/>
-        </w:rPr>
-        <w:t>MiFILE</w:t>
-      </w:r>
-      <w:proofErr w:type="spellEnd"/>
-      <w:r>
-        <w:rPr>
-          <w:color w:val="222222"/>
-        </w:rPr>
-        <w:t xml:space="preserve">, you will need to serve the documents by e-mail, if possible. If you or the other party can't do this, or if you are not sure, you can serve by regular mail or personal delivery. If you serve by mail, send the papers to the other party’s last known address. </w:t>
+        <w:t xml:space="preserve">If you used MiFILE to file documents electronically, MiFILE will also serve the documents electronically if the other party is using MiFILE. If you are not both using MiFILE, you will need to serve the documents by e-mail, if possible. If you or the other party can't do this, or if you are not sure, you can serve by regular mail or personal delivery. If you serve by mail, send the papers to the other party’s last known address. </w:t>
       </w:r>
     </w:p>
     <w:p>
@@ -3543,39 +3291,21 @@
           <w:color w:val="222222"/>
           <w:highlight w:val="white"/>
         </w:rPr>
-        <w:t xml:space="preserve">If you served the other party using </w:t>
-      </w:r>
-      <w:proofErr w:type="spellStart"/>
-      <w:r>
-        <w:rPr>
-          <w:color w:val="222222"/>
-          <w:highlight w:val="white"/>
-        </w:rPr>
-        <w:t>MiFILE</w:t>
-      </w:r>
-      <w:proofErr w:type="spellEnd"/>
-      <w:r>
-        <w:rPr>
-          <w:color w:val="222222"/>
-          <w:highlight w:val="white"/>
-        </w:rPr>
-        <w:t xml:space="preserve">, you will not need to file a Proof of Service. </w:t>
-      </w:r>
-      <w:proofErr w:type="spellStart"/>
-      <w:r>
-        <w:rPr>
-          <w:color w:val="222222"/>
-          <w:highlight w:val="white"/>
-        </w:rPr>
-        <w:t>MiFILE</w:t>
-      </w:r>
-      <w:proofErr w:type="spellEnd"/>
-      <w:r>
-        <w:rPr>
-          <w:color w:val="222222"/>
-          <w:highlight w:val="white"/>
-        </w:rPr>
-        <w:t xml:space="preserve"> will create and file a Proof of Service for you.</w:t>
+        <w:t xml:space="preserve">If you served </w:t>
+      </w:r>
+      <w:r>
+        <w:rPr>
+          <w:color w:val="222222"/>
+          <w:highlight w:val="white"/>
+        </w:rPr>
+        <w:t>your spouse</w:t>
+      </w:r>
+      <w:r>
+        <w:rPr>
+          <w:color w:val="222222"/>
+          <w:highlight w:val="white"/>
+        </w:rPr>
+        <w:t xml:space="preserve"> using MiFILE, you will not need to file a Proof of Service. MiFILE will create and file a Proof of Service for you.</w:t>
       </w:r>
     </w:p>
     <w:p>
@@ -3635,23 +3365,44 @@
         <w:rPr>
           <w:color w:val="222222"/>
         </w:rPr>
+        <w:t xml:space="preserve">{% if county_choice </w:t>
+      </w:r>
+      <w:r>
+        <w:rPr>
+          <w:color w:val="222222"/>
+        </w:rPr>
+        <w:t>!</w:t>
+      </w:r>
+      <w:r>
+        <w:rPr>
+          <w:color w:val="222222"/>
+        </w:rPr>
+        <w:t>= “Oakland” %}</w:t>
+      </w:r>
+      <w:r>
+        <w:rPr>
+          <w:color w:val="222222"/>
+        </w:rPr>
         <w:t xml:space="preserve">{% if </w:t>
       </w:r>
-      <w:proofErr w:type="spellStart"/>
-      <w:r>
-        <w:rPr>
-          <w:color w:val="222222"/>
-        </w:rPr>
-        <w:t>county_</w:t>
-      </w:r>
-      <w:proofErr w:type="gramStart"/>
-      <w:r>
-        <w:rPr>
-          <w:color w:val="222222"/>
-        </w:rPr>
-        <w:t>choice</w:t>
-      </w:r>
-      <w:proofErr w:type="spellEnd"/>
+      <w:r>
+        <w:rPr>
+          <w:color w:val="222222"/>
+        </w:rPr>
+        <w:t>(not create_counterclaim and there_are_marital_children) or (create_counterclaim and counterclaim_type == “</w:t>
+      </w:r>
+      <w:r>
+        <w:rPr>
+          <w:color w:val="222222"/>
+        </w:rPr>
+        <w:t>with</w:t>
+      </w:r>
+      <w:r>
+        <w:rPr>
+          <w:color w:val="222222"/>
+        </w:rPr>
+        <w:t>_children”) %}</w:t>
+      </w:r>
       <w:r>
         <w:rPr>
           <w:color w:val="222222"/>
@@ -3662,177 +3413,42 @@
         <w:rPr>
           <w:color w:val="222222"/>
         </w:rPr>
-        <w:t>!</w:t>
-      </w:r>
-      <w:proofErr w:type="gramEnd"/>
-      <w:r>
-        <w:rPr>
-          <w:color w:val="222222"/>
-        </w:rPr>
-        <w:t xml:space="preserve">= “Oakland” </w:t>
-      </w:r>
-      <w:proofErr w:type="gramStart"/>
-      <w:r>
-        <w:rPr>
-          <w:color w:val="222222"/>
-        </w:rPr>
-        <w:t>%}</w:t>
-      </w:r>
-      <w:r>
-        <w:rPr>
-          <w:color w:val="222222"/>
-        </w:rPr>
-        <w:t>{</w:t>
-      </w:r>
-      <w:proofErr w:type="gramEnd"/>
-      <w:r>
-        <w:rPr>
-          <w:color w:val="222222"/>
-        </w:rPr>
-        <w:t xml:space="preserve">% if </w:t>
-      </w:r>
-      <w:r>
-        <w:rPr>
-          <w:color w:val="222222"/>
-        </w:rPr>
-        <w:t xml:space="preserve">(not </w:t>
-      </w:r>
-      <w:proofErr w:type="spellStart"/>
-      <w:r>
-        <w:rPr>
-          <w:color w:val="222222"/>
-        </w:rPr>
-        <w:t>create_counterclaim</w:t>
-      </w:r>
-      <w:proofErr w:type="spellEnd"/>
-      <w:r>
-        <w:rPr>
-          <w:color w:val="222222"/>
-        </w:rPr>
-        <w:t xml:space="preserve"> and </w:t>
-      </w:r>
-      <w:proofErr w:type="spellStart"/>
-      <w:r>
-        <w:rPr>
-          <w:color w:val="222222"/>
-        </w:rPr>
-        <w:t>there_are_marital_children</w:t>
-      </w:r>
-      <w:proofErr w:type="spellEnd"/>
-      <w:r>
-        <w:rPr>
-          <w:color w:val="222222"/>
-        </w:rPr>
-        <w:t>) or (</w:t>
-      </w:r>
-      <w:proofErr w:type="spellStart"/>
-      <w:r>
-        <w:rPr>
-          <w:color w:val="222222"/>
-        </w:rPr>
-        <w:t>create_counterclaim</w:t>
-      </w:r>
-      <w:proofErr w:type="spellEnd"/>
-      <w:r>
-        <w:rPr>
-          <w:color w:val="222222"/>
-        </w:rPr>
-        <w:t xml:space="preserve"> and </w:t>
-      </w:r>
-      <w:proofErr w:type="spellStart"/>
-      <w:r>
-        <w:rPr>
-          <w:color w:val="222222"/>
-        </w:rPr>
-        <w:t>counterclaim_type</w:t>
-      </w:r>
-      <w:proofErr w:type="spellEnd"/>
-      <w:r>
-        <w:rPr>
-          <w:color w:val="222222"/>
-        </w:rPr>
-        <w:t xml:space="preserve"> == “</w:t>
-      </w:r>
-      <w:proofErr w:type="spellStart"/>
-      <w:r>
-        <w:rPr>
-          <w:color w:val="222222"/>
-        </w:rPr>
-        <w:t>with</w:t>
-      </w:r>
-      <w:r>
-        <w:rPr>
-          <w:color w:val="222222"/>
-        </w:rPr>
-        <w:t>_children</w:t>
-      </w:r>
-      <w:proofErr w:type="spellEnd"/>
-      <w:r>
-        <w:rPr>
-          <w:color w:val="222222"/>
-        </w:rPr>
-        <w:t>”) %}</w:t>
-      </w:r>
-      <w:r>
-        <w:rPr>
-          <w:color w:val="222222"/>
-        </w:rPr>
+        <w:t>If you are filing in person, also file an extra copy for the Friend of the Court</w:t>
+      </w:r>
+      <w:r>
         <w:t xml:space="preserve"> </w:t>
       </w:r>
       <w:r>
         <w:rPr>
           <w:color w:val="222222"/>
         </w:rPr>
-        <w:t>If you are filing in person, also file an extra copy for the Friend of the Court</w:t>
-      </w:r>
-      <w:r>
+        <w:t>if your court requires FOC copies</w:t>
+      </w:r>
+      <w:r>
+        <w:rPr>
+          <w:color w:val="222222"/>
+        </w:rPr>
+        <w:t>, and make a copy for your records.{% else %}</w:t>
+      </w:r>
+      <w:r>
+        <w:rPr>
+          <w:color w:val="222222"/>
+        </w:rPr>
         <w:t xml:space="preserve"> </w:t>
       </w:r>
       <w:r>
         <w:rPr>
           <w:color w:val="222222"/>
-        </w:rPr>
-        <w:t>if your court requires FOC copies</w:t>
-      </w:r>
-      <w:r>
-        <w:rPr>
-          <w:color w:val="222222"/>
-        </w:rPr>
-        <w:t xml:space="preserve">, and make a copy for your </w:t>
-      </w:r>
-      <w:proofErr w:type="gramStart"/>
-      <w:r>
-        <w:rPr>
-          <w:color w:val="222222"/>
-        </w:rPr>
-        <w:t>records.{</w:t>
-      </w:r>
-      <w:proofErr w:type="gramEnd"/>
-      <w:r>
-        <w:rPr>
-          <w:color w:val="222222"/>
-        </w:rPr>
-        <w:t>% else %}</w:t>
-      </w:r>
-      <w:r>
-        <w:rPr>
-          <w:color w:val="222222"/>
-        </w:rPr>
+          <w:highlight w:val="white"/>
+        </w:rPr>
+        <w:t>If you are filing in person,</w:t>
+      </w:r>
+      <w:r>
         <w:t xml:space="preserve"> </w:t>
       </w:r>
       <w:r>
         <w:rPr>
           <w:color w:val="222222"/>
-          <w:highlight w:val="white"/>
-        </w:rPr>
-        <w:t>If you are filing in person,</w:t>
-      </w:r>
-      <w:r>
-        <w:t xml:space="preserve"> </w:t>
-      </w:r>
-      <w:r>
-        <w:rPr>
-          <w:color w:val="222222"/>
         </w:rPr>
         <w:t xml:space="preserve">also file an extra copy for the Friend of the Court if you or your spouse requested spousal support </w:t>
       </w:r>
@@ -3870,30 +3486,14 @@
           <w:color w:val="222222"/>
           <w:highlight w:val="white"/>
         </w:rPr>
-        <w:t xml:space="preserve">{% endif </w:t>
-      </w:r>
-      <w:proofErr w:type="gramStart"/>
-      <w:r>
-        <w:rPr>
-          <w:color w:val="222222"/>
-          <w:highlight w:val="white"/>
-        </w:rPr>
-        <w:t>%}</w:t>
-      </w:r>
-      <w:r>
-        <w:rPr>
-          <w:color w:val="222222"/>
-          <w:highlight w:val="white"/>
-        </w:rPr>
-        <w:t>{</w:t>
-      </w:r>
-      <w:proofErr w:type="gramEnd"/>
-      <w:r>
-        <w:rPr>
-          <w:color w:val="222222"/>
-          <w:highlight w:val="white"/>
-        </w:rPr>
-        <w:t>% endif %}</w:t>
+        <w:t>{% endif %}</w:t>
+      </w:r>
+      <w:r>
+        <w:rPr>
+          <w:color w:val="222222"/>
+          <w:highlight w:val="white"/>
+        </w:rPr>
+        <w:t>{% endif %}</w:t>
       </w:r>
       <w:r>
         <w:rPr>
@@ -4007,7 +3607,6 @@
         <w:rPr>
           <w:color w:val="222222"/>
         </w:rPr>
-        <w:lastRenderedPageBreak/>
         <w:t xml:space="preserve">Either make a written agreement not to exchange the form, </w:t>
       </w:r>
       <w:r>
@@ -4160,6 +3759,7 @@
         <w:pStyle w:val="Heading4"/>
       </w:pPr>
       <w:r>
+        <w:lastRenderedPageBreak/>
         <w:t>Important!</w:t>
       </w:r>
     </w:p>
@@ -4210,21 +3810,7 @@
         <w:rPr>
           <w:color w:val="222222"/>
         </w:rPr>
-        <w:t xml:space="preserve"> agree otherwise or the court directs otherwise. If you leave out information, you must explain the reasons why in </w:t>
-      </w:r>
-      <w:proofErr w:type="gramStart"/>
-      <w:r>
-        <w:rPr>
-          <w:color w:val="222222"/>
-        </w:rPr>
-        <w:t>a sworn affidavit</w:t>
-      </w:r>
-      <w:proofErr w:type="gramEnd"/>
-      <w:r>
-        <w:rPr>
-          <w:color w:val="222222"/>
-        </w:rPr>
-        <w:t xml:space="preserve"> and file it with the court within 28 days after you serve the Answer.</w:t>
+        <w:t xml:space="preserve"> agree otherwise or the court directs otherwise. If you leave out information, you must explain the reasons why in a sworn affidavit and file it with the court within 28 days after you serve the Answer.</w:t>
       </w:r>
     </w:p>
     <w:p>
@@ -4361,47 +3947,19 @@
         <w:rPr>
           <w:color w:val="222222"/>
         </w:rPr>
-        <w:t xml:space="preserve"> after serving the form. If you served by e-mail, cross out “first-class mail” and write "e-mail." In the space for the other party's address, write the e-mail address </w:t>
-      </w:r>
-      <w:proofErr w:type="gramStart"/>
-      <w:r>
-        <w:rPr>
-          <w:color w:val="222222"/>
-        </w:rPr>
-        <w:t>instead.</w:t>
-      </w:r>
-      <w:r>
-        <w:rPr>
-          <w:color w:val="222222"/>
-        </w:rPr>
-        <w:t>{</w:t>
-      </w:r>
-      <w:proofErr w:type="gramEnd"/>
-      <w:r>
-        <w:rPr>
-          <w:color w:val="222222"/>
-        </w:rPr>
-        <w:t xml:space="preserve">% </w:t>
-      </w:r>
-      <w:r>
-        <w:rPr>
-          <w:color w:val="222222"/>
-        </w:rPr>
-        <w:t xml:space="preserve">if </w:t>
-      </w:r>
-      <w:proofErr w:type="spellStart"/>
-      <w:r>
-        <w:rPr>
-          <w:color w:val="222222"/>
-        </w:rPr>
-        <w:t>county_choice</w:t>
-      </w:r>
-      <w:proofErr w:type="spellEnd"/>
-      <w:r>
-        <w:rPr>
-          <w:color w:val="222222"/>
-        </w:rPr>
-        <w:t xml:space="preserve"> == “Oakland” %}</w:t>
+        <w:t xml:space="preserve"> after serving the form. If you served by e-mail, cross out “first-class mail” and write "e-mail." In the space for the other party's address, write the e-mail address instead.</w:t>
+      </w:r>
+      <w:r>
+        <w:rPr>
+          <w:color w:val="222222"/>
+        </w:rPr>
+        <w:t xml:space="preserve">{% </w:t>
+      </w:r>
+      <w:r>
+        <w:rPr>
+          <w:color w:val="222222"/>
+        </w:rPr>
+        <w:t>if county_choice == “Oakland” %}</w:t>
       </w:r>
       <w:r>
         <w:rPr>
@@ -4413,35 +3971,13 @@
         <w:rPr>
           <w:color w:val="222222"/>
         </w:rPr>
-        <w:t xml:space="preserve">File the Proof of Mailing in </w:t>
-      </w:r>
-      <w:proofErr w:type="spellStart"/>
-      <w:proofErr w:type="gramStart"/>
-      <w:r>
-        <w:rPr>
-          <w:color w:val="222222"/>
-        </w:rPr>
-        <w:t>MiFILE</w:t>
-      </w:r>
-      <w:proofErr w:type="spellEnd"/>
-      <w:r>
-        <w:rPr>
-          <w:color w:val="222222"/>
-        </w:rPr>
-        <w:t>.</w:t>
-      </w:r>
-      <w:r>
-        <w:rPr>
-          <w:color w:val="222222"/>
-        </w:rPr>
-        <w:t>{</w:t>
-      </w:r>
-      <w:proofErr w:type="gramEnd"/>
-      <w:r>
-        <w:rPr>
-          <w:color w:val="222222"/>
-        </w:rPr>
-        <w:t>% else %}</w:t>
+        <w:t>File the Proof of Mailing in MiFILE.</w:t>
+      </w:r>
+      <w:r>
+        <w:rPr>
+          <w:color w:val="222222"/>
+        </w:rPr>
+        <w:t>{% else %}</w:t>
       </w:r>
       <w:r>
         <w:rPr>
@@ -4453,27 +3989,13 @@
         <w:rPr>
           <w:color w:val="222222"/>
         </w:rPr>
-        <w:t xml:space="preserve">If you are filing in person at the court clerk's office, also file a copy of the Proof of Mailing for the Friend of the Court if your court requires FOC copies. Get a copy of the Proof of Mailing for your </w:t>
-      </w:r>
-      <w:proofErr w:type="gramStart"/>
-      <w:r>
-        <w:rPr>
-          <w:color w:val="222222"/>
-        </w:rPr>
-        <w:t>records.</w:t>
-      </w:r>
-      <w:r>
-        <w:rPr>
-          <w:color w:val="222222"/>
-        </w:rPr>
-        <w:t>{</w:t>
-      </w:r>
-      <w:proofErr w:type="gramEnd"/>
-      <w:r>
-        <w:rPr>
-          <w:color w:val="222222"/>
-        </w:rPr>
-        <w:t>% endif %}</w:t>
+        <w:t>If you are filing in person at the court clerk's office, also file a copy of the Proof of Mailing for the Friend of the Court if your court requires FOC copies. Get a copy of the Proof of Mailing for your records.</w:t>
+      </w:r>
+      <w:r>
+        <w:rPr>
+          <w:color w:val="222222"/>
+        </w:rPr>
+        <w:t>{% endif %}</w:t>
       </w:r>
     </w:p>
     <w:p>
@@ -4487,7 +4009,6 @@
         <w:rPr>
           <w:highlight w:val="white"/>
         </w:rPr>
-        <w:lastRenderedPageBreak/>
         <w:t>Next Steps</w:t>
       </w:r>
     </w:p>
@@ -4548,97 +4069,7 @@
           <w:bCs/>
           <w:color w:val="222222"/>
         </w:rPr>
-        <w:t xml:space="preserve">if (not </w:t>
-      </w:r>
-      <w:proofErr w:type="spellStart"/>
-      <w:r>
-        <w:rPr>
-          <w:b/>
-          <w:bCs/>
-          <w:color w:val="222222"/>
-        </w:rPr>
-        <w:t>create_counterclaim</w:t>
-      </w:r>
-      <w:proofErr w:type="spellEnd"/>
-      <w:r>
-        <w:rPr>
-          <w:b/>
-          <w:bCs/>
-          <w:color w:val="222222"/>
-        </w:rPr>
-        <w:t xml:space="preserve"> and </w:t>
-      </w:r>
-      <w:proofErr w:type="spellStart"/>
-      <w:r>
-        <w:rPr>
-          <w:b/>
-          <w:bCs/>
-          <w:color w:val="222222"/>
-        </w:rPr>
-        <w:t>there_are_marital_children</w:t>
-      </w:r>
-      <w:proofErr w:type="spellEnd"/>
-      <w:r>
-        <w:rPr>
-          <w:b/>
-          <w:bCs/>
-          <w:color w:val="222222"/>
-        </w:rPr>
-        <w:t>) or (</w:t>
-      </w:r>
-      <w:proofErr w:type="spellStart"/>
-      <w:r>
-        <w:rPr>
-          <w:b/>
-          <w:bCs/>
-          <w:color w:val="222222"/>
-        </w:rPr>
-        <w:t>create_counterclaim</w:t>
-      </w:r>
-      <w:proofErr w:type="spellEnd"/>
-      <w:r>
-        <w:rPr>
-          <w:b/>
-          <w:bCs/>
-          <w:color w:val="222222"/>
-        </w:rPr>
-        <w:t xml:space="preserve"> and </w:t>
-      </w:r>
-      <w:proofErr w:type="spellStart"/>
-      <w:r>
-        <w:rPr>
-          <w:b/>
-          <w:bCs/>
-          <w:color w:val="222222"/>
-        </w:rPr>
-        <w:t>counterclaim_type</w:t>
-      </w:r>
-      <w:proofErr w:type="spellEnd"/>
-      <w:r>
-        <w:rPr>
-          <w:b/>
-          <w:bCs/>
-          <w:color w:val="222222"/>
-        </w:rPr>
-        <w:t xml:space="preserve"> == “</w:t>
-      </w:r>
-      <w:proofErr w:type="spellStart"/>
-      <w:r>
-        <w:rPr>
-          <w:b/>
-          <w:bCs/>
-          <w:color w:val="222222"/>
-        </w:rPr>
-        <w:t>with_children</w:t>
-      </w:r>
-      <w:proofErr w:type="spellEnd"/>
-      <w:r>
-        <w:rPr>
-          <w:b/>
-          <w:bCs/>
-          <w:color w:val="222222"/>
-        </w:rPr>
-        <w:t>”)</w:t>
+        <w:t>if (not create_counterclaim and there_are_marital_children) or (create_counterclaim and counterclaim_type == “with_children”)</w:t>
       </w:r>
       <w:r>
         <w:rPr>
@@ -4766,7 +4197,7 @@
 </file>
 
 <file path=word/numbering.xml><?xml version="1.0" encoding="utf-8"?>
-<w:numbering xmlns:wpc="http://schemas.microsoft.com/office/word/2010/wordprocessingCanvas" xmlns:cx="http://schemas.microsoft.com/office/drawing/2014/chartex" xmlns:cx1="http://schemas.microsoft.com/office/drawing/2015/9/8/chartex" xmlns:cx2="http://schemas.microsoft.com/office/drawing/2015/10/21/chartex" xmlns:cx3="http://schemas.microsoft.com/office/drawing/2016/5/9/chartex" xmlns:cx4="http://schemas.microsoft.com/office/drawing/2016/5/10/chartex" xmlns:cx5="http://schemas.microsoft.com/office/drawing/2016/5/11/chartex" xmlns:cx6="http://schemas.microsoft.com/office/drawing/2016/5/12/chartex" xmlns:cx7="http://schemas.microsoft.com/office/drawing/2016/5/13/chartex" xmlns:cx8="http://schemas.microsoft.com/office/drawing/2016/5/14/chartex" xmlns:mc="http://schemas.openxmlformats.org/markup-compatibility/2006" xmlns:m="http://schemas.openxmlformats.org/officeDocument/2006/math" xmlns:aink="http://schemas.microsoft.com/office/drawing/2016/ink" xmlns:am3d="http://schemas.microsoft.com/office/drawing/2017/model3d" xmlns:oel="http://schemas.microsoft.com/office/2019/extlst" xmlns:r="http://schemas.openxmlformats.org/officeDocument/2006/relationships" xmlns:wp14="http://schemas.microsoft.com/office/word/2010/wordprocessingDrawing" xmlns:wp="http://schemas.openxmlformats.org/drawingml/2006/wordprocessingDrawing" xmlns:wpg="http://schemas.microsoft.com/office/word/2010/wordprocessingGroup" xmlns:wpi="http://schemas.microsoft.com/office/word/2010/wordprocessingInk" xmlns:wps="http://schemas.microsoft.com/office/word/2010/wordprocessingShape" xmlns:o="urn:schemas-microsoft-com:office:office" xmlns:v="urn:schemas-microsoft-com:vml" xmlns:w10="urn:schemas-microsoft-com:office:word" xmlns:w="http://schemas.openxmlformats.org/wordprocessingml/2006/main" xmlns:w14="http://schemas.microsoft.com/office/word/2010/wordml" xmlns:w15="http://schemas.microsoft.com/office/word/2012/wordml" xmlns:w16cei="http://schemas.microsoft.com/office/word/2026/wordml/cei" xmlns:w16cex="http://schemas.microsoft.com/office/word/2018/wordml/cex" xmlns:w16cid="http://schemas.microsoft.com/office/word/2016/wordml/cid" xmlns:w16="http://schemas.microsoft.com/office/word/2018/wordml" xmlns:w16sdtdh="http://schemas.microsoft.com/office/word/2020/wordml/sdtdatahash" xmlns:w16sdtfl="http://schemas.microsoft.com/office/word/2024/wordml/sdtformatlock" xmlns:w16se="http://schemas.microsoft.com/office/word/2015/wordml/symex" xmlns:w16du="http://schemas.microsoft.com/office/word/2023/wordml/word16du" xmlns:wne="http://schemas.microsoft.com/office/word/2006/wordml" mc:Ignorable="w14 w15 w16se w16cid w16 w16cex w16sdtdh w16sdtfl w16du wp14">
+<w:numbering xmlns:wpc="http://schemas.microsoft.com/office/word/2010/wordprocessingCanvas" xmlns:cx="http://schemas.microsoft.com/office/drawing/2014/chartex" xmlns:cx1="http://schemas.microsoft.com/office/drawing/2015/9/8/chartex" xmlns:cx2="http://schemas.microsoft.com/office/drawing/2015/10/21/chartex" xmlns:cx3="http://schemas.microsoft.com/office/drawing/2016/5/9/chartex" xmlns:cx4="http://schemas.microsoft.com/office/drawing/2016/5/10/chartex" xmlns:cx5="http://schemas.microsoft.com/office/drawing/2016/5/11/chartex" xmlns:cx6="http://schemas.microsoft.com/office/drawing/2016/5/12/chartex" xmlns:cx7="http://schemas.microsoft.com/office/drawing/2016/5/13/chartex" xmlns:cx8="http://schemas.microsoft.com/office/drawing/2016/5/14/chartex" xmlns:mc="http://schemas.openxmlformats.org/markup-compatibility/2006" xmlns:aink="http://schemas.microsoft.com/office/drawing/2016/ink" xmlns:am3d="http://schemas.microsoft.com/office/drawing/2017/model3d" xmlns:o="urn:schemas-microsoft-com:office:office" xmlns:oel="http://schemas.microsoft.com/office/2019/extlst" xmlns:r="http://schemas.openxmlformats.org/officeDocument/2006/relationships" xmlns:m="http://schemas.openxmlformats.org/officeDocument/2006/math" xmlns:v="urn:schemas-microsoft-com:vml" xmlns:wp14="http://schemas.microsoft.com/office/word/2010/wordprocessingDrawing" xmlns:wp="http://schemas.openxmlformats.org/drawingml/2006/wordprocessingDrawing" xmlns:w10="urn:schemas-microsoft-com:office:word" xmlns:w="http://schemas.openxmlformats.org/wordprocessingml/2006/main" xmlns:w14="http://schemas.microsoft.com/office/word/2010/wordml" xmlns:w15="http://schemas.microsoft.com/office/word/2012/wordml" xmlns:w16cex="http://schemas.microsoft.com/office/word/2018/wordml/cex" xmlns:w16cid="http://schemas.microsoft.com/office/word/2016/wordml/cid" xmlns:w16="http://schemas.microsoft.com/office/word/2018/wordml" xmlns:w16du="http://schemas.microsoft.com/office/word/2023/wordml/word16du" xmlns:w16sdtdh="http://schemas.microsoft.com/office/word/2020/wordml/sdtdatahash" xmlns:w16sdtfl="http://schemas.microsoft.com/office/word/2024/wordml/sdtformatlock" xmlns:w16se="http://schemas.microsoft.com/office/word/2015/wordml/symex" xmlns:wpg="http://schemas.microsoft.com/office/word/2010/wordprocessingGroup" xmlns:wpi="http://schemas.microsoft.com/office/word/2010/wordprocessingInk" xmlns:wne="http://schemas.microsoft.com/office/word/2006/wordml" xmlns:wps="http://schemas.microsoft.com/office/word/2010/wordprocessingShape" mc:Ignorable="w14 w15 w16se w16cid w16 w16cex w16sdtdh w16sdtfl w16du wp14">
   <w:abstractNum w:abstractNumId="0" w15:restartNumberingAfterBreak="0">
     <w:nsid w:val="0AFF7FFD"/>
     <w:multiLevelType w:val="multilevel"/>
@@ -5462,6 +4893,155 @@
     </w:lvl>
   </w:abstractNum>
   <w:abstractNum w:abstractNumId="6" w15:restartNumberingAfterBreak="0">
+    <w:nsid w:val="270236F0"/>
+    <w:multiLevelType w:val="multilevel"/>
+    <w:tmpl w:val="82963BAC"/>
+    <w:lvl w:ilvl="0">
+      <w:start w:val="1"/>
+      <w:numFmt w:val="bullet"/>
+      <w:lvlText w:val=""/>
+      <w:lvlJc w:val="left"/>
+      <w:pPr>
+        <w:tabs>
+          <w:tab w:val="num" w:pos="720"/>
+        </w:tabs>
+        <w:ind w:left="720" w:hanging="360"/>
+      </w:pPr>
+      <w:rPr>
+        <w:rFonts w:ascii="Symbol" w:hAnsi="Symbol" w:hint="default"/>
+        <w:sz w:val="20"/>
+      </w:rPr>
+    </w:lvl>
+    <w:lvl w:ilvl="1" w:tentative="1">
+      <w:start w:val="1"/>
+      <w:numFmt w:val="bullet"/>
+      <w:lvlText w:val="o"/>
+      <w:lvlJc w:val="left"/>
+      <w:pPr>
+        <w:tabs>
+          <w:tab w:val="num" w:pos="1440"/>
+        </w:tabs>
+        <w:ind w:left="1440" w:hanging="360"/>
+      </w:pPr>
+      <w:rPr>
+        <w:rFonts w:ascii="Courier New" w:hAnsi="Courier New" w:hint="default"/>
+        <w:sz w:val="20"/>
+      </w:rPr>
+    </w:lvl>
+    <w:lvl w:ilvl="2" w:tentative="1">
+      <w:start w:val="1"/>
+      <w:numFmt w:val="bullet"/>
+      <w:lvlText w:val=""/>
+      <w:lvlJc w:val="left"/>
+      <w:pPr>
+        <w:tabs>
+          <w:tab w:val="num" w:pos="2160"/>
+        </w:tabs>
+        <w:ind w:left="2160" w:hanging="360"/>
+      </w:pPr>
+      <w:rPr>
+        <w:rFonts w:ascii="Wingdings" w:hAnsi="Wingdings" w:hint="default"/>
+        <w:sz w:val="20"/>
+      </w:rPr>
+    </w:lvl>
+    <w:lvl w:ilvl="3" w:tentative="1">
+      <w:start w:val="1"/>
+      <w:numFmt w:val="bullet"/>
+      <w:lvlText w:val=""/>
+      <w:lvlJc w:val="left"/>
+      <w:pPr>
+        <w:tabs>
+          <w:tab w:val="num" w:pos="2880"/>
+        </w:tabs>
+        <w:ind w:left="2880" w:hanging="360"/>
+      </w:pPr>
+      <w:rPr>
+        <w:rFonts w:ascii="Wingdings" w:hAnsi="Wingdings" w:hint="default"/>
+        <w:sz w:val="20"/>
+      </w:rPr>
+    </w:lvl>
+    <w:lvl w:ilvl="4" w:tentative="1">
+      <w:start w:val="1"/>
+      <w:numFmt w:val="bullet"/>
+      <w:lvlText w:val=""/>
+      <w:lvlJc w:val="left"/>
+      <w:pPr>
+        <w:tabs>
+          <w:tab w:val="num" w:pos="3600"/>
+        </w:tabs>
+        <w:ind w:left="3600" w:hanging="360"/>
+      </w:pPr>
+      <w:rPr>
+        <w:rFonts w:ascii="Wingdings" w:hAnsi="Wingdings" w:hint="default"/>
+        <w:sz w:val="20"/>
+      </w:rPr>
+    </w:lvl>
+    <w:lvl w:ilvl="5" w:tentative="1">
+      <w:start w:val="1"/>
+      <w:numFmt w:val="bullet"/>
+      <w:lvlText w:val=""/>
+      <w:lvlJc w:val="left"/>
+      <w:pPr>
+        <w:tabs>
+          <w:tab w:val="num" w:pos="4320"/>
+        </w:tabs>
+        <w:ind w:left="4320" w:hanging="360"/>
+      </w:pPr>
+      <w:rPr>
+        <w:rFonts w:ascii="Wingdings" w:hAnsi="Wingdings" w:hint="default"/>
+        <w:sz w:val="20"/>
+      </w:rPr>
+    </w:lvl>
+    <w:lvl w:ilvl="6" w:tentative="1">
+      <w:start w:val="1"/>
+      <w:numFmt w:val="bullet"/>
+      <w:lvlText w:val=""/>
+      <w:lvlJc w:val="left"/>
+      <w:pPr>
+        <w:tabs>
+          <w:tab w:val="num" w:pos="5040"/>
+        </w:tabs>
+        <w:ind w:left="5040" w:hanging="360"/>
+      </w:pPr>
+      <w:rPr>
+        <w:rFonts w:ascii="Wingdings" w:hAnsi="Wingdings" w:hint="default"/>
+        <w:sz w:val="20"/>
+      </w:rPr>
+    </w:lvl>
+    <w:lvl w:ilvl="7" w:tentative="1">
+      <w:start w:val="1"/>
+      <w:numFmt w:val="bullet"/>
+      <w:lvlText w:val=""/>
+      <w:lvlJc w:val="left"/>
+      <w:pPr>
+        <w:tabs>
+          <w:tab w:val="num" w:pos="5760"/>
+        </w:tabs>
+        <w:ind w:left="5760" w:hanging="360"/>
+      </w:pPr>
+      <w:rPr>
+        <w:rFonts w:ascii="Wingdings" w:hAnsi="Wingdings" w:hint="default"/>
+        <w:sz w:val="20"/>
+      </w:rPr>
+    </w:lvl>
+    <w:lvl w:ilvl="8" w:tentative="1">
+      <w:start w:val="1"/>
+      <w:numFmt w:val="bullet"/>
+      <w:lvlText w:val=""/>
+      <w:lvlJc w:val="left"/>
+      <w:pPr>
+        <w:tabs>
+          <w:tab w:val="num" w:pos="6480"/>
+        </w:tabs>
+        <w:ind w:left="6480" w:hanging="360"/>
+      </w:pPr>
+      <w:rPr>
+        <w:rFonts w:ascii="Wingdings" w:hAnsi="Wingdings" w:hint="default"/>
+        <w:sz w:val="20"/>
+      </w:rPr>
+    </w:lvl>
+  </w:abstractNum>
+  <w:abstractNum w:abstractNumId="7" w15:restartNumberingAfterBreak="0">
     <w:nsid w:val="359A080A"/>
     <w:multiLevelType w:val="hybridMultilevel"/>
     <w:tmpl w:val="2DFA31E4"/>
@@ -5547,7 +5127,7 @@
       </w:pPr>
     </w:lvl>
   </w:abstractNum>
-  <w:abstractNum w:abstractNumId="7" w15:restartNumberingAfterBreak="0">
+  <w:abstractNum w:abstractNumId="8" w15:restartNumberingAfterBreak="0">
     <w:nsid w:val="421B4FB6"/>
     <w:multiLevelType w:val="multilevel"/>
     <w:tmpl w:val="7414A1F2"/>
@@ -5660,7 +5240,7 @@
       </w:rPr>
     </w:lvl>
   </w:abstractNum>
-  <w:abstractNum w:abstractNumId="8" w15:restartNumberingAfterBreak="0">
+  <w:abstractNum w:abstractNumId="9" w15:restartNumberingAfterBreak="0">
     <w:nsid w:val="48872381"/>
     <w:multiLevelType w:val="multilevel"/>
     <w:tmpl w:val="69E01C68"/>
@@ -5777,7 +5357,7 @@
       </w:rPr>
     </w:lvl>
   </w:abstractNum>
-  <w:abstractNum w:abstractNumId="9" w15:restartNumberingAfterBreak="0">
+  <w:abstractNum w:abstractNumId="10" w15:restartNumberingAfterBreak="0">
     <w:nsid w:val="53D84DDD"/>
     <w:multiLevelType w:val="multilevel"/>
     <w:tmpl w:val="A1D6F56C"/>
@@ -5894,7 +5474,7 @@
       </w:rPr>
     </w:lvl>
   </w:abstractNum>
-  <w:abstractNum w:abstractNumId="10" w15:restartNumberingAfterBreak="0">
+  <w:abstractNum w:abstractNumId="11" w15:restartNumberingAfterBreak="0">
     <w:nsid w:val="53F22C91"/>
     <w:multiLevelType w:val="multilevel"/>
     <w:tmpl w:val="C896CB08"/>
@@ -6011,7 +5591,7 @@
       </w:rPr>
     </w:lvl>
   </w:abstractNum>
-  <w:abstractNum w:abstractNumId="11" w15:restartNumberingAfterBreak="0">
+  <w:abstractNum w:abstractNumId="12" w15:restartNumberingAfterBreak="0">
     <w:nsid w:val="59B12275"/>
     <w:multiLevelType w:val="multilevel"/>
     <w:tmpl w:val="5460449C"/>
@@ -6128,7 +5708,7 @@
       </w:rPr>
     </w:lvl>
   </w:abstractNum>
-  <w:abstractNum w:abstractNumId="12" w15:restartNumberingAfterBreak="0">
+  <w:abstractNum w:abstractNumId="13" w15:restartNumberingAfterBreak="0">
     <w:nsid w:val="5AA817D6"/>
     <w:multiLevelType w:val="multilevel"/>
     <w:tmpl w:val="230031BE"/>
@@ -6241,7 +5821,7 @@
       </w:rPr>
     </w:lvl>
   </w:abstractNum>
-  <w:abstractNum w:abstractNumId="13" w15:restartNumberingAfterBreak="0">
+  <w:abstractNum w:abstractNumId="14" w15:restartNumberingAfterBreak="0">
     <w:nsid w:val="5C8102D1"/>
     <w:multiLevelType w:val="multilevel"/>
     <w:tmpl w:val="74C04A40"/>
@@ -6358,7 +5938,7 @@
       </w:rPr>
     </w:lvl>
   </w:abstractNum>
-  <w:abstractNum w:abstractNumId="14" w15:restartNumberingAfterBreak="0">
+  <w:abstractNum w:abstractNumId="15" w15:restartNumberingAfterBreak="0">
     <w:nsid w:val="6161137C"/>
     <w:multiLevelType w:val="multilevel"/>
     <w:tmpl w:val="703E5416"/>
@@ -6475,7 +6055,7 @@
       </w:rPr>
     </w:lvl>
   </w:abstractNum>
-  <w:abstractNum w:abstractNumId="15" w15:restartNumberingAfterBreak="0">
+  <w:abstractNum w:abstractNumId="16" w15:restartNumberingAfterBreak="0">
     <w:nsid w:val="64A26D48"/>
     <w:multiLevelType w:val="multilevel"/>
     <w:tmpl w:val="5B86A962"/>
@@ -6589,7 +6169,7 @@
       </w:pPr>
     </w:lvl>
   </w:abstractNum>
-  <w:abstractNum w:abstractNumId="16" w15:restartNumberingAfterBreak="0">
+  <w:abstractNum w:abstractNumId="17" w15:restartNumberingAfterBreak="0">
     <w:nsid w:val="702F073F"/>
     <w:multiLevelType w:val="multilevel"/>
     <w:tmpl w:val="54FA4B30"/>
@@ -6706,7 +6286,7 @@
       </w:rPr>
     </w:lvl>
   </w:abstractNum>
-  <w:abstractNum w:abstractNumId="17" w15:restartNumberingAfterBreak="0">
+  <w:abstractNum w:abstractNumId="18" w15:restartNumberingAfterBreak="0">
     <w:nsid w:val="747921F0"/>
     <w:multiLevelType w:val="hybridMultilevel"/>
     <w:tmpl w:val="356A9B0A"/>
@@ -6819,7 +6399,7 @@
       </w:rPr>
     </w:lvl>
   </w:abstractNum>
-  <w:abstractNum w:abstractNumId="18" w15:restartNumberingAfterBreak="0">
+  <w:abstractNum w:abstractNumId="19" w15:restartNumberingAfterBreak="0">
     <w:nsid w:val="76613687"/>
     <w:multiLevelType w:val="multilevel"/>
     <w:tmpl w:val="495CAFFC"/>
@@ -6932,7 +6512,7 @@
       </w:rPr>
     </w:lvl>
   </w:abstractNum>
-  <w:abstractNum w:abstractNumId="19" w15:restartNumberingAfterBreak="0">
+  <w:abstractNum w:abstractNumId="20" w15:restartNumberingAfterBreak="0">
     <w:nsid w:val="7DB2746F"/>
     <w:multiLevelType w:val="multilevel"/>
     <w:tmpl w:val="3244D3EC"/>
@@ -7049,7 +6629,7 @@
       </w:rPr>
     </w:lvl>
   </w:abstractNum>
-  <w:abstractNum w:abstractNumId="20" w15:restartNumberingAfterBreak="0">
+  <w:abstractNum w:abstractNumId="21" w15:restartNumberingAfterBreak="0">
     <w:nsid w:val="7EDE56B8"/>
     <w:multiLevelType w:val="multilevel"/>
     <w:tmpl w:val="224AD326"/>
@@ -7166,13 +6746,13 @@
     </w:lvl>
   </w:abstractNum>
   <w:num w:numId="1" w16cid:durableId="1232426564">
-    <w:abstractNumId w:val="16"/>
+    <w:abstractNumId w:val="17"/>
   </w:num>
   <w:num w:numId="2" w16cid:durableId="1733842976">
-    <w:abstractNumId w:val="18"/>
+    <w:abstractNumId w:val="19"/>
   </w:num>
   <w:num w:numId="3" w16cid:durableId="2128773024">
-    <w:abstractNumId w:val="14"/>
+    <w:abstractNumId w:val="15"/>
   </w:num>
   <w:num w:numId="4" w16cid:durableId="1390416869">
     <w:abstractNumId w:val="5"/>
@@ -7184,61 +6764,64 @@
     <w:abstractNumId w:val="3"/>
   </w:num>
   <w:num w:numId="7" w16cid:durableId="1051684722">
-    <w:abstractNumId w:val="8"/>
+    <w:abstractNumId w:val="9"/>
   </w:num>
   <w:num w:numId="8" w16cid:durableId="1333988527">
-    <w:abstractNumId w:val="15"/>
+    <w:abstractNumId w:val="16"/>
   </w:num>
   <w:num w:numId="9" w16cid:durableId="24841008">
-    <w:abstractNumId w:val="10"/>
+    <w:abstractNumId w:val="11"/>
   </w:num>
   <w:num w:numId="10" w16cid:durableId="1929189892">
-    <w:abstractNumId w:val="11"/>
+    <w:abstractNumId w:val="12"/>
   </w:num>
   <w:num w:numId="11" w16cid:durableId="799768014">
     <w:abstractNumId w:val="4"/>
   </w:num>
   <w:num w:numId="12" w16cid:durableId="1719893490">
-    <w:abstractNumId w:val="9"/>
+    <w:abstractNumId w:val="10"/>
   </w:num>
   <w:num w:numId="13" w16cid:durableId="262495449">
+    <w:abstractNumId w:val="14"/>
+  </w:num>
+  <w:num w:numId="14" w16cid:durableId="2122844160">
     <w:abstractNumId w:val="13"/>
   </w:num>
-  <w:num w:numId="14" w16cid:durableId="2122844160">
-    <w:abstractNumId w:val="12"/>
-  </w:num>
   <w:num w:numId="15" w16cid:durableId="1863132434">
-    <w:abstractNumId w:val="7"/>
+    <w:abstractNumId w:val="8"/>
   </w:num>
   <w:num w:numId="16" w16cid:durableId="1049914764">
-    <w:abstractNumId w:val="19"/>
+    <w:abstractNumId w:val="20"/>
   </w:num>
   <w:num w:numId="17" w16cid:durableId="686293822">
-    <w:abstractNumId w:val="20"/>
+    <w:abstractNumId w:val="21"/>
   </w:num>
   <w:num w:numId="18" w16cid:durableId="1612855675">
-    <w:abstractNumId w:val="17"/>
+    <w:abstractNumId w:val="18"/>
   </w:num>
   <w:num w:numId="19" w16cid:durableId="1300258745">
     <w:abstractNumId w:val="1"/>
   </w:num>
   <w:num w:numId="20" w16cid:durableId="726687076">
-    <w:abstractNumId w:val="15"/>
+    <w:abstractNumId w:val="16"/>
   </w:num>
   <w:num w:numId="21" w16cid:durableId="546572974">
-    <w:abstractNumId w:val="15"/>
+    <w:abstractNumId w:val="16"/>
   </w:num>
   <w:num w:numId="22" w16cid:durableId="99224620">
-    <w:abstractNumId w:val="6"/>
+    <w:abstractNumId w:val="7"/>
   </w:num>
   <w:num w:numId="23" w16cid:durableId="958341102">
     <w:abstractNumId w:val="2"/>
+  </w:num>
+  <w:num w:numId="24" w16cid:durableId="1203903492">
+    <w:abstractNumId w:val="6"/>
   </w:num>
 </w:numbering>
 </file>
 
 <file path=word/styles.xml><?xml version="1.0" encoding="utf-8"?>
-<w:styles xmlns:mc="http://schemas.openxmlformats.org/markup-compatibility/2006" xmlns:r="http://schemas.openxmlformats.org/officeDocument/2006/relationships" xmlns:w="http://schemas.openxmlformats.org/wordprocessingml/2006/main" xmlns:w14="http://schemas.microsoft.com/office/word/2010/wordml" xmlns:w15="http://schemas.microsoft.com/office/word/2012/wordml" xmlns:w16cex="http://schemas.microsoft.com/office/word/2018/wordml/cex" xmlns:w16cid="http://schemas.microsoft.com/office/word/2016/wordml/cid" xmlns:w16="http://schemas.microsoft.com/office/word/2018/wordml" xmlns:w16sdtdh="http://schemas.microsoft.com/office/word/2020/wordml/sdtdatahash" xmlns:w16sdtfl="http://schemas.microsoft.com/office/word/2024/wordml/sdtformatlock" xmlns:w16se="http://schemas.microsoft.com/office/word/2015/wordml/symex" xmlns:w16du="http://schemas.microsoft.com/office/word/2023/wordml/word16du" mc:Ignorable="w14 w15 w16se w16cid w16 w16cex w16sdtdh w16sdtfl w16du">
+<w:styles xmlns:mc="http://schemas.openxmlformats.org/markup-compatibility/2006" xmlns:r="http://schemas.openxmlformats.org/officeDocument/2006/relationships" xmlns:w="http://schemas.openxmlformats.org/wordprocessingml/2006/main" xmlns:w14="http://schemas.microsoft.com/office/word/2010/wordml" xmlns:w15="http://schemas.microsoft.com/office/word/2012/wordml" xmlns:w16cex="http://schemas.microsoft.com/office/word/2018/wordml/cex" xmlns:w16cid="http://schemas.microsoft.com/office/word/2016/wordml/cid" xmlns:w16="http://schemas.microsoft.com/office/word/2018/wordml" xmlns:w16du="http://schemas.microsoft.com/office/word/2023/wordml/word16du" xmlns:w16sdtdh="http://schemas.microsoft.com/office/word/2020/wordml/sdtdatahash" xmlns:w16sdtfl="http://schemas.microsoft.com/office/word/2024/wordml/sdtformatlock" xmlns:w16se="http://schemas.microsoft.com/office/word/2015/wordml/symex" mc:Ignorable="w14 w15 w16se w16cid w16 w16cex w16sdtdh w16sdtfl w16du">
   <w:docDefaults>
     <w:rPrDefault>
       <w:rPr>

</xml_diff>

<commit_message>
fix some template issues
</commit_message>
<xml_diff>
--- a/docassemble/MLHDivorceAndCustody/data/templates/instructions_divorce_answer.docx
+++ b/docassemble/MLHDivorceAndCustody/data/templates/instructions_divorce_answer.docx
@@ -13,16 +13,96 @@
         <w:t xml:space="preserve"> Answer and Counterclaim to a Complaint for Divorce </w:t>
       </w:r>
       <w:r>
-        <w:t>{% if (not create_counterclaim and there_are_marital_children) or (create_counterclaim and counterclaim_type == “with_children”) %}</w:t>
-      </w:r>
-      <w:r>
-        <w:t xml:space="preserve">with{% else %}without{% endif %} </w:t>
+        <w:t xml:space="preserve">{% if (not </w:t>
+      </w:r>
+      <w:proofErr w:type="spellStart"/>
+      <w:r>
+        <w:t>create_counterclaim</w:t>
+      </w:r>
+      <w:proofErr w:type="spellEnd"/>
+      <w:r>
+        <w:t xml:space="preserve"> and </w:t>
+      </w:r>
+      <w:proofErr w:type="spellStart"/>
+      <w:r>
+        <w:t>there_are_marital_children</w:t>
+      </w:r>
+      <w:proofErr w:type="spellEnd"/>
+      <w:r>
+        <w:t>) or (</w:t>
+      </w:r>
+      <w:proofErr w:type="spellStart"/>
+      <w:r>
+        <w:t>create_counterclaim</w:t>
+      </w:r>
+      <w:proofErr w:type="spellEnd"/>
+      <w:r>
+        <w:t xml:space="preserve"> and </w:t>
+      </w:r>
+      <w:proofErr w:type="spellStart"/>
+      <w:r>
+        <w:t>counterclaim_type</w:t>
+      </w:r>
+      <w:proofErr w:type="spellEnd"/>
+      <w:r>
+        <w:t xml:space="preserve"> == “</w:t>
+      </w:r>
+      <w:proofErr w:type="spellStart"/>
+      <w:r>
+        <w:t>with_children</w:t>
+      </w:r>
+      <w:proofErr w:type="spellEnd"/>
+      <w:r>
+        <w:t xml:space="preserve">”) </w:t>
+      </w:r>
+      <w:proofErr w:type="gramStart"/>
+      <w:r>
+        <w:t>%}</w:t>
+      </w:r>
+      <w:r>
+        <w:t>with</w:t>
+      </w:r>
+      <w:proofErr w:type="gramEnd"/>
+      <w:r>
+        <w:t xml:space="preserve">{% else </w:t>
+      </w:r>
+      <w:proofErr w:type="gramStart"/>
+      <w:r>
+        <w:t>%}without</w:t>
+      </w:r>
+      <w:proofErr w:type="gramEnd"/>
+      <w:r>
+        <w:t xml:space="preserve">{% endif %} </w:t>
       </w:r>
       <w:r>
         <w:t>Children</w:t>
       </w:r>
       <w:r>
-        <w:t xml:space="preserve"> {% if county_choice == “Oakland” %}(Oakland County){% endif %}</w:t>
+        <w:t xml:space="preserve"> {% if </w:t>
+      </w:r>
+      <w:proofErr w:type="spellStart"/>
+      <w:r>
+        <w:t>county_choice</w:t>
+      </w:r>
+      <w:proofErr w:type="spellEnd"/>
+      <w:r>
+        <w:t xml:space="preserve"> == “Oakland” </w:t>
+      </w:r>
+      <w:proofErr w:type="gramStart"/>
+      <w:r>
+        <w:t>%}(</w:t>
+      </w:r>
+      <w:proofErr w:type="gramEnd"/>
+      <w:r>
+        <w:t xml:space="preserve">Oakland </w:t>
+      </w:r>
+      <w:proofErr w:type="gramStart"/>
+      <w:r>
+        <w:t>County){</w:t>
+      </w:r>
+      <w:proofErr w:type="gramEnd"/>
+      <w:r>
+        <w:t>% endif %}</w:t>
       </w:r>
     </w:p>
     <w:p>
@@ -60,7 +140,97 @@
           <w:bCs/>
           <w:color w:val="222222"/>
         </w:rPr>
-        <w:t>if (not create_counterclaim and there_are_marital_children) or (create_counterclaim and counterclaim_type == “with_children”)</w:t>
+        <w:t xml:space="preserve">if (not </w:t>
+      </w:r>
+      <w:proofErr w:type="spellStart"/>
+      <w:r>
+        <w:rPr>
+          <w:b/>
+          <w:bCs/>
+          <w:color w:val="222222"/>
+        </w:rPr>
+        <w:t>create_counterclaim</w:t>
+      </w:r>
+      <w:proofErr w:type="spellEnd"/>
+      <w:r>
+        <w:rPr>
+          <w:b/>
+          <w:bCs/>
+          <w:color w:val="222222"/>
+        </w:rPr>
+        <w:t xml:space="preserve"> and </w:t>
+      </w:r>
+      <w:proofErr w:type="spellStart"/>
+      <w:r>
+        <w:rPr>
+          <w:b/>
+          <w:bCs/>
+          <w:color w:val="222222"/>
+        </w:rPr>
+        <w:t>there_are_marital_children</w:t>
+      </w:r>
+      <w:proofErr w:type="spellEnd"/>
+      <w:r>
+        <w:rPr>
+          <w:b/>
+          <w:bCs/>
+          <w:color w:val="222222"/>
+        </w:rPr>
+        <w:t>) or (</w:t>
+      </w:r>
+      <w:proofErr w:type="spellStart"/>
+      <w:r>
+        <w:rPr>
+          <w:b/>
+          <w:bCs/>
+          <w:color w:val="222222"/>
+        </w:rPr>
+        <w:t>create_counterclaim</w:t>
+      </w:r>
+      <w:proofErr w:type="spellEnd"/>
+      <w:r>
+        <w:rPr>
+          <w:b/>
+          <w:bCs/>
+          <w:color w:val="222222"/>
+        </w:rPr>
+        <w:t xml:space="preserve"> and </w:t>
+      </w:r>
+      <w:proofErr w:type="spellStart"/>
+      <w:r>
+        <w:rPr>
+          <w:b/>
+          <w:bCs/>
+          <w:color w:val="222222"/>
+        </w:rPr>
+        <w:t>counterclaim_type</w:t>
+      </w:r>
+      <w:proofErr w:type="spellEnd"/>
+      <w:r>
+        <w:rPr>
+          <w:b/>
+          <w:bCs/>
+          <w:color w:val="222222"/>
+        </w:rPr>
+        <w:t xml:space="preserve"> == “</w:t>
+      </w:r>
+      <w:proofErr w:type="spellStart"/>
+      <w:r>
+        <w:rPr>
+          <w:b/>
+          <w:bCs/>
+          <w:color w:val="222222"/>
+        </w:rPr>
+        <w:t>with_children</w:t>
+      </w:r>
+      <w:proofErr w:type="spellEnd"/>
+      <w:r>
+        <w:rPr>
+          <w:b/>
+          <w:bCs/>
+          <w:color w:val="222222"/>
+        </w:rPr>
+        <w:t>”)</w:t>
       </w:r>
       <w:r>
         <w:rPr>
@@ -229,7 +399,28 @@
         <w:rPr>
           <w:color w:val="222222"/>
         </w:rPr>
-        <w:t xml:space="preserve">if county_choice </w:t>
+        <w:t xml:space="preserve">if </w:t>
+      </w:r>
+      <w:proofErr w:type="spellStart"/>
+      <w:r>
+        <w:rPr>
+          <w:color w:val="222222"/>
+        </w:rPr>
+        <w:t>county_</w:t>
+      </w:r>
+      <w:proofErr w:type="gramStart"/>
+      <w:r>
+        <w:rPr>
+          <w:color w:val="222222"/>
+        </w:rPr>
+        <w:t>choice</w:t>
+      </w:r>
+      <w:proofErr w:type="spellEnd"/>
+      <w:r>
+        <w:rPr>
+          <w:color w:val="222222"/>
+        </w:rPr>
+        <w:t xml:space="preserve"> </w:t>
       </w:r>
       <w:r>
         <w:rPr>
@@ -237,6 +428,7 @@
         </w:rPr>
         <w:t>!</w:t>
       </w:r>
+      <w:proofErr w:type="gramEnd"/>
       <w:r>
         <w:rPr>
           <w:color w:val="222222"/>
@@ -297,8 +489,16 @@
         <w:rPr>
           <w:color w:val="222222"/>
         </w:rPr>
-        <w:t>{%p endif %}</w:t>
-      </w:r>
+        <w:t xml:space="preserve">{%p </w:t>
+      </w:r>
+      <w:proofErr w:type="gramStart"/>
+      <w:r>
+        <w:rPr>
+          <w:color w:val="222222"/>
+        </w:rPr>
+        <w:t>endif %}</w:t>
+      </w:r>
+      <w:proofErr w:type="gramEnd"/>
     </w:p>
     <w:p>
       <w:pPr>
@@ -342,13 +542,55 @@
         <w:rPr>
           <w:color w:val="222222"/>
         </w:rPr>
-        <w:t>You will not file all of these forms at the beginning of your case; some you will use later.</w:t>
-      </w:r>
-      <w:r>
-        <w:rPr>
-          <w:color w:val="222222"/>
-        </w:rPr>
-        <w:t xml:space="preserve">{% if county_choice </w:t>
+        <w:t xml:space="preserve">You will not file </w:t>
+      </w:r>
+      <w:proofErr w:type="gramStart"/>
+      <w:r>
+        <w:rPr>
+          <w:color w:val="222222"/>
+        </w:rPr>
+        <w:t>all of</w:t>
+      </w:r>
+      <w:proofErr w:type="gramEnd"/>
+      <w:r>
+        <w:rPr>
+          <w:color w:val="222222"/>
+        </w:rPr>
+        <w:t xml:space="preserve"> these forms at the beginning of your case; some you will use </w:t>
+      </w:r>
+      <w:proofErr w:type="gramStart"/>
+      <w:r>
+        <w:rPr>
+          <w:color w:val="222222"/>
+        </w:rPr>
+        <w:t>later.</w:t>
+      </w:r>
+      <w:r>
+        <w:rPr>
+          <w:color w:val="222222"/>
+        </w:rPr>
+        <w:t>{</w:t>
+      </w:r>
+      <w:proofErr w:type="gramEnd"/>
+      <w:r>
+        <w:rPr>
+          <w:color w:val="222222"/>
+        </w:rPr>
+        <w:t xml:space="preserve">% if </w:t>
+      </w:r>
+      <w:proofErr w:type="spellStart"/>
+      <w:r>
+        <w:rPr>
+          <w:color w:val="222222"/>
+        </w:rPr>
+        <w:t>county_choice</w:t>
+      </w:r>
+      <w:proofErr w:type="spellEnd"/>
+      <w:r>
+        <w:rPr>
+          <w:color w:val="222222"/>
+        </w:rPr>
+        <w:t xml:space="preserve"> </w:t>
       </w:r>
       <w:r>
         <w:rPr>
@@ -381,14 +623,36 @@
         <w:rPr>
           <w:color w:val="222222"/>
         </w:rPr>
-        <w:t>You will need to make copies of some of the forms. The instructions below explain which forms you need for each step and how many copies to make.</w:t>
-      </w:r>
-      <w:r>
-        <w:rPr>
-          <w:color w:val="222222"/>
-        </w:rPr>
-        <w:t>{% endif %}</w:t>
-      </w:r>
+        <w:t xml:space="preserve">You will need to make copies of some of the forms. The instructions below explain which forms you need for each step and how many copies to </w:t>
+      </w:r>
+      <w:proofErr w:type="gramStart"/>
+      <w:r>
+        <w:rPr>
+          <w:color w:val="222222"/>
+        </w:rPr>
+        <w:t>make.</w:t>
+      </w:r>
+      <w:r>
+        <w:rPr>
+          <w:color w:val="222222"/>
+        </w:rPr>
+        <w:t>{</w:t>
+      </w:r>
+      <w:proofErr w:type="gramEnd"/>
+      <w:r>
+        <w:rPr>
+          <w:color w:val="222222"/>
+        </w:rPr>
+        <w:t xml:space="preserve">% </w:t>
+      </w:r>
+      <w:proofErr w:type="gramStart"/>
+      <w:r>
+        <w:rPr>
+          <w:color w:val="222222"/>
+        </w:rPr>
+        <w:t>endif %}</w:t>
+      </w:r>
+      <w:proofErr w:type="gramEnd"/>
     </w:p>
     <w:p>
       <w:pPr>
@@ -403,11 +667,19 @@
         </w:rPr>
         <w:t xml:space="preserve">{%p if </w:t>
       </w:r>
-      <w:r>
-        <w:rPr>
-          <w:color w:val="222222"/>
-        </w:rPr>
-        <w:t xml:space="preserve">county_choice </w:t>
+      <w:proofErr w:type="spellStart"/>
+      <w:r>
+        <w:rPr>
+          <w:color w:val="222222"/>
+        </w:rPr>
+        <w:t>county_choice</w:t>
+      </w:r>
+      <w:proofErr w:type="spellEnd"/>
+      <w:r>
+        <w:rPr>
+          <w:color w:val="222222"/>
+        </w:rPr>
+        <w:t xml:space="preserve"> </w:t>
       </w:r>
       <w:r>
         <w:rPr>
@@ -436,11 +708,19 @@
         <w:t xml:space="preserve">In Oakland County, you will e-file your forms on the </w:t>
       </w:r>
       <w:hyperlink r:id="rId8" w:history="1">
+        <w:proofErr w:type="spellStart"/>
         <w:r>
           <w:rPr>
             <w:rStyle w:val="Hyperlink"/>
           </w:rPr>
-          <w:t>MiFILE website</w:t>
+          <w:t>MiFILE</w:t>
+        </w:r>
+        <w:proofErr w:type="spellEnd"/>
+        <w:r>
+          <w:rPr>
+            <w:rStyle w:val="Hyperlink"/>
+          </w:rPr>
+          <w:t xml:space="preserve"> website</w:t>
         </w:r>
       </w:hyperlink>
       <w:r>
@@ -461,8 +741,16 @@
         <w:rPr>
           <w:color w:val="222222"/>
         </w:rPr>
-        <w:t>{%p else %}</w:t>
-      </w:r>
+        <w:t xml:space="preserve">{%p </w:t>
+      </w:r>
+      <w:proofErr w:type="gramStart"/>
+      <w:r>
+        <w:rPr>
+          <w:color w:val="222222"/>
+        </w:rPr>
+        <w:t>else %}</w:t>
+      </w:r>
+      <w:proofErr w:type="gramEnd"/>
     </w:p>
     <w:p>
       <w:pPr>
@@ -477,7 +765,23 @@
           <w:color w:val="222222"/>
           <w:highlight w:val="white"/>
         </w:rPr>
-        <w:t xml:space="preserve">Some of the other steps may have slightly different information for you depending on how you will file with the court. Each court decides how it will accept documents for filing. Contact your court to find out which methods are available. Depending on your court, you may be able to file by:  </w:t>
+        <w:t xml:space="preserve">Some of the other steps may have slightly different information for you depending on how you </w:t>
+      </w:r>
+      <w:proofErr w:type="gramStart"/>
+      <w:r>
+        <w:rPr>
+          <w:color w:val="222222"/>
+          <w:highlight w:val="white"/>
+        </w:rPr>
+        <w:t>will file</w:t>
+      </w:r>
+      <w:proofErr w:type="gramEnd"/>
+      <w:r>
+        <w:rPr>
+          <w:color w:val="222222"/>
+          <w:highlight w:val="white"/>
+        </w:rPr>
+        <w:t xml:space="preserve"> with the court. Each court decides how it will accept documents for filing. Contact your court to find out which methods are available. Depending on your court, you may be able to file by:  </w:t>
       </w:r>
     </w:p>
     <w:p>
@@ -534,8 +838,17 @@
           <w:color w:val="222222"/>
           <w:highlight w:val="white"/>
         </w:rPr>
-        <w:t>E-filing using MiFILE</w:t>
-      </w:r>
+        <w:t xml:space="preserve">E-filing using </w:t>
+      </w:r>
+      <w:proofErr w:type="spellStart"/>
+      <w:r>
+        <w:rPr>
+          <w:color w:val="222222"/>
+          <w:highlight w:val="white"/>
+        </w:rPr>
+        <w:t>MiFILE</w:t>
+      </w:r>
+      <w:proofErr w:type="spellEnd"/>
     </w:p>
     <w:p>
       <w:pPr>
@@ -597,6 +910,7 @@
         </w:rPr>
       </w:pPr>
       <w:hyperlink r:id="rId10">
+        <w:proofErr w:type="spellStart"/>
         <w:r>
           <w:rPr>
             <w:color w:val="1155CC"/>
@@ -605,13 +919,30 @@
           </w:rPr>
           <w:t>MiFILE</w:t>
         </w:r>
+        <w:proofErr w:type="spellEnd"/>
       </w:hyperlink>
       <w:r>
         <w:rPr>
           <w:color w:val="222222"/>
           <w:highlight w:val="white"/>
         </w:rPr>
-        <w:t xml:space="preserve"> is only available for some courts. Even in courts where it is available, you can only use it for some case types. </w:t>
+        <w:t xml:space="preserve"> is only available for </w:t>
+      </w:r>
+      <w:proofErr w:type="gramStart"/>
+      <w:r>
+        <w:rPr>
+          <w:color w:val="222222"/>
+          <w:highlight w:val="white"/>
+        </w:rPr>
+        <w:t>some courts</w:t>
+      </w:r>
+      <w:proofErr w:type="gramEnd"/>
+      <w:r>
+        <w:rPr>
+          <w:color w:val="222222"/>
+          <w:highlight w:val="white"/>
+        </w:rPr>
+        <w:t xml:space="preserve">. Even in courts where it is available, you can only use it for some case types. </w:t>
       </w:r>
       <w:r>
         <w:rPr>
@@ -645,8 +976,16 @@
         <w:rPr>
           <w:color w:val="222222"/>
         </w:rPr>
-        <w:t>{%p endif %}</w:t>
-      </w:r>
+        <w:t xml:space="preserve">{%p </w:t>
+      </w:r>
+      <w:proofErr w:type="gramStart"/>
+      <w:r>
+        <w:rPr>
+          <w:color w:val="222222"/>
+        </w:rPr>
+        <w:t>endif %}</w:t>
+      </w:r>
+      <w:proofErr w:type="gramEnd"/>
     </w:p>
     <w:p>
       <w:pPr>
@@ -899,7 +1238,21 @@
         <w:rPr>
           <w:color w:val="222222"/>
         </w:rPr>
-        <w:t xml:space="preserve">not create_counterclaim </w:t>
+        <w:t xml:space="preserve">not </w:t>
+      </w:r>
+      <w:proofErr w:type="spellStart"/>
+      <w:r>
+        <w:rPr>
+          <w:color w:val="222222"/>
+        </w:rPr>
+        <w:t>create_counterclaim</w:t>
+      </w:r>
+      <w:proofErr w:type="spellEnd"/>
+      <w:r>
+        <w:rPr>
+          <w:color w:val="222222"/>
+        </w:rPr>
+        <w:t xml:space="preserve"> </w:t>
       </w:r>
       <w:r>
         <w:rPr>
@@ -911,19 +1264,63 @@
         <w:rPr>
           <w:color w:val="222222"/>
         </w:rPr>
-        <w:t xml:space="preserve"> there_are_marital_children</w:t>
-      </w:r>
-      <w:r>
-        <w:rPr>
-          <w:color w:val="222222"/>
-        </w:rPr>
-        <w:t xml:space="preserve">) or (create_counterclaim and </w:t>
-      </w:r>
-      <w:r>
-        <w:rPr>
-          <w:color w:val="222222"/>
-        </w:rPr>
-        <w:t>counterclaim_type == “with_children”</w:t>
+        <w:t xml:space="preserve"> </w:t>
+      </w:r>
+      <w:proofErr w:type="spellStart"/>
+      <w:r>
+        <w:rPr>
+          <w:color w:val="222222"/>
+        </w:rPr>
+        <w:t>there_are_marital_children</w:t>
+      </w:r>
+      <w:proofErr w:type="spellEnd"/>
+      <w:r>
+        <w:rPr>
+          <w:color w:val="222222"/>
+        </w:rPr>
+        <w:t>) or (</w:t>
+      </w:r>
+      <w:proofErr w:type="spellStart"/>
+      <w:r>
+        <w:rPr>
+          <w:color w:val="222222"/>
+        </w:rPr>
+        <w:t>create_counterclaim</w:t>
+      </w:r>
+      <w:proofErr w:type="spellEnd"/>
+      <w:r>
+        <w:rPr>
+          <w:color w:val="222222"/>
+        </w:rPr>
+        <w:t xml:space="preserve"> and </w:t>
+      </w:r>
+      <w:proofErr w:type="spellStart"/>
+      <w:r>
+        <w:rPr>
+          <w:color w:val="222222"/>
+        </w:rPr>
+        <w:t>counterclaim_type</w:t>
+      </w:r>
+      <w:proofErr w:type="spellEnd"/>
+      <w:r>
+        <w:rPr>
+          <w:color w:val="222222"/>
+        </w:rPr>
+        <w:t xml:space="preserve"> == “</w:t>
+      </w:r>
+      <w:proofErr w:type="spellStart"/>
+      <w:r>
+        <w:rPr>
+          <w:color w:val="222222"/>
+        </w:rPr>
+        <w:t>with_children</w:t>
+      </w:r>
+      <w:proofErr w:type="spellEnd"/>
+      <w:r>
+        <w:rPr>
+          <w:color w:val="222222"/>
+        </w:rPr>
+        <w:t>”</w:t>
       </w:r>
       <w:r>
         <w:rPr>
@@ -949,7 +1346,21 @@
         <w:rPr>
           <w:color w:val="222222"/>
         </w:rPr>
-        <w:t>Sign and date your Answer to Complaint for Divorce</w:t>
+        <w:t xml:space="preserve">Sign and date your Answer to Complaint </w:t>
+      </w:r>
+      <w:proofErr w:type="gramStart"/>
+      <w:r>
+        <w:rPr>
+          <w:color w:val="222222"/>
+        </w:rPr>
+        <w:t>for</w:t>
+      </w:r>
+      <w:proofErr w:type="gramEnd"/>
+      <w:r>
+        <w:rPr>
+          <w:color w:val="222222"/>
+        </w:rPr>
+        <w:t xml:space="preserve"> Divorce</w:t>
       </w:r>
       <w:r>
         <w:rPr>
@@ -973,7 +1384,21 @@
         <w:rPr>
           <w:color w:val="222222"/>
         </w:rPr>
-        <w:t>(If your electronic signature was already added, you don’t need to sign again.)</w:t>
+        <w:t xml:space="preserve">(If your electronic signature </w:t>
+      </w:r>
+      <w:proofErr w:type="gramStart"/>
+      <w:r>
+        <w:rPr>
+          <w:color w:val="222222"/>
+        </w:rPr>
+        <w:t>was</w:t>
+      </w:r>
+      <w:proofErr w:type="gramEnd"/>
+      <w:r>
+        <w:rPr>
+          <w:color w:val="222222"/>
+        </w:rPr>
+        <w:t xml:space="preserve"> already added, you don’t need to sign again.)</w:t>
       </w:r>
     </w:p>
     <w:p>
@@ -1048,7 +1473,6 @@
           <w:ilvl w:val="0"/>
           <w:numId w:val="7"/>
         </w:numPr>
-        <w:spacing w:after="0"/>
         <w:rPr>
           <w:color w:val="222222"/>
           <w:highlight w:val="white"/>
@@ -1228,18 +1652,14 @@
         </w:rPr>
         <w:t xml:space="preserve">{%p </w:t>
       </w:r>
-      <w:r>
-        <w:rPr>
-          <w:color w:val="222222"/>
-        </w:rPr>
-        <w:t>else</w:t>
-      </w:r>
-      <w:r>
-        <w:rPr>
-          <w:color w:val="222222"/>
-        </w:rPr>
-        <w:t xml:space="preserve"> %}</w:t>
-      </w:r>
+      <w:proofErr w:type="gramStart"/>
+      <w:r>
+        <w:rPr>
+          <w:color w:val="222222"/>
+        </w:rPr>
+        <w:t>else %}</w:t>
+      </w:r>
+      <w:proofErr w:type="gramEnd"/>
     </w:p>
     <w:p>
       <w:pPr>
@@ -1254,7 +1674,23 @@
           <w:color w:val="222222"/>
           <w:highlight w:val="white"/>
         </w:rPr>
-        <w:t>Sign and date the following forms, unless your electronic signature was already added:</w:t>
+        <w:t xml:space="preserve">Sign and date the following forms, unless your electronic signature </w:t>
+      </w:r>
+      <w:proofErr w:type="gramStart"/>
+      <w:r>
+        <w:rPr>
+          <w:color w:val="222222"/>
+          <w:highlight w:val="white"/>
+        </w:rPr>
+        <w:t>was</w:t>
+      </w:r>
+      <w:proofErr w:type="gramEnd"/>
+      <w:r>
+        <w:rPr>
+          <w:color w:val="222222"/>
+          <w:highlight w:val="white"/>
+        </w:rPr>
+        <w:t xml:space="preserve"> already added:</w:t>
       </w:r>
     </w:p>
     <w:p>
@@ -1274,7 +1710,23 @@
           <w:color w:val="222222"/>
           <w:highlight w:val="white"/>
         </w:rPr>
-        <w:t>Answer to Complaint for Divorce</w:t>
+        <w:t xml:space="preserve">Answer to Complaint </w:t>
+      </w:r>
+      <w:proofErr w:type="gramStart"/>
+      <w:r>
+        <w:rPr>
+          <w:color w:val="222222"/>
+          <w:highlight w:val="white"/>
+        </w:rPr>
+        <w:t>for</w:t>
+      </w:r>
+      <w:proofErr w:type="gramEnd"/>
+      <w:r>
+        <w:rPr>
+          <w:color w:val="222222"/>
+          <w:highlight w:val="white"/>
+        </w:rPr>
+        <w:t xml:space="preserve"> Divorce</w:t>
       </w:r>
     </w:p>
     <w:p>
@@ -1318,6 +1770,70 @@
     </w:p>
     <w:p>
       <w:pPr>
+        <w:spacing w:before="240" w:after="180"/>
+        <w:rPr>
+          <w:color w:val="222222"/>
+          <w:highlight w:val="white"/>
+        </w:rPr>
+      </w:pPr>
+      <w:r>
+        <w:rPr>
+          <w:color w:val="222222"/>
+          <w:highlight w:val="white"/>
+        </w:rPr>
+        <w:t xml:space="preserve">If you are requesting spousal support in your Counterclaim, the form tool created a </w:t>
+      </w:r>
+      <w:r>
+        <w:rPr>
+          <w:b/>
+          <w:bCs/>
+          <w:color w:val="222222"/>
+          <w:highlight w:val="white"/>
+        </w:rPr>
+        <w:t>Verified Statement</w:t>
+      </w:r>
+      <w:r>
+        <w:rPr>
+          <w:color w:val="222222"/>
+          <w:highlight w:val="white"/>
+        </w:rPr>
+        <w:t xml:space="preserve"> form. If your spouse </w:t>
+      </w:r>
+      <w:proofErr w:type="gramStart"/>
+      <w:r>
+        <w:rPr>
+          <w:color w:val="222222"/>
+          <w:highlight w:val="white"/>
+        </w:rPr>
+        <w:t>did</w:t>
+      </w:r>
+      <w:proofErr w:type="gramEnd"/>
+      <w:r>
+        <w:rPr>
+          <w:color w:val="222222"/>
+          <w:highlight w:val="white"/>
+        </w:rPr>
+        <w:t xml:space="preserve"> </w:t>
+      </w:r>
+      <w:proofErr w:type="gramStart"/>
+      <w:r>
+        <w:rPr>
+          <w:color w:val="222222"/>
+          <w:highlight w:val="white"/>
+        </w:rPr>
+        <w:t>not already</w:t>
+      </w:r>
+      <w:proofErr w:type="gramEnd"/>
+      <w:r>
+        <w:rPr>
+          <w:color w:val="222222"/>
+          <w:highlight w:val="white"/>
+        </w:rPr>
+        <w:t xml:space="preserve"> file a Verified Statement, or if the one your spouse filed was incorrect or incomplete, you will need to submit the Verified Statement to the Friend of the Court.</w:t>
+      </w:r>
+    </w:p>
+    <w:p>
+      <w:pPr>
         <w:spacing w:after="180"/>
         <w:rPr>
           <w:color w:val="222222"/>
@@ -1327,38 +1843,6 @@
       <w:r>
         <w:rPr>
           <w:color w:val="222222"/>
-          <w:highlight w:val="white"/>
-        </w:rPr>
-        <w:t xml:space="preserve">If you are requesting spousal support in your Counterclaim, the form tool created a </w:t>
-      </w:r>
-      <w:r>
-        <w:rPr>
-          <w:b/>
-          <w:bCs/>
-          <w:color w:val="222222"/>
-          <w:highlight w:val="white"/>
-        </w:rPr>
-        <w:t>Verified Statement</w:t>
-      </w:r>
-      <w:r>
-        <w:rPr>
-          <w:color w:val="222222"/>
-          <w:highlight w:val="white"/>
-        </w:rPr>
-        <w:t xml:space="preserve"> form. If your spouse did not already file a Verified Statement, or if the one your spouse filed was incorrect or incomplete, you will need to submit the Verified Statement to the Friend of the Court.</w:t>
-      </w:r>
-    </w:p>
-    <w:p>
-      <w:pPr>
-        <w:spacing w:after="180"/>
-        <w:rPr>
-          <w:color w:val="222222"/>
-          <w:highlight w:val="white"/>
-        </w:rPr>
-      </w:pPr>
-      <w:r>
-        <w:rPr>
-          <w:color w:val="222222"/>
         </w:rPr>
         <w:t>{%</w:t>
       </w:r>
@@ -1372,8 +1856,16 @@
         <w:rPr>
           <w:color w:val="222222"/>
         </w:rPr>
-        <w:t xml:space="preserve"> endif %}</w:t>
-      </w:r>
+        <w:t xml:space="preserve"> </w:t>
+      </w:r>
+      <w:proofErr w:type="gramStart"/>
+      <w:r>
+        <w:rPr>
+          <w:color w:val="222222"/>
+        </w:rPr>
+        <w:t>endif %}</w:t>
+      </w:r>
+      <w:proofErr w:type="gramEnd"/>
     </w:p>
     <w:p>
       <w:pPr>
@@ -1402,11 +1894,19 @@
         </w:rPr>
         <w:t xml:space="preserve">{%p if </w:t>
       </w:r>
-      <w:r>
-        <w:rPr>
-          <w:color w:val="222222"/>
-        </w:rPr>
-        <w:t xml:space="preserve">county_choice </w:t>
+      <w:proofErr w:type="spellStart"/>
+      <w:r>
+        <w:rPr>
+          <w:color w:val="222222"/>
+        </w:rPr>
+        <w:t>county_choice</w:t>
+      </w:r>
+      <w:proofErr w:type="spellEnd"/>
+      <w:r>
+        <w:rPr>
+          <w:color w:val="222222"/>
+        </w:rPr>
+        <w:t xml:space="preserve"> </w:t>
       </w:r>
       <w:r>
         <w:rPr>
@@ -1446,8 +1946,16 @@
         <w:rPr>
           <w:color w:val="222222"/>
         </w:rPr>
-        <w:t>{%p else %}</w:t>
-      </w:r>
+        <w:t xml:space="preserve">{%p </w:t>
+      </w:r>
+      <w:proofErr w:type="gramStart"/>
+      <w:r>
+        <w:rPr>
+          <w:color w:val="222222"/>
+        </w:rPr>
+        <w:t>else %}</w:t>
+      </w:r>
+      <w:proofErr w:type="gramEnd"/>
     </w:p>
     <w:p>
       <w:pPr>
@@ -1467,7 +1975,25 @@
           <w:bCs/>
           <w:color w:val="222222"/>
         </w:rPr>
-        <w:t xml:space="preserve">{% if (not create_counterclaim and </w:t>
+        <w:t xml:space="preserve">{% if (not </w:t>
+      </w:r>
+      <w:proofErr w:type="spellStart"/>
+      <w:r>
+        <w:rPr>
+          <w:b/>
+          <w:bCs/>
+          <w:color w:val="222222"/>
+        </w:rPr>
+        <w:t>create_counterclaim</w:t>
+      </w:r>
+      <w:proofErr w:type="spellEnd"/>
+      <w:r>
+        <w:rPr>
+          <w:b/>
+          <w:bCs/>
+          <w:color w:val="222222"/>
+        </w:rPr>
+        <w:t xml:space="preserve"> and </w:t>
       </w:r>
       <w:r>
         <w:rPr>
@@ -1477,14 +2003,61 @@
         </w:rPr>
         <w:t xml:space="preserve">not </w:t>
       </w:r>
-      <w:r>
-        <w:rPr>
-          <w:b/>
-          <w:bCs/>
-          <w:color w:val="222222"/>
-        </w:rPr>
-        <w:t>there_are_marital_children) or (create_counterclaim and counterclaim_type == “</w:t>
-      </w:r>
+      <w:proofErr w:type="spellStart"/>
+      <w:r>
+        <w:rPr>
+          <w:b/>
+          <w:bCs/>
+          <w:color w:val="222222"/>
+        </w:rPr>
+        <w:t>there_are_marital_children</w:t>
+      </w:r>
+      <w:proofErr w:type="spellEnd"/>
+      <w:r>
+        <w:rPr>
+          <w:b/>
+          <w:bCs/>
+          <w:color w:val="222222"/>
+        </w:rPr>
+        <w:t>) or (</w:t>
+      </w:r>
+      <w:proofErr w:type="spellStart"/>
+      <w:r>
+        <w:rPr>
+          <w:b/>
+          <w:bCs/>
+          <w:color w:val="222222"/>
+        </w:rPr>
+        <w:t>create_counterclaim</w:t>
+      </w:r>
+      <w:proofErr w:type="spellEnd"/>
+      <w:r>
+        <w:rPr>
+          <w:b/>
+          <w:bCs/>
+          <w:color w:val="222222"/>
+        </w:rPr>
+        <w:t xml:space="preserve"> and </w:t>
+      </w:r>
+      <w:proofErr w:type="spellStart"/>
+      <w:r>
+        <w:rPr>
+          <w:b/>
+          <w:bCs/>
+          <w:color w:val="222222"/>
+        </w:rPr>
+        <w:t>counterclaim_type</w:t>
+      </w:r>
+      <w:proofErr w:type="spellEnd"/>
+      <w:r>
+        <w:rPr>
+          <w:b/>
+          <w:bCs/>
+          <w:color w:val="222222"/>
+        </w:rPr>
+        <w:t xml:space="preserve"> == “</w:t>
+      </w:r>
+      <w:proofErr w:type="spellStart"/>
       <w:r>
         <w:rPr>
           <w:b/>
@@ -1499,45 +2072,142 @@
           <w:bCs/>
           <w:color w:val="222222"/>
         </w:rPr>
-        <w:t>_children”) %}</w:t>
-      </w:r>
-      <w:r>
-        <w:rPr>
-          <w:b/>
-          <w:bCs/>
-          <w:color w:val="222222"/>
-        </w:rPr>
-        <w:t>If you or your spouse requested spousal support, f</w:t>
-      </w:r>
-      <w:r>
-        <w:rPr>
-          <w:b/>
-          <w:bCs/>
-          <w:color w:val="222222"/>
-        </w:rPr>
-        <w:t>{%</w:t>
-      </w:r>
-      <w:r>
-        <w:rPr>
-          <w:b/>
-          <w:bCs/>
-          <w:color w:val="222222"/>
-        </w:rPr>
-        <w:t xml:space="preserve"> else %}F{% endif %}</w:t>
-      </w:r>
-      <w:r>
-        <w:rPr>
-          <w:b/>
-          <w:bCs/>
-          <w:color w:val="222222"/>
-        </w:rPr>
-        <w:t>ind out if you need Friend of the Court copies.</w:t>
-      </w:r>
-      <w:r>
-        <w:rPr>
-          <w:color w:val="222222"/>
-        </w:rPr>
-        <w:t xml:space="preserve"> If electronic filing is not an option for your case, contact the clerk’s office to find out if you need to provide extra copies of the documents you file to the Friend of the Court (FOC). Some but not all courts require FOC copies. If your court wants FOC copies, ask how they want you to provide them. Some courts may want you to label the copies “Friend of the Court” and file them along with your other documents in the clerk’s office. Other courts may require you to mail or deliver the copies to the FOC office. </w:t>
+        <w:t>_children</w:t>
+      </w:r>
+      <w:proofErr w:type="spellEnd"/>
+      <w:r>
+        <w:rPr>
+          <w:b/>
+          <w:bCs/>
+          <w:color w:val="222222"/>
+        </w:rPr>
+        <w:t xml:space="preserve">”) </w:t>
+      </w:r>
+      <w:proofErr w:type="gramStart"/>
+      <w:r>
+        <w:rPr>
+          <w:b/>
+          <w:bCs/>
+          <w:color w:val="222222"/>
+        </w:rPr>
+        <w:t>%}</w:t>
+      </w:r>
+      <w:r>
+        <w:rPr>
+          <w:b/>
+          <w:bCs/>
+          <w:color w:val="222222"/>
+        </w:rPr>
+        <w:t>If</w:t>
+      </w:r>
+      <w:proofErr w:type="gramEnd"/>
+      <w:r>
+        <w:rPr>
+          <w:b/>
+          <w:bCs/>
+          <w:color w:val="222222"/>
+        </w:rPr>
+        <w:t xml:space="preserve"> you or your spouse requested spousal support, </w:t>
+      </w:r>
+      <w:proofErr w:type="gramStart"/>
+      <w:r>
+        <w:rPr>
+          <w:b/>
+          <w:bCs/>
+          <w:color w:val="222222"/>
+        </w:rPr>
+        <w:t>f</w:t>
+      </w:r>
+      <w:r>
+        <w:rPr>
+          <w:b/>
+          <w:bCs/>
+          <w:color w:val="222222"/>
+        </w:rPr>
+        <w:t>{</w:t>
+      </w:r>
+      <w:proofErr w:type="gramEnd"/>
+      <w:r>
+        <w:rPr>
+          <w:b/>
+          <w:bCs/>
+          <w:color w:val="222222"/>
+        </w:rPr>
+        <w:t>%</w:t>
+      </w:r>
+      <w:r>
+        <w:rPr>
+          <w:b/>
+          <w:bCs/>
+          <w:color w:val="222222"/>
+        </w:rPr>
+        <w:t xml:space="preserve"> else </w:t>
+      </w:r>
+      <w:proofErr w:type="gramStart"/>
+      <w:r>
+        <w:rPr>
+          <w:b/>
+          <w:bCs/>
+          <w:color w:val="222222"/>
+        </w:rPr>
+        <w:t>%}F</w:t>
+      </w:r>
+      <w:proofErr w:type="gramEnd"/>
+      <w:r>
+        <w:rPr>
+          <w:b/>
+          <w:bCs/>
+          <w:color w:val="222222"/>
+        </w:rPr>
+        <w:t xml:space="preserve">{% endif </w:t>
+      </w:r>
+      <w:proofErr w:type="gramStart"/>
+      <w:r>
+        <w:rPr>
+          <w:b/>
+          <w:bCs/>
+          <w:color w:val="222222"/>
+        </w:rPr>
+        <w:t>%}</w:t>
+      </w:r>
+      <w:proofErr w:type="spellStart"/>
+      <w:r>
+        <w:rPr>
+          <w:b/>
+          <w:bCs/>
+          <w:color w:val="222222"/>
+        </w:rPr>
+        <w:t>ind</w:t>
+      </w:r>
+      <w:proofErr w:type="spellEnd"/>
+      <w:proofErr w:type="gramEnd"/>
+      <w:r>
+        <w:rPr>
+          <w:b/>
+          <w:bCs/>
+          <w:color w:val="222222"/>
+        </w:rPr>
+        <w:t xml:space="preserve"> out if you need Friend of the Court copies.</w:t>
+      </w:r>
+      <w:r>
+        <w:rPr>
+          <w:color w:val="222222"/>
+        </w:rPr>
+        <w:t xml:space="preserve"> If electronic filing is not an option for your case, contact the clerk’s office to find out if you need to provide extra copies of the documents you file </w:t>
+      </w:r>
+      <w:proofErr w:type="gramStart"/>
+      <w:r>
+        <w:rPr>
+          <w:color w:val="222222"/>
+        </w:rPr>
+        <w:t>to</w:t>
+      </w:r>
+      <w:proofErr w:type="gramEnd"/>
+      <w:r>
+        <w:rPr>
+          <w:color w:val="222222"/>
+        </w:rPr>
+        <w:t xml:space="preserve"> the Friend of the Court (FOC). Some but not all courts require FOC copies. If your court wants FOC copies, ask how they want you to provide them. Some courts may want you to label the copies “Friend of the Court” and file them along with your other documents in the clerk’s office. Other courts may require you to mail or deliver the copies to the FOC office. </w:t>
       </w:r>
     </w:p>
     <w:p>
@@ -1609,7 +2279,77 @@
         <w:rPr>
           <w:color w:val="222222"/>
         </w:rPr>
-        <w:t>(not create_counterclaim and not there_are_marital_children) or (create_counterclaim and counterclaim_type == “no_children”) %}</w:t>
+        <w:t xml:space="preserve">(not </w:t>
+      </w:r>
+      <w:proofErr w:type="spellStart"/>
+      <w:r>
+        <w:rPr>
+          <w:color w:val="222222"/>
+        </w:rPr>
+        <w:t>create_counterclaim</w:t>
+      </w:r>
+      <w:proofErr w:type="spellEnd"/>
+      <w:r>
+        <w:rPr>
+          <w:color w:val="222222"/>
+        </w:rPr>
+        <w:t xml:space="preserve"> and not </w:t>
+      </w:r>
+      <w:proofErr w:type="spellStart"/>
+      <w:r>
+        <w:rPr>
+          <w:color w:val="222222"/>
+        </w:rPr>
+        <w:t>there_are_marital_children</w:t>
+      </w:r>
+      <w:proofErr w:type="spellEnd"/>
+      <w:r>
+        <w:rPr>
+          <w:color w:val="222222"/>
+        </w:rPr>
+        <w:t>) or (</w:t>
+      </w:r>
+      <w:proofErr w:type="spellStart"/>
+      <w:r>
+        <w:rPr>
+          <w:color w:val="222222"/>
+        </w:rPr>
+        <w:t>create_counterclaim</w:t>
+      </w:r>
+      <w:proofErr w:type="spellEnd"/>
+      <w:r>
+        <w:rPr>
+          <w:color w:val="222222"/>
+        </w:rPr>
+        <w:t xml:space="preserve"> and </w:t>
+      </w:r>
+      <w:proofErr w:type="spellStart"/>
+      <w:r>
+        <w:rPr>
+          <w:color w:val="222222"/>
+        </w:rPr>
+        <w:t>counterclaim_type</w:t>
+      </w:r>
+      <w:proofErr w:type="spellEnd"/>
+      <w:r>
+        <w:rPr>
+          <w:color w:val="222222"/>
+        </w:rPr>
+        <w:t xml:space="preserve"> == “</w:t>
+      </w:r>
+      <w:proofErr w:type="spellStart"/>
+      <w:r>
+        <w:rPr>
+          <w:color w:val="222222"/>
+        </w:rPr>
+        <w:t>no_children</w:t>
+      </w:r>
+      <w:proofErr w:type="spellEnd"/>
+      <w:r>
+        <w:rPr>
+          <w:color w:val="222222"/>
+        </w:rPr>
+        <w:t>”) %}</w:t>
       </w:r>
     </w:p>
     <w:p>
@@ -1666,6 +2406,7 @@
     </w:p>
     <w:p>
       <w:pPr>
+        <w:spacing w:before="240"/>
         <w:rPr>
           <w:rFonts w:asciiTheme="majorHAnsi" w:hAnsiTheme="majorHAnsi" w:cstheme="majorHAnsi"/>
           <w:color w:val="222222"/>
@@ -1677,6 +2418,7 @@
           <w:bCs/>
           <w:color w:val="222222"/>
         </w:rPr>
+        <w:lastRenderedPageBreak/>
         <w:t>You only need the Verified Statement if you requested spousal support in your Counterclaim. </w:t>
       </w:r>
       <w:r>
@@ -1715,8 +2457,16 @@
         <w:rPr>
           <w:color w:val="222222"/>
         </w:rPr>
-        <w:t xml:space="preserve"> else %}</w:t>
-      </w:r>
+        <w:t xml:space="preserve"> </w:t>
+      </w:r>
+      <w:proofErr w:type="gramStart"/>
+      <w:r>
+        <w:rPr>
+          <w:color w:val="222222"/>
+        </w:rPr>
+        <w:t>else %}</w:t>
+      </w:r>
+      <w:proofErr w:type="gramEnd"/>
     </w:p>
     <w:p>
       <w:pPr>
@@ -1878,6 +2628,7 @@
     </w:p>
     <w:p>
       <w:pPr>
+        <w:spacing w:before="240"/>
         <w:rPr>
           <w:color w:val="222222"/>
         </w:rPr>
@@ -1929,8 +2680,16 @@
         <w:rPr>
           <w:color w:val="222222"/>
         </w:rPr>
-        <w:t xml:space="preserve"> endif %}</w:t>
-      </w:r>
+        <w:t xml:space="preserve"> </w:t>
+      </w:r>
+      <w:proofErr w:type="gramStart"/>
+      <w:r>
+        <w:rPr>
+          <w:color w:val="222222"/>
+        </w:rPr>
+        <w:t>endif %}</w:t>
+      </w:r>
+      <w:proofErr w:type="gramEnd"/>
     </w:p>
     <w:p>
       <w:pPr>
@@ -1961,7 +2720,25 @@
           <w:bCs/>
           <w:color w:val="222222"/>
         </w:rPr>
-        <w:t>If you will be filing and serving papers electronically, you will not need copies.</w:t>
+        <w:t xml:space="preserve">If you </w:t>
+      </w:r>
+      <w:proofErr w:type="gramStart"/>
+      <w:r>
+        <w:rPr>
+          <w:b/>
+          <w:bCs/>
+          <w:color w:val="222222"/>
+        </w:rPr>
+        <w:t>will be</w:t>
+      </w:r>
+      <w:proofErr w:type="gramEnd"/>
+      <w:r>
+        <w:rPr>
+          <w:b/>
+          <w:bCs/>
+          <w:color w:val="222222"/>
+        </w:rPr>
+        <w:t xml:space="preserve"> filing and serving papers electronically, you will not need copies.</w:t>
       </w:r>
     </w:p>
     <w:p>
@@ -1975,8 +2752,16 @@
         <w:rPr>
           <w:color w:val="222222"/>
         </w:rPr>
-        <w:t>{%p endif %}</w:t>
-      </w:r>
+        <w:t xml:space="preserve">{%p </w:t>
+      </w:r>
+      <w:proofErr w:type="gramStart"/>
+      <w:r>
+        <w:rPr>
+          <w:color w:val="222222"/>
+        </w:rPr>
+        <w:t>endif %}</w:t>
+      </w:r>
+      <w:proofErr w:type="gramEnd"/>
     </w:p>
     <w:p>
       <w:pPr>
@@ -2003,7 +2788,21 @@
         <w:rPr>
           <w:color w:val="222222"/>
         </w:rPr>
-        <w:t>{%p if county_choice == “Oakland” %}</w:t>
+        <w:t xml:space="preserve">{%p if </w:t>
+      </w:r>
+      <w:proofErr w:type="spellStart"/>
+      <w:r>
+        <w:rPr>
+          <w:color w:val="222222"/>
+        </w:rPr>
+        <w:t>county_choice</w:t>
+      </w:r>
+      <w:proofErr w:type="spellEnd"/>
+      <w:r>
+        <w:rPr>
+          <w:color w:val="222222"/>
+        </w:rPr>
+        <w:t xml:space="preserve"> == “Oakland” %}</w:t>
       </w:r>
     </w:p>
     <w:p>
@@ -2058,6 +2857,7 @@
         <w:t xml:space="preserve">Upload your documents in </w:t>
       </w:r>
       <w:hyperlink r:id="rId14">
+        <w:proofErr w:type="spellStart"/>
         <w:r>
           <w:rPr>
             <w:b/>
@@ -2067,6 +2867,7 @@
           </w:rPr>
           <w:t>MiFILE</w:t>
         </w:r>
+        <w:proofErr w:type="spellEnd"/>
       </w:hyperlink>
       <w:r>
         <w:rPr>
@@ -2074,7 +2875,43 @@
           <w:color w:val="222222"/>
           <w:highlight w:val="white"/>
         </w:rPr>
-        <w:t xml:space="preserve">. Within MiFILE, you will need to choose a drop down label for each individual document you upload. </w:t>
+        <w:t xml:space="preserve">. Within </w:t>
+      </w:r>
+      <w:proofErr w:type="spellStart"/>
+      <w:r>
+        <w:rPr>
+          <w:b/>
+          <w:color w:val="222222"/>
+          <w:highlight w:val="white"/>
+        </w:rPr>
+        <w:t>MiFILE</w:t>
+      </w:r>
+      <w:proofErr w:type="spellEnd"/>
+      <w:r>
+        <w:rPr>
+          <w:b/>
+          <w:color w:val="222222"/>
+          <w:highlight w:val="white"/>
+        </w:rPr>
+        <w:t xml:space="preserve">, you will need to choose a </w:t>
+      </w:r>
+      <w:proofErr w:type="gramStart"/>
+      <w:r>
+        <w:rPr>
+          <w:b/>
+          <w:color w:val="222222"/>
+          <w:highlight w:val="white"/>
+        </w:rPr>
+        <w:t>drop down</w:t>
+      </w:r>
+      <w:proofErr w:type="gramEnd"/>
+      <w:r>
+        <w:rPr>
+          <w:b/>
+          <w:color w:val="222222"/>
+          <w:highlight w:val="white"/>
+        </w:rPr>
+        <w:t xml:space="preserve"> label for each individual document you upload. </w:t>
       </w:r>
     </w:p>
     <w:p>
@@ -2109,7 +2946,21 @@
         <w:rPr>
           <w:color w:val="1B1B1B"/>
         </w:rPr>
-        <w:t>Answer to Complaint for Divorce</w:t>
+        <w:t xml:space="preserve">Answer to Complaint </w:t>
+      </w:r>
+      <w:proofErr w:type="gramStart"/>
+      <w:r>
+        <w:rPr>
+          <w:color w:val="1B1B1B"/>
+        </w:rPr>
+        <w:t>for</w:t>
+      </w:r>
+      <w:proofErr w:type="gramEnd"/>
+      <w:r>
+        <w:rPr>
+          <w:color w:val="1B1B1B"/>
+        </w:rPr>
+        <w:t xml:space="preserve"> Divorce</w:t>
       </w:r>
     </w:p>
     <w:p>
@@ -2124,7 +2975,77 @@
         <w:rPr>
           <w:color w:val="1B1B1B"/>
         </w:rPr>
-        <w:t>{%p if (not create_counterclaim and not there_are_marital_children) or (create_counterclaim and counterclaim_type == “no_children”) %}</w:t>
+        <w:t xml:space="preserve">{%p if (not </w:t>
+      </w:r>
+      <w:proofErr w:type="spellStart"/>
+      <w:r>
+        <w:rPr>
+          <w:color w:val="1B1B1B"/>
+        </w:rPr>
+        <w:t>create_counterclaim</w:t>
+      </w:r>
+      <w:proofErr w:type="spellEnd"/>
+      <w:r>
+        <w:rPr>
+          <w:color w:val="1B1B1B"/>
+        </w:rPr>
+        <w:t xml:space="preserve"> and not </w:t>
+      </w:r>
+      <w:proofErr w:type="spellStart"/>
+      <w:r>
+        <w:rPr>
+          <w:color w:val="1B1B1B"/>
+        </w:rPr>
+        <w:t>there_are_marital_children</w:t>
+      </w:r>
+      <w:proofErr w:type="spellEnd"/>
+      <w:r>
+        <w:rPr>
+          <w:color w:val="1B1B1B"/>
+        </w:rPr>
+        <w:t>) or (</w:t>
+      </w:r>
+      <w:proofErr w:type="spellStart"/>
+      <w:r>
+        <w:rPr>
+          <w:color w:val="1B1B1B"/>
+        </w:rPr>
+        <w:t>create_counterclaim</w:t>
+      </w:r>
+      <w:proofErr w:type="spellEnd"/>
+      <w:r>
+        <w:rPr>
+          <w:color w:val="1B1B1B"/>
+        </w:rPr>
+        <w:t xml:space="preserve"> and </w:t>
+      </w:r>
+      <w:proofErr w:type="spellStart"/>
+      <w:r>
+        <w:rPr>
+          <w:color w:val="1B1B1B"/>
+        </w:rPr>
+        <w:t>counterclaim_type</w:t>
+      </w:r>
+      <w:proofErr w:type="spellEnd"/>
+      <w:r>
+        <w:rPr>
+          <w:color w:val="1B1B1B"/>
+        </w:rPr>
+        <w:t xml:space="preserve"> == “</w:t>
+      </w:r>
+      <w:proofErr w:type="spellStart"/>
+      <w:r>
+        <w:rPr>
+          <w:color w:val="1B1B1B"/>
+        </w:rPr>
+        <w:t>no_children</w:t>
+      </w:r>
+      <w:proofErr w:type="spellEnd"/>
+      <w:r>
+        <w:rPr>
+          <w:color w:val="1B1B1B"/>
+        </w:rPr>
+        <w:t>”) %}</w:t>
       </w:r>
     </w:p>
     <w:p>
@@ -2170,8 +3091,16 @@
         <w:rPr>
           <w:color w:val="1B1B1B"/>
         </w:rPr>
-        <w:t xml:space="preserve"> else %}</w:t>
-      </w:r>
+        <w:t xml:space="preserve"> </w:t>
+      </w:r>
+      <w:proofErr w:type="gramStart"/>
+      <w:r>
+        <w:rPr>
+          <w:color w:val="1B1B1B"/>
+        </w:rPr>
+        <w:t>else %}</w:t>
+      </w:r>
+      <w:proofErr w:type="gramEnd"/>
       <w:r>
         <w:rPr>
           <w:color w:val="1B1B1B"/>
@@ -2205,7 +3134,14 @@
         <w:rPr>
           <w:color w:val="1B1B1B"/>
         </w:rPr>
-        <w:t>, file it at the same time as your Answer along with:</w:t>
+        <w:t xml:space="preserve">, file it at the same time as your Answer </w:t>
+      </w:r>
+      <w:r>
+        <w:rPr>
+          <w:color w:val="1B1B1B"/>
+        </w:rPr>
+        <w:lastRenderedPageBreak/>
+        <w:t>along with:</w:t>
       </w:r>
     </w:p>
     <w:p>
@@ -2255,7 +3191,6 @@
         <w:rPr>
           <w:color w:val="1B1B1B"/>
         </w:rPr>
-        <w:lastRenderedPageBreak/>
         <w:t>Verified Statement</w:t>
       </w:r>
       <w:r>
@@ -2315,8 +3250,17 @@
           <w:color w:val="222222"/>
           <w:highlight w:val="white"/>
         </w:rPr>
-        <w:t>{%p endif %}</w:t>
-      </w:r>
+        <w:t xml:space="preserve">{%p </w:t>
+      </w:r>
+      <w:proofErr w:type="gramStart"/>
+      <w:r>
+        <w:rPr>
+          <w:color w:val="222222"/>
+          <w:highlight w:val="white"/>
+        </w:rPr>
+        <w:t>endif %}</w:t>
+      </w:r>
+      <w:proofErr w:type="gramEnd"/>
     </w:p>
     <w:p>
       <w:pPr>
@@ -2413,8 +3357,16 @@
         <w:rPr>
           <w:color w:val="222222"/>
         </w:rPr>
-        <w:t>{%p else %}</w:t>
-      </w:r>
+        <w:t xml:space="preserve">{%p </w:t>
+      </w:r>
+      <w:proofErr w:type="gramStart"/>
+      <w:r>
+        <w:rPr>
+          <w:color w:val="222222"/>
+        </w:rPr>
+        <w:t>else %}</w:t>
+      </w:r>
+      <w:proofErr w:type="gramEnd"/>
       <w:r>
         <w:rPr>
           <w:color w:val="222222"/>
@@ -2531,7 +3483,21 @@
         <w:rPr>
           <w:color w:val="1B1B1B"/>
         </w:rPr>
-        <w:t>Answer to Complaint for Divorce</w:t>
+        <w:t xml:space="preserve">Answer to Complaint </w:t>
+      </w:r>
+      <w:proofErr w:type="gramStart"/>
+      <w:r>
+        <w:rPr>
+          <w:color w:val="1B1B1B"/>
+        </w:rPr>
+        <w:t>for</w:t>
+      </w:r>
+      <w:proofErr w:type="gramEnd"/>
+      <w:r>
+        <w:rPr>
+          <w:color w:val="1B1B1B"/>
+        </w:rPr>
+        <w:t xml:space="preserve"> Divorce</w:t>
       </w:r>
     </w:p>
     <w:p>
@@ -2546,7 +3512,77 @@
         <w:rPr>
           <w:color w:val="1B1B1B"/>
         </w:rPr>
-        <w:t>{%p if (not create_counterclaim and not there_are_marital_children) or (create_counterclaim and counterclaim_type == “no_children”) %}</w:t>
+        <w:t xml:space="preserve">{%p if (not </w:t>
+      </w:r>
+      <w:proofErr w:type="spellStart"/>
+      <w:r>
+        <w:rPr>
+          <w:color w:val="1B1B1B"/>
+        </w:rPr>
+        <w:t>create_counterclaim</w:t>
+      </w:r>
+      <w:proofErr w:type="spellEnd"/>
+      <w:r>
+        <w:rPr>
+          <w:color w:val="1B1B1B"/>
+        </w:rPr>
+        <w:t xml:space="preserve"> and not </w:t>
+      </w:r>
+      <w:proofErr w:type="spellStart"/>
+      <w:r>
+        <w:rPr>
+          <w:color w:val="1B1B1B"/>
+        </w:rPr>
+        <w:t>there_are_marital_children</w:t>
+      </w:r>
+      <w:proofErr w:type="spellEnd"/>
+      <w:r>
+        <w:rPr>
+          <w:color w:val="1B1B1B"/>
+        </w:rPr>
+        <w:t>) or (</w:t>
+      </w:r>
+      <w:proofErr w:type="spellStart"/>
+      <w:r>
+        <w:rPr>
+          <w:color w:val="1B1B1B"/>
+        </w:rPr>
+        <w:t>create_counterclaim</w:t>
+      </w:r>
+      <w:proofErr w:type="spellEnd"/>
+      <w:r>
+        <w:rPr>
+          <w:color w:val="1B1B1B"/>
+        </w:rPr>
+        <w:t xml:space="preserve"> and </w:t>
+      </w:r>
+      <w:proofErr w:type="spellStart"/>
+      <w:r>
+        <w:rPr>
+          <w:color w:val="1B1B1B"/>
+        </w:rPr>
+        <w:t>counterclaim_type</w:t>
+      </w:r>
+      <w:proofErr w:type="spellEnd"/>
+      <w:r>
+        <w:rPr>
+          <w:color w:val="1B1B1B"/>
+        </w:rPr>
+        <w:t xml:space="preserve"> == “</w:t>
+      </w:r>
+      <w:proofErr w:type="spellStart"/>
+      <w:r>
+        <w:rPr>
+          <w:color w:val="1B1B1B"/>
+        </w:rPr>
+        <w:t>no_children</w:t>
+      </w:r>
+      <w:proofErr w:type="spellEnd"/>
+      <w:r>
+        <w:rPr>
+          <w:color w:val="1B1B1B"/>
+        </w:rPr>
+        <w:t>”) %}</w:t>
       </w:r>
     </w:p>
     <w:p>
@@ -2603,8 +3639,16 @@
         <w:rPr>
           <w:color w:val="1B1B1B"/>
         </w:rPr>
-        <w:t>to the Friend of the Court. But if your spouse already filed a Verified Statement, you do not need to file one unless your spouse's Verified Statement was incomplete or incorrect. You may need to submit the Verified Statement differently from the way you file the other forms. Learn more below.*</w:t>
-      </w:r>
+        <w:t xml:space="preserve">to the Friend of the Court. But if your spouse already filed a Verified Statement, you do not need to file one unless your spouse's Verified Statement was incomplete or incorrect. You may need to submit the Verified Statement differently from the way you file the other forms. Learn more </w:t>
+      </w:r>
+      <w:proofErr w:type="gramStart"/>
+      <w:r>
+        <w:rPr>
+          <w:color w:val="1B1B1B"/>
+        </w:rPr>
+        <w:t>below.*</w:t>
+      </w:r>
+      <w:proofErr w:type="gramEnd"/>
     </w:p>
     <w:p>
       <w:pPr>
@@ -2630,8 +3674,16 @@
         <w:rPr>
           <w:color w:val="1B1B1B"/>
         </w:rPr>
-        <w:t xml:space="preserve"> else %}</w:t>
-      </w:r>
+        <w:t xml:space="preserve"> </w:t>
+      </w:r>
+      <w:proofErr w:type="gramStart"/>
+      <w:r>
+        <w:rPr>
+          <w:color w:val="1B1B1B"/>
+        </w:rPr>
+        <w:t>else %}</w:t>
+      </w:r>
+      <w:proofErr w:type="gramEnd"/>
     </w:p>
     <w:p>
       <w:pPr>
@@ -2767,6 +3819,7 @@
           <w:bCs/>
           <w:color w:val="222222"/>
         </w:rPr>
+        <w:lastRenderedPageBreak/>
         <w:t>Verified Statement</w:t>
       </w:r>
       <w:r>
@@ -2810,6 +3863,7 @@
         </w:rPr>
         <w:t xml:space="preserve">{%p </w:t>
       </w:r>
+      <w:proofErr w:type="gramStart"/>
       <w:r>
         <w:rPr>
           <w:color w:val="222222"/>
@@ -2822,6 +3876,7 @@
         </w:rPr>
         <w:t xml:space="preserve"> %}</w:t>
       </w:r>
+      <w:proofErr w:type="gramEnd"/>
     </w:p>
     <w:p>
       <w:pPr>
@@ -2834,7 +3889,6 @@
         <w:rPr>
           <w:color w:val="222222"/>
         </w:rPr>
-        <w:lastRenderedPageBreak/>
         <w:t>If you are filing in person at the court, give the clerk your forms and all copies. The clerk will return any copies the court does not need. If you are e-filing or email filing, upload PDFs of each form to the e-filing platform or to an email and submit it.</w:t>
       </w:r>
     </w:p>
@@ -2926,7 +3980,21 @@
         <w:rPr>
           <w:color w:val="222222"/>
         </w:rPr>
-        <w:t xml:space="preserve">{%p endif %} </w:t>
+        <w:t xml:space="preserve">{%p </w:t>
+      </w:r>
+      <w:proofErr w:type="gramStart"/>
+      <w:r>
+        <w:rPr>
+          <w:color w:val="222222"/>
+        </w:rPr>
+        <w:t>endif %}</w:t>
+      </w:r>
+      <w:proofErr w:type="gramEnd"/>
+      <w:r>
+        <w:rPr>
+          <w:color w:val="222222"/>
+        </w:rPr>
+        <w:t xml:space="preserve"> </w:t>
       </w:r>
       <w:r>
         <w:rPr>
@@ -3039,7 +4107,21 @@
         <w:rPr>
           <w:color w:val="222222"/>
         </w:rPr>
-        <w:t>Answer to Complaint for Divorce</w:t>
+        <w:t xml:space="preserve">Answer to Complaint </w:t>
+      </w:r>
+      <w:proofErr w:type="gramStart"/>
+      <w:r>
+        <w:rPr>
+          <w:color w:val="222222"/>
+        </w:rPr>
+        <w:t>for</w:t>
+      </w:r>
+      <w:proofErr w:type="gramEnd"/>
+      <w:r>
+        <w:rPr>
+          <w:color w:val="222222"/>
+        </w:rPr>
+        <w:t xml:space="preserve"> Divorce</w:t>
       </w:r>
     </w:p>
     <w:p>
@@ -3054,7 +4136,77 @@
         <w:rPr>
           <w:color w:val="1B1B1B"/>
         </w:rPr>
-        <w:t>{%p if (not create_counterclaim and not there_are_marital_children) or (create_counterclaim and counterclaim_type == “no_children”) %}</w:t>
+        <w:t xml:space="preserve">{%p if (not </w:t>
+      </w:r>
+      <w:proofErr w:type="spellStart"/>
+      <w:r>
+        <w:rPr>
+          <w:color w:val="1B1B1B"/>
+        </w:rPr>
+        <w:t>create_counterclaim</w:t>
+      </w:r>
+      <w:proofErr w:type="spellEnd"/>
+      <w:r>
+        <w:rPr>
+          <w:color w:val="1B1B1B"/>
+        </w:rPr>
+        <w:t xml:space="preserve"> and not </w:t>
+      </w:r>
+      <w:proofErr w:type="spellStart"/>
+      <w:r>
+        <w:rPr>
+          <w:color w:val="1B1B1B"/>
+        </w:rPr>
+        <w:t>there_are_marital_children</w:t>
+      </w:r>
+      <w:proofErr w:type="spellEnd"/>
+      <w:r>
+        <w:rPr>
+          <w:color w:val="1B1B1B"/>
+        </w:rPr>
+        <w:t>) or (</w:t>
+      </w:r>
+      <w:proofErr w:type="spellStart"/>
+      <w:r>
+        <w:rPr>
+          <w:color w:val="1B1B1B"/>
+        </w:rPr>
+        <w:t>create_counterclaim</w:t>
+      </w:r>
+      <w:proofErr w:type="spellEnd"/>
+      <w:r>
+        <w:rPr>
+          <w:color w:val="1B1B1B"/>
+        </w:rPr>
+        <w:t xml:space="preserve"> and </w:t>
+      </w:r>
+      <w:proofErr w:type="spellStart"/>
+      <w:r>
+        <w:rPr>
+          <w:color w:val="1B1B1B"/>
+        </w:rPr>
+        <w:t>counterclaim_type</w:t>
+      </w:r>
+      <w:proofErr w:type="spellEnd"/>
+      <w:r>
+        <w:rPr>
+          <w:color w:val="1B1B1B"/>
+        </w:rPr>
+        <w:t xml:space="preserve"> == “</w:t>
+      </w:r>
+      <w:proofErr w:type="spellStart"/>
+      <w:r>
+        <w:rPr>
+          <w:color w:val="1B1B1B"/>
+        </w:rPr>
+        <w:t>no_children</w:t>
+      </w:r>
+      <w:proofErr w:type="spellEnd"/>
+      <w:r>
+        <w:rPr>
+          <w:color w:val="1B1B1B"/>
+        </w:rPr>
+        <w:t>”) %}</w:t>
       </w:r>
     </w:p>
     <w:p>
@@ -3070,7 +4222,21 @@
         <w:rPr>
           <w:color w:val="222222"/>
         </w:rPr>
-        <w:t>Counterclaim for Divorce without Children (if you filed one)</w:t>
+        <w:t xml:space="preserve">Counterclaim for Divorce without Children (if you </w:t>
+      </w:r>
+      <w:proofErr w:type="gramStart"/>
+      <w:r>
+        <w:rPr>
+          <w:color w:val="222222"/>
+        </w:rPr>
+        <w:t>filed</w:t>
+      </w:r>
+      <w:proofErr w:type="gramEnd"/>
+      <w:r>
+        <w:rPr>
+          <w:color w:val="222222"/>
+        </w:rPr>
+        <w:t xml:space="preserve"> one)</w:t>
       </w:r>
     </w:p>
     <w:p>
@@ -3098,8 +4264,16 @@
         <w:rPr>
           <w:color w:val="222222"/>
         </w:rPr>
-        <w:t>{%p else %}</w:t>
-      </w:r>
+        <w:t xml:space="preserve">{%p </w:t>
+      </w:r>
+      <w:proofErr w:type="gramStart"/>
+      <w:r>
+        <w:rPr>
+          <w:color w:val="222222"/>
+        </w:rPr>
+        <w:t>else %}</w:t>
+      </w:r>
+      <w:proofErr w:type="gramEnd"/>
     </w:p>
     <w:p>
       <w:pPr>
@@ -3136,8 +4310,17 @@
           <w:color w:val="222222"/>
           <w:highlight w:val="white"/>
         </w:rPr>
-        <w:t>{%p endif %}</w:t>
-      </w:r>
+        <w:t xml:space="preserve">{%p </w:t>
+      </w:r>
+      <w:proofErr w:type="gramStart"/>
+      <w:r>
+        <w:rPr>
+          <w:color w:val="222222"/>
+          <w:highlight w:val="white"/>
+        </w:rPr>
+        <w:t>endif %}</w:t>
+      </w:r>
+      <w:proofErr w:type="gramEnd"/>
     </w:p>
     <w:p>
       <w:pPr>
@@ -3150,7 +4333,78 @@
         <w:rPr>
           <w:color w:val="222222"/>
         </w:rPr>
-        <w:t xml:space="preserve">If you used MiFILE to file documents electronically, MiFILE will also serve the documents electronically if the other party is using MiFILE. If you are not both using MiFILE, you will need to serve the documents by e-mail, if possible. If you or the other party can't do this, or if you are not sure, you can serve by regular mail or personal delivery. If you serve by mail, send the papers to the other party’s last known address. </w:t>
+        <w:lastRenderedPageBreak/>
+        <w:t xml:space="preserve">If you used </w:t>
+      </w:r>
+      <w:proofErr w:type="spellStart"/>
+      <w:r>
+        <w:rPr>
+          <w:color w:val="222222"/>
+        </w:rPr>
+        <w:t>MiFILE</w:t>
+      </w:r>
+      <w:proofErr w:type="spellEnd"/>
+      <w:r>
+        <w:rPr>
+          <w:color w:val="222222"/>
+        </w:rPr>
+        <w:t xml:space="preserve"> to file documents electronically, </w:t>
+      </w:r>
+      <w:proofErr w:type="spellStart"/>
+      <w:r>
+        <w:rPr>
+          <w:color w:val="222222"/>
+        </w:rPr>
+        <w:t>MiFILE</w:t>
+      </w:r>
+      <w:proofErr w:type="spellEnd"/>
+      <w:r>
+        <w:rPr>
+          <w:color w:val="222222"/>
+        </w:rPr>
+        <w:t xml:space="preserve"> will also serve the documents electronically if the other party is using </w:t>
+      </w:r>
+      <w:proofErr w:type="spellStart"/>
+      <w:r>
+        <w:rPr>
+          <w:color w:val="222222"/>
+        </w:rPr>
+        <w:t>MiFILE</w:t>
+      </w:r>
+      <w:proofErr w:type="spellEnd"/>
+      <w:r>
+        <w:rPr>
+          <w:color w:val="222222"/>
+        </w:rPr>
+        <w:t xml:space="preserve">. If you are </w:t>
+      </w:r>
+      <w:proofErr w:type="gramStart"/>
+      <w:r>
+        <w:rPr>
+          <w:color w:val="222222"/>
+        </w:rPr>
+        <w:t>not both</w:t>
+      </w:r>
+      <w:proofErr w:type="gramEnd"/>
+      <w:r>
+        <w:rPr>
+          <w:color w:val="222222"/>
+        </w:rPr>
+        <w:t xml:space="preserve"> using </w:t>
+      </w:r>
+      <w:proofErr w:type="spellStart"/>
+      <w:r>
+        <w:rPr>
+          <w:color w:val="222222"/>
+        </w:rPr>
+        <w:t>MiFILE</w:t>
+      </w:r>
+      <w:proofErr w:type="spellEnd"/>
+      <w:r>
+        <w:rPr>
+          <w:color w:val="222222"/>
+        </w:rPr>
+        <w:t xml:space="preserve">, you will need to serve the documents by e-mail, if possible. If you or the other party can't do this, or if you are not sure, you can serve by regular mail or personal delivery. If you serve by mail, send the papers to the other party’s last known address. </w:t>
       </w:r>
     </w:p>
     <w:p>
@@ -3249,7 +4503,23 @@
           <w:color w:val="222222"/>
           <w:highlight w:val="white"/>
         </w:rPr>
-        <w:t>Do not delete any e-mails you send to the other party, especially e-mails that served court documents. You must keep a record of sent items until a judgment or final order is entered and all appeals have been completed.</w:t>
+        <w:t xml:space="preserve">Do not delete any e-mails you send to the other party, especially e-mails that served court documents. You must keep a record of </w:t>
+      </w:r>
+      <w:proofErr w:type="gramStart"/>
+      <w:r>
+        <w:rPr>
+          <w:color w:val="222222"/>
+          <w:highlight w:val="white"/>
+        </w:rPr>
+        <w:t>sent items</w:t>
+      </w:r>
+      <w:proofErr w:type="gramEnd"/>
+      <w:r>
+        <w:rPr>
+          <w:color w:val="222222"/>
+          <w:highlight w:val="white"/>
+        </w:rPr>
+        <w:t xml:space="preserve"> until a judgment or final order is entered and all appeals have been completed.</w:t>
       </w:r>
     </w:p>
     <w:p>
@@ -3275,7 +4545,21 @@
         <w:rPr>
           <w:highlight w:val="white"/>
         </w:rPr>
-        <w:t xml:space="preserve"> a Proof of Service</w:t>
+        <w:t xml:space="preserve"> </w:t>
+      </w:r>
+      <w:proofErr w:type="gramStart"/>
+      <w:r>
+        <w:rPr>
+          <w:highlight w:val="white"/>
+        </w:rPr>
+        <w:t>a Proof</w:t>
+      </w:r>
+      <w:proofErr w:type="gramEnd"/>
+      <w:r>
+        <w:rPr>
+          <w:highlight w:val="white"/>
+        </w:rPr>
+        <w:t xml:space="preserve"> of Service</w:t>
       </w:r>
     </w:p>
     <w:p>
@@ -3305,7 +4589,71 @@
           <w:color w:val="222222"/>
           <w:highlight w:val="white"/>
         </w:rPr>
-        <w:t xml:space="preserve"> using MiFILE, you will not need to file a Proof of Service. MiFILE will create and file a Proof of Service for you.</w:t>
+        <w:t xml:space="preserve"> using </w:t>
+      </w:r>
+      <w:proofErr w:type="spellStart"/>
+      <w:r>
+        <w:rPr>
+          <w:color w:val="222222"/>
+          <w:highlight w:val="white"/>
+        </w:rPr>
+        <w:t>MiFILE</w:t>
+      </w:r>
+      <w:proofErr w:type="spellEnd"/>
+      <w:r>
+        <w:rPr>
+          <w:color w:val="222222"/>
+          <w:highlight w:val="white"/>
+        </w:rPr>
+        <w:t xml:space="preserve">, you will not need to file </w:t>
+      </w:r>
+      <w:proofErr w:type="gramStart"/>
+      <w:r>
+        <w:rPr>
+          <w:color w:val="222222"/>
+          <w:highlight w:val="white"/>
+        </w:rPr>
+        <w:t>a Proof</w:t>
+      </w:r>
+      <w:proofErr w:type="gramEnd"/>
+      <w:r>
+        <w:rPr>
+          <w:color w:val="222222"/>
+          <w:highlight w:val="white"/>
+        </w:rPr>
+        <w:t xml:space="preserve"> of Service. </w:t>
+      </w:r>
+      <w:proofErr w:type="spellStart"/>
+      <w:r>
+        <w:rPr>
+          <w:color w:val="222222"/>
+          <w:highlight w:val="white"/>
+        </w:rPr>
+        <w:t>MiFILE</w:t>
+      </w:r>
+      <w:proofErr w:type="spellEnd"/>
+      <w:r>
+        <w:rPr>
+          <w:color w:val="222222"/>
+          <w:highlight w:val="white"/>
+        </w:rPr>
+        <w:t xml:space="preserve"> will create and file </w:t>
+      </w:r>
+      <w:proofErr w:type="gramStart"/>
+      <w:r>
+        <w:rPr>
+          <w:color w:val="222222"/>
+          <w:highlight w:val="white"/>
+        </w:rPr>
+        <w:t>a Proof</w:t>
+      </w:r>
+      <w:proofErr w:type="gramEnd"/>
+      <w:r>
+        <w:rPr>
+          <w:color w:val="222222"/>
+          <w:highlight w:val="white"/>
+        </w:rPr>
+        <w:t xml:space="preserve"> of Service for you.</w:t>
       </w:r>
     </w:p>
     <w:p>
@@ -3365,7 +4713,28 @@
         <w:rPr>
           <w:color w:val="222222"/>
         </w:rPr>
-        <w:t xml:space="preserve">{% if county_choice </w:t>
+        <w:t xml:space="preserve">{% if </w:t>
+      </w:r>
+      <w:proofErr w:type="spellStart"/>
+      <w:r>
+        <w:rPr>
+          <w:color w:val="222222"/>
+        </w:rPr>
+        <w:t>county_</w:t>
+      </w:r>
+      <w:proofErr w:type="gramStart"/>
+      <w:r>
+        <w:rPr>
+          <w:color w:val="222222"/>
+        </w:rPr>
+        <w:t>choice</w:t>
+      </w:r>
+      <w:proofErr w:type="spellEnd"/>
+      <w:r>
+        <w:rPr>
+          <w:color w:val="222222"/>
+        </w:rPr>
+        <w:t xml:space="preserve"> </w:t>
       </w:r>
       <w:r>
         <w:rPr>
@@ -3373,24 +4742,96 @@
         </w:rPr>
         <w:t>!</w:t>
       </w:r>
-      <w:r>
-        <w:rPr>
-          <w:color w:val="222222"/>
-        </w:rPr>
-        <w:t>= “Oakland” %}</w:t>
-      </w:r>
-      <w:r>
-        <w:rPr>
-          <w:color w:val="222222"/>
-        </w:rPr>
-        <w:t xml:space="preserve">{% if </w:t>
-      </w:r>
-      <w:r>
-        <w:rPr>
-          <w:color w:val="222222"/>
-        </w:rPr>
-        <w:t>(not create_counterclaim and there_are_marital_children) or (create_counterclaim and counterclaim_type == “</w:t>
-      </w:r>
+      <w:proofErr w:type="gramEnd"/>
+      <w:r>
+        <w:rPr>
+          <w:color w:val="222222"/>
+        </w:rPr>
+        <w:t xml:space="preserve">= “Oakland” </w:t>
+      </w:r>
+      <w:proofErr w:type="gramStart"/>
+      <w:r>
+        <w:rPr>
+          <w:color w:val="222222"/>
+        </w:rPr>
+        <w:t>%}</w:t>
+      </w:r>
+      <w:r>
+        <w:rPr>
+          <w:color w:val="222222"/>
+        </w:rPr>
+        <w:t>{</w:t>
+      </w:r>
+      <w:proofErr w:type="gramEnd"/>
+      <w:r>
+        <w:rPr>
+          <w:color w:val="222222"/>
+        </w:rPr>
+        <w:t xml:space="preserve">% if </w:t>
+      </w:r>
+      <w:r>
+        <w:rPr>
+          <w:color w:val="222222"/>
+        </w:rPr>
+        <w:t xml:space="preserve">(not </w:t>
+      </w:r>
+      <w:proofErr w:type="spellStart"/>
+      <w:r>
+        <w:rPr>
+          <w:color w:val="222222"/>
+        </w:rPr>
+        <w:t>create_counterclaim</w:t>
+      </w:r>
+      <w:proofErr w:type="spellEnd"/>
+      <w:r>
+        <w:rPr>
+          <w:color w:val="222222"/>
+        </w:rPr>
+        <w:t xml:space="preserve"> and </w:t>
+      </w:r>
+      <w:proofErr w:type="spellStart"/>
+      <w:r>
+        <w:rPr>
+          <w:color w:val="222222"/>
+        </w:rPr>
+        <w:t>there_are_marital_children</w:t>
+      </w:r>
+      <w:proofErr w:type="spellEnd"/>
+      <w:r>
+        <w:rPr>
+          <w:color w:val="222222"/>
+        </w:rPr>
+        <w:t>) or (</w:t>
+      </w:r>
+      <w:proofErr w:type="spellStart"/>
+      <w:r>
+        <w:rPr>
+          <w:color w:val="222222"/>
+        </w:rPr>
+        <w:t>create_counterclaim</w:t>
+      </w:r>
+      <w:proofErr w:type="spellEnd"/>
+      <w:r>
+        <w:rPr>
+          <w:color w:val="222222"/>
+        </w:rPr>
+        <w:t xml:space="preserve"> and </w:t>
+      </w:r>
+      <w:proofErr w:type="spellStart"/>
+      <w:r>
+        <w:rPr>
+          <w:color w:val="222222"/>
+        </w:rPr>
+        <w:t>counterclaim_type</w:t>
+      </w:r>
+      <w:proofErr w:type="spellEnd"/>
+      <w:r>
+        <w:rPr>
+          <w:color w:val="222222"/>
+        </w:rPr>
+        <w:t xml:space="preserve"> == “</w:t>
+      </w:r>
+      <w:proofErr w:type="spellStart"/>
       <w:r>
         <w:rPr>
           <w:color w:val="222222"/>
@@ -3401,7 +4842,14 @@
         <w:rPr>
           <w:color w:val="222222"/>
         </w:rPr>
-        <w:t>_children”) %}</w:t>
+        <w:t>_children</w:t>
+      </w:r>
+      <w:proofErr w:type="spellEnd"/>
+      <w:r>
+        <w:rPr>
+          <w:color w:val="222222"/>
+        </w:rPr>
+        <w:t>”) %}</w:t>
       </w:r>
       <w:r>
         <w:rPr>
@@ -3428,7 +4876,21 @@
         <w:rPr>
           <w:color w:val="222222"/>
         </w:rPr>
-        <w:t>, and make a copy for your records.{% else %}</w:t>
+        <w:t xml:space="preserve">, and make a copy for your </w:t>
+      </w:r>
+      <w:proofErr w:type="gramStart"/>
+      <w:r>
+        <w:rPr>
+          <w:color w:val="222222"/>
+        </w:rPr>
+        <w:t>records.{</w:t>
+      </w:r>
+      <w:proofErr w:type="gramEnd"/>
+      <w:r>
+        <w:rPr>
+          <w:color w:val="222222"/>
+        </w:rPr>
+        <w:t>% else %}</w:t>
       </w:r>
       <w:r>
         <w:rPr>
@@ -3486,15 +4948,40 @@
           <w:color w:val="222222"/>
           <w:highlight w:val="white"/>
         </w:rPr>
-        <w:t>{% endif %}</w:t>
-      </w:r>
-      <w:r>
-        <w:rPr>
-          <w:color w:val="222222"/>
-          <w:highlight w:val="white"/>
-        </w:rPr>
-        <w:t>{% endif %}</w:t>
-      </w:r>
+        <w:t xml:space="preserve">{% endif </w:t>
+      </w:r>
+      <w:proofErr w:type="gramStart"/>
+      <w:r>
+        <w:rPr>
+          <w:color w:val="222222"/>
+          <w:highlight w:val="white"/>
+        </w:rPr>
+        <w:t>%}</w:t>
+      </w:r>
+      <w:r>
+        <w:rPr>
+          <w:color w:val="222222"/>
+          <w:highlight w:val="white"/>
+        </w:rPr>
+        <w:t>{</w:t>
+      </w:r>
+      <w:proofErr w:type="gramEnd"/>
+      <w:r>
+        <w:rPr>
+          <w:color w:val="222222"/>
+          <w:highlight w:val="white"/>
+        </w:rPr>
+        <w:t xml:space="preserve">% </w:t>
+      </w:r>
+      <w:proofErr w:type="gramStart"/>
+      <w:r>
+        <w:rPr>
+          <w:color w:val="222222"/>
+          <w:highlight w:val="white"/>
+        </w:rPr>
+        <w:t>endif %}</w:t>
+      </w:r>
+      <w:proofErr w:type="gramEnd"/>
       <w:r>
         <w:rPr>
           <w:color w:val="222222"/>
@@ -3686,6 +5173,7 @@
         <w:rPr>
           <w:color w:val="222222"/>
         </w:rPr>
+        <w:lastRenderedPageBreak/>
         <w:t>Sign the form,</w:t>
       </w:r>
     </w:p>
@@ -3705,7 +5193,21 @@
         <w:rPr>
           <w:color w:val="222222"/>
         </w:rPr>
-        <w:t xml:space="preserve">Make a copy for your records, and </w:t>
+        <w:t xml:space="preserve">Make a copy </w:t>
+      </w:r>
+      <w:proofErr w:type="gramStart"/>
+      <w:r>
+        <w:rPr>
+          <w:color w:val="222222"/>
+        </w:rPr>
+        <w:t>for</w:t>
+      </w:r>
+      <w:proofErr w:type="gramEnd"/>
+      <w:r>
+        <w:rPr>
+          <w:color w:val="222222"/>
+        </w:rPr>
+        <w:t xml:space="preserve"> your records, and </w:t>
       </w:r>
     </w:p>
     <w:p>
@@ -3751,7 +5253,21 @@
         <w:rPr>
           <w:color w:val="222222"/>
         </w:rPr>
-        <w:t>Your spouse must also fill out their own copy of the form and send it to you within the 28 days.</w:t>
+        <w:t xml:space="preserve">Your spouse must also fill out their own copy of the form and send it to you within </w:t>
+      </w:r>
+      <w:proofErr w:type="gramStart"/>
+      <w:r>
+        <w:rPr>
+          <w:color w:val="222222"/>
+        </w:rPr>
+        <w:t>the 28</w:t>
+      </w:r>
+      <w:proofErr w:type="gramEnd"/>
+      <w:r>
+        <w:rPr>
+          <w:color w:val="222222"/>
+        </w:rPr>
+        <w:t xml:space="preserve"> days.</w:t>
       </w:r>
     </w:p>
     <w:p>
@@ -3759,7 +5275,6 @@
         <w:pStyle w:val="Heading4"/>
       </w:pPr>
       <w:r>
-        <w:lastRenderedPageBreak/>
         <w:t>Important!</w:t>
       </w:r>
     </w:p>
@@ -3810,7 +5325,21 @@
         <w:rPr>
           <w:color w:val="222222"/>
         </w:rPr>
-        <w:t xml:space="preserve"> agree otherwise or the court directs otherwise. If you leave out information, you must explain the reasons why in a sworn affidavit and file it with the court within 28 days after you serve the Answer.</w:t>
+        <w:t xml:space="preserve"> agree otherwise or the court directs otherwise. If you leave out information, you must explain the reasons why in </w:t>
+      </w:r>
+      <w:proofErr w:type="gramStart"/>
+      <w:r>
+        <w:rPr>
+          <w:color w:val="222222"/>
+        </w:rPr>
+        <w:t>a sworn affidavit</w:t>
+      </w:r>
+      <w:proofErr w:type="gramEnd"/>
+      <w:r>
+        <w:rPr>
+          <w:color w:val="222222"/>
+        </w:rPr>
+        <w:t xml:space="preserve"> and file it with the court within 28 days after you serve the Answer.</w:t>
       </w:r>
     </w:p>
     <w:p>
@@ -3918,7 +5447,21 @@
         <w:rPr>
           <w:color w:val="222222"/>
         </w:rPr>
-        <w:t>Do not delete any e-mails you send to the other party, especially e-mails that served court documents. You must keep a record of sent items until a judgment or final order is entered and all appeals have been completed.</w:t>
+        <w:t xml:space="preserve">Do not delete any e-mails you send to the other party, especially e-mails that served court documents. You must keep a record of </w:t>
+      </w:r>
+      <w:proofErr w:type="gramStart"/>
+      <w:r>
+        <w:rPr>
+          <w:color w:val="222222"/>
+        </w:rPr>
+        <w:t>sent items</w:t>
+      </w:r>
+      <w:proofErr w:type="gramEnd"/>
+      <w:r>
+        <w:rPr>
+          <w:color w:val="222222"/>
+        </w:rPr>
+        <w:t xml:space="preserve"> until a judgment or final order is entered and all appeals have been completed.</w:t>
       </w:r>
     </w:p>
     <w:p>
@@ -3947,129 +5490,291 @@
         <w:rPr>
           <w:color w:val="222222"/>
         </w:rPr>
-        <w:t xml:space="preserve"> after serving the form. If you served by e-mail, cross out “first-class mail” and write "e-mail." In the space for the other party's address, write the e-mail address instead.</w:t>
-      </w:r>
-      <w:r>
-        <w:rPr>
+        <w:t xml:space="preserve"> after serving the form. If you served by e-mail, cross out “first-class mail” and write "e-mail." In the space for the other party's address, write the e-mail address </w:t>
+      </w:r>
+      <w:proofErr w:type="gramStart"/>
+      <w:r>
+        <w:rPr>
+          <w:color w:val="222222"/>
+        </w:rPr>
+        <w:t>instead.</w:t>
+      </w:r>
+      <w:r>
+        <w:rPr>
+          <w:color w:val="222222"/>
+        </w:rPr>
+        <w:t>{</w:t>
+      </w:r>
+      <w:proofErr w:type="gramEnd"/>
+      <w:r>
+        <w:rPr>
+          <w:color w:val="222222"/>
+        </w:rPr>
+        <w:t xml:space="preserve">% </w:t>
+      </w:r>
+      <w:r>
+        <w:rPr>
+          <w:color w:val="222222"/>
+        </w:rPr>
+        <w:t xml:space="preserve">if </w:t>
+      </w:r>
+      <w:proofErr w:type="spellStart"/>
+      <w:r>
+        <w:rPr>
+          <w:color w:val="222222"/>
+        </w:rPr>
+        <w:t>county_choice</w:t>
+      </w:r>
+      <w:proofErr w:type="spellEnd"/>
+      <w:r>
+        <w:rPr>
+          <w:color w:val="222222"/>
+        </w:rPr>
+        <w:t xml:space="preserve"> == “Oakland” %}</w:t>
+      </w:r>
+      <w:r>
+        <w:rPr>
+          <w:color w:val="222222"/>
+        </w:rPr>
+        <w:t xml:space="preserve"> </w:t>
+      </w:r>
+      <w:r>
+        <w:rPr>
+          <w:color w:val="222222"/>
+        </w:rPr>
+        <w:t xml:space="preserve">File the Proof of Mailing in </w:t>
+      </w:r>
+      <w:proofErr w:type="spellStart"/>
+      <w:proofErr w:type="gramStart"/>
+      <w:r>
+        <w:rPr>
+          <w:color w:val="222222"/>
+        </w:rPr>
+        <w:t>MiFILE</w:t>
+      </w:r>
+      <w:proofErr w:type="spellEnd"/>
+      <w:r>
+        <w:rPr>
+          <w:color w:val="222222"/>
+        </w:rPr>
+        <w:t>.</w:t>
+      </w:r>
+      <w:r>
+        <w:rPr>
+          <w:color w:val="222222"/>
+        </w:rPr>
+        <w:t>{</w:t>
+      </w:r>
+      <w:proofErr w:type="gramEnd"/>
+      <w:r>
+        <w:rPr>
+          <w:color w:val="222222"/>
+        </w:rPr>
+        <w:t>% else %}</w:t>
+      </w:r>
+      <w:r>
+        <w:rPr>
+          <w:color w:val="222222"/>
+        </w:rPr>
+        <w:t xml:space="preserve"> </w:t>
+      </w:r>
+      <w:r>
+        <w:rPr>
+          <w:color w:val="222222"/>
+        </w:rPr>
+        <w:t xml:space="preserve">If you are filing in person at the court clerk's office, also file a copy of the Proof of Mailing for the Friend of the Court if your court requires FOC copies. Get a copy of the Proof of Mailing for your </w:t>
+      </w:r>
+      <w:proofErr w:type="gramStart"/>
+      <w:r>
+        <w:rPr>
+          <w:color w:val="222222"/>
+        </w:rPr>
+        <w:t>records.</w:t>
+      </w:r>
+      <w:r>
+        <w:rPr>
+          <w:color w:val="222222"/>
+        </w:rPr>
+        <w:t>{</w:t>
+      </w:r>
+      <w:proofErr w:type="gramEnd"/>
+      <w:r>
+        <w:rPr>
+          <w:color w:val="222222"/>
+        </w:rPr>
+        <w:t xml:space="preserve">% </w:t>
+      </w:r>
+      <w:proofErr w:type="gramStart"/>
+      <w:r>
+        <w:rPr>
+          <w:color w:val="222222"/>
+        </w:rPr>
+        <w:t>endif %}</w:t>
+      </w:r>
+      <w:proofErr w:type="gramEnd"/>
+    </w:p>
+    <w:p>
+      <w:pPr>
+        <w:pStyle w:val="Heading3"/>
+        <w:rPr>
+          <w:highlight w:val="white"/>
+        </w:rPr>
+      </w:pPr>
+      <w:r>
+        <w:rPr>
+          <w:highlight w:val="white"/>
+        </w:rPr>
+        <w:t>Next Steps</w:t>
+      </w:r>
+    </w:p>
+    <w:p>
+      <w:pPr>
+        <w:spacing w:before="180" w:after="180"/>
+        <w:rPr>
+          <w:color w:val="222222"/>
+        </w:rPr>
+      </w:pPr>
+      <w:r>
+        <w:rPr>
+          <w:b/>
+          <w:bCs/>
+          <w:color w:val="222222"/>
+        </w:rPr>
+        <w:t>IMPORTANT!</w:t>
+      </w:r>
+      <w:r>
+        <w:rPr>
+          <w:color w:val="222222"/>
+        </w:rPr>
+        <w:t xml:space="preserve"> There are more instructions. To see the rest</w:t>
+      </w:r>
+      <w:r>
+        <w:rPr>
+          <w:color w:val="222222"/>
+        </w:rPr>
+        <w:t>,</w:t>
+      </w:r>
+      <w:r>
+        <w:rPr>
+          <w:b/>
+          <w:bCs/>
+          <w:color w:val="222222"/>
+        </w:rPr>
+        <w:t xml:space="preserve"> </w:t>
+      </w:r>
+      <w:r>
+        <w:rPr>
+          <w:b/>
+          <w:bCs/>
+          <w:color w:val="222222"/>
+        </w:rPr>
+        <w:t xml:space="preserve">go to </w:t>
+      </w:r>
+      <w:r>
+        <w:rPr>
+          <w:b/>
+          <w:bCs/>
           <w:color w:val="222222"/>
         </w:rPr>
         <w:t xml:space="preserve">{% </w:t>
       </w:r>
       <w:r>
         <w:rPr>
-          <w:color w:val="222222"/>
-        </w:rPr>
-        <w:t>if county_choice == “Oakland” %}</w:t>
-      </w:r>
-      <w:r>
-        <w:rPr>
-          <w:color w:val="222222"/>
-        </w:rPr>
-        <w:t xml:space="preserve"> </w:t>
-      </w:r>
-      <w:r>
-        <w:rPr>
-          <w:color w:val="222222"/>
-        </w:rPr>
-        <w:t>File the Proof of Mailing in MiFILE.</w:t>
-      </w:r>
-      <w:r>
-        <w:rPr>
-          <w:color w:val="222222"/>
-        </w:rPr>
-        <w:t>{% else %}</w:t>
-      </w:r>
-      <w:r>
-        <w:rPr>
-          <w:color w:val="222222"/>
-        </w:rPr>
-        <w:t xml:space="preserve"> </w:t>
-      </w:r>
-      <w:r>
-        <w:rPr>
-          <w:color w:val="222222"/>
-        </w:rPr>
-        <w:t>If you are filing in person at the court clerk's office, also file a copy of the Proof of Mailing for the Friend of the Court if your court requires FOC copies. Get a copy of the Proof of Mailing for your records.</w:t>
-      </w:r>
-      <w:r>
-        <w:rPr>
-          <w:color w:val="222222"/>
-        </w:rPr>
-        <w:t>{% endif %}</w:t>
-      </w:r>
-    </w:p>
-    <w:p>
-      <w:pPr>
-        <w:pStyle w:val="Heading3"/>
-        <w:rPr>
-          <w:highlight w:val="white"/>
-        </w:rPr>
-      </w:pPr>
-      <w:r>
-        <w:rPr>
-          <w:highlight w:val="white"/>
-        </w:rPr>
-        <w:t>Next Steps</w:t>
-      </w:r>
-    </w:p>
-    <w:p>
-      <w:pPr>
-        <w:spacing w:before="180" w:after="180"/>
-        <w:rPr>
-          <w:color w:val="222222"/>
-        </w:rPr>
-      </w:pPr>
-      <w:r>
-        <w:rPr>
-          <w:b/>
-          <w:bCs/>
-          <w:color w:val="222222"/>
-        </w:rPr>
-        <w:t>IMPORTANT!</w:t>
-      </w:r>
-      <w:r>
-        <w:rPr>
-          <w:color w:val="222222"/>
-        </w:rPr>
-        <w:t xml:space="preserve"> There are more instructions. To see the rest</w:t>
-      </w:r>
-      <w:r>
-        <w:rPr>
-          <w:color w:val="222222"/>
-        </w:rPr>
-        <w:t>,</w:t>
-      </w:r>
-      <w:r>
-        <w:rPr>
-          <w:b/>
-          <w:bCs/>
-          <w:color w:val="222222"/>
-        </w:rPr>
-        <w:t xml:space="preserve"> </w:t>
-      </w:r>
-      <w:r>
-        <w:rPr>
-          <w:b/>
-          <w:bCs/>
-          <w:color w:val="222222"/>
-        </w:rPr>
-        <w:t xml:space="preserve">go to </w:t>
-      </w:r>
-      <w:r>
-        <w:rPr>
-          <w:b/>
-          <w:bCs/>
-          <w:color w:val="222222"/>
-        </w:rPr>
-        <w:t xml:space="preserve">{% </w:t>
-      </w:r>
-      <w:r>
-        <w:rPr>
-          <w:b/>
-          <w:bCs/>
-          <w:color w:val="222222"/>
-        </w:rPr>
-        <w:t>if (not create_counterclaim and there_are_marital_children) or (create_counterclaim and counterclaim_type == “with_children”)</w:t>
+          <w:b/>
+          <w:bCs/>
+          <w:color w:val="222222"/>
+        </w:rPr>
+        <w:t xml:space="preserve">if (not </w:t>
+      </w:r>
+      <w:proofErr w:type="spellStart"/>
+      <w:r>
+        <w:rPr>
+          <w:b/>
+          <w:bCs/>
+          <w:color w:val="222222"/>
+        </w:rPr>
+        <w:t>create_counterclaim</w:t>
+      </w:r>
+      <w:proofErr w:type="spellEnd"/>
+      <w:r>
+        <w:rPr>
+          <w:b/>
+          <w:bCs/>
+          <w:color w:val="222222"/>
+        </w:rPr>
+        <w:t xml:space="preserve"> and </w:t>
+      </w:r>
+      <w:proofErr w:type="spellStart"/>
+      <w:r>
+        <w:rPr>
+          <w:b/>
+          <w:bCs/>
+          <w:color w:val="222222"/>
+        </w:rPr>
+        <w:t>there_are_marital_children</w:t>
+      </w:r>
+      <w:proofErr w:type="spellEnd"/>
+      <w:r>
+        <w:rPr>
+          <w:b/>
+          <w:bCs/>
+          <w:color w:val="222222"/>
+        </w:rPr>
+        <w:t>) or (</w:t>
+      </w:r>
+      <w:proofErr w:type="spellStart"/>
+      <w:r>
+        <w:rPr>
+          <w:b/>
+          <w:bCs/>
+          <w:color w:val="222222"/>
+        </w:rPr>
+        <w:t>create_counterclaim</w:t>
+      </w:r>
+      <w:proofErr w:type="spellEnd"/>
+      <w:r>
+        <w:rPr>
+          <w:b/>
+          <w:bCs/>
+          <w:color w:val="222222"/>
+        </w:rPr>
+        <w:t xml:space="preserve"> and </w:t>
+      </w:r>
+      <w:proofErr w:type="spellStart"/>
+      <w:r>
+        <w:rPr>
+          <w:b/>
+          <w:bCs/>
+          <w:color w:val="222222"/>
+        </w:rPr>
+        <w:t>counterclaim_type</w:t>
+      </w:r>
+      <w:proofErr w:type="spellEnd"/>
+      <w:r>
+        <w:rPr>
+          <w:b/>
+          <w:bCs/>
+          <w:color w:val="222222"/>
+        </w:rPr>
+        <w:t xml:space="preserve"> == “</w:t>
+      </w:r>
+      <w:proofErr w:type="spellStart"/>
+      <w:r>
+        <w:rPr>
+          <w:b/>
+          <w:bCs/>
+          <w:color w:val="222222"/>
+        </w:rPr>
+        <w:t>with_children</w:t>
+      </w:r>
+      <w:proofErr w:type="spellEnd"/>
+      <w:r>
+        <w:rPr>
+          <w:b/>
+          <w:bCs/>
+          <w:color w:val="222222"/>
+        </w:rPr>
+        <w:t>”)</w:t>
       </w:r>
       <w:r>
         <w:rPr>

</xml_diff>